<commit_message>
feat(documentation): Addde sections idk where lol
</commit_message>
<xml_diff>
--- a/Documents/IMP - Dokumentace.docx
+++ b/Documents/IMP - Dokumentace.docx
@@ -10,6 +10,13 @@
           <w:bCs/>
         </w:rPr>
       </w:pPr>
+      <w:r>
+        <w:rPr>
+          <w:b/>
+          <w:bCs/>
+        </w:rPr>
+        <w:t xml:space="preserve"> </w:t>
+      </w:r>
       <w:r>
         <w:rPr>
           <w:b/>
@@ -1224,7 +1231,6 @@
             </w:tabs>
             <w:rPr>
               <w:rFonts w:asciiTheme="minorHAnsi" w:eastAsiaTheme="minorEastAsia" w:hAnsiTheme="minorHAnsi"/>
-              <w:noProof/>
               <w:lang w:eastAsia="cs-CZ"/>
             </w:rPr>
           </w:pPr>
@@ -1241,14 +1247,12 @@
             <w:r>
               <w:rPr>
                 <w:rStyle w:val="Hypertextovodkaz"/>
-                <w:noProof/>
               </w:rPr>
               <w:t>1.</w:t>
             </w:r>
             <w:r>
               <w:rPr>
                 <w:rFonts w:asciiTheme="minorHAnsi" w:eastAsiaTheme="minorEastAsia" w:hAnsiTheme="minorHAnsi"/>
-                <w:noProof/>
                 <w:lang w:eastAsia="cs-CZ"/>
               </w:rPr>
               <w:tab/>
@@ -1256,54 +1260,46 @@
             <w:r>
               <w:rPr>
                 <w:rStyle w:val="Hypertextovodkaz"/>
-                <w:noProof/>
               </w:rPr>
               <w:t>Inspirace</w:t>
             </w:r>
             <w:r>
               <w:rPr>
-                <w:noProof/>
                 <w:webHidden/>
               </w:rPr>
               <w:tab/>
             </w:r>
             <w:r>
               <w:rPr>
-                <w:noProof/>
                 <w:webHidden/>
               </w:rPr>
               <w:fldChar w:fldCharType="begin"/>
             </w:r>
             <w:r>
               <w:rPr>
-                <w:noProof/>
                 <w:webHidden/>
               </w:rPr>
               <w:instrText xml:space="preserve"> PAGEREF _Toc216029505 \h </w:instrText>
             </w:r>
             <w:r>
               <w:rPr>
-                <w:noProof/>
-                <w:webHidden/>
-              </w:rPr>
-            </w:r>
-            <w:r>
-              <w:rPr>
-                <w:noProof/>
+                <w:webHidden/>
+              </w:rPr>
+            </w:r>
+            <w:r>
+              <w:rPr>
                 <w:webHidden/>
               </w:rPr>
               <w:fldChar w:fldCharType="separate"/>
             </w:r>
             <w:r>
               <w:rPr>
-                <w:noProof/>
                 <w:webHidden/>
               </w:rPr>
               <w:t>9</w:t>
             </w:r>
             <w:r>
               <w:rPr>
-                <w:noProof/>
                 <w:webHidden/>
               </w:rPr>
               <w:fldChar w:fldCharType="end"/>
@@ -1319,7 +1315,6 @@
             </w:tabs>
             <w:rPr>
               <w:rFonts w:asciiTheme="minorHAnsi" w:eastAsiaTheme="minorEastAsia" w:hAnsiTheme="minorHAnsi"/>
-              <w:noProof/>
               <w:lang w:eastAsia="cs-CZ"/>
             </w:rPr>
           </w:pPr>
@@ -1327,14 +1322,12 @@
             <w:r>
               <w:rPr>
                 <w:rStyle w:val="Hypertextovodkaz"/>
-                <w:noProof/>
               </w:rPr>
               <w:t>2.</w:t>
             </w:r>
             <w:r>
               <w:rPr>
                 <w:rFonts w:asciiTheme="minorHAnsi" w:eastAsiaTheme="minorEastAsia" w:hAnsiTheme="minorHAnsi"/>
-                <w:noProof/>
                 <w:lang w:eastAsia="cs-CZ"/>
               </w:rPr>
               <w:tab/>
@@ -1342,54 +1335,46 @@
             <w:r>
               <w:rPr>
                 <w:rStyle w:val="Hypertextovodkaz"/>
-                <w:noProof/>
               </w:rPr>
               <w:t>Dopravní předpisy</w:t>
             </w:r>
             <w:r>
               <w:rPr>
-                <w:noProof/>
                 <w:webHidden/>
               </w:rPr>
               <w:tab/>
             </w:r>
             <w:r>
               <w:rPr>
-                <w:noProof/>
                 <w:webHidden/>
               </w:rPr>
               <w:fldChar w:fldCharType="begin"/>
             </w:r>
             <w:r>
               <w:rPr>
-                <w:noProof/>
                 <w:webHidden/>
               </w:rPr>
               <w:instrText xml:space="preserve"> PAGEREF _Toc216029506 \h </w:instrText>
             </w:r>
             <w:r>
               <w:rPr>
-                <w:noProof/>
-                <w:webHidden/>
-              </w:rPr>
-            </w:r>
-            <w:r>
-              <w:rPr>
-                <w:noProof/>
+                <w:webHidden/>
+              </w:rPr>
+            </w:r>
+            <w:r>
+              <w:rPr>
                 <w:webHidden/>
               </w:rPr>
               <w:fldChar w:fldCharType="separate"/>
             </w:r>
             <w:r>
               <w:rPr>
-                <w:noProof/>
                 <w:webHidden/>
               </w:rPr>
               <w:t>10</w:t>
             </w:r>
             <w:r>
               <w:rPr>
-                <w:noProof/>
                 <w:webHidden/>
               </w:rPr>
               <w:fldChar w:fldCharType="end"/>
@@ -1405,7 +1390,6 @@
             </w:tabs>
             <w:rPr>
               <w:rFonts w:asciiTheme="minorHAnsi" w:eastAsiaTheme="minorEastAsia" w:hAnsiTheme="minorHAnsi"/>
-              <w:noProof/>
               <w:lang w:eastAsia="cs-CZ"/>
             </w:rPr>
           </w:pPr>
@@ -1413,14 +1397,12 @@
             <w:r>
               <w:rPr>
                 <w:rStyle w:val="Hypertextovodkaz"/>
-                <w:noProof/>
               </w:rPr>
               <w:t>3.</w:t>
             </w:r>
             <w:r>
               <w:rPr>
                 <w:rFonts w:asciiTheme="minorHAnsi" w:eastAsiaTheme="minorEastAsia" w:hAnsiTheme="minorHAnsi"/>
-                <w:noProof/>
                 <w:lang w:eastAsia="cs-CZ"/>
               </w:rPr>
               <w:tab/>
@@ -1428,54 +1410,46 @@
             <w:r>
               <w:rPr>
                 <w:rStyle w:val="Hypertextovodkaz"/>
-                <w:noProof/>
               </w:rPr>
               <w:t>Použité technologie</w:t>
             </w:r>
             <w:r>
               <w:rPr>
-                <w:noProof/>
                 <w:webHidden/>
               </w:rPr>
               <w:tab/>
             </w:r>
             <w:r>
               <w:rPr>
-                <w:noProof/>
                 <w:webHidden/>
               </w:rPr>
               <w:fldChar w:fldCharType="begin"/>
             </w:r>
             <w:r>
               <w:rPr>
-                <w:noProof/>
                 <w:webHidden/>
               </w:rPr>
               <w:instrText xml:space="preserve"> PAGEREF _Toc216029507 \h </w:instrText>
             </w:r>
             <w:r>
               <w:rPr>
-                <w:noProof/>
-                <w:webHidden/>
-              </w:rPr>
-            </w:r>
-            <w:r>
-              <w:rPr>
-                <w:noProof/>
+                <w:webHidden/>
+              </w:rPr>
+            </w:r>
+            <w:r>
+              <w:rPr>
                 <w:webHidden/>
               </w:rPr>
               <w:fldChar w:fldCharType="separate"/>
             </w:r>
             <w:r>
               <w:rPr>
-                <w:noProof/>
                 <w:webHidden/>
               </w:rPr>
               <w:t>10</w:t>
             </w:r>
             <w:r>
               <w:rPr>
-                <w:noProof/>
                 <w:webHidden/>
               </w:rPr>
               <w:fldChar w:fldCharType="end"/>
@@ -1491,7 +1465,6 @@
             </w:tabs>
             <w:rPr>
               <w:rFonts w:asciiTheme="minorHAnsi" w:eastAsiaTheme="minorEastAsia" w:hAnsiTheme="minorHAnsi"/>
-              <w:noProof/>
               <w:lang w:eastAsia="cs-CZ"/>
             </w:rPr>
           </w:pPr>
@@ -1499,14 +1472,12 @@
             <w:r>
               <w:rPr>
                 <w:rStyle w:val="Hypertextovodkaz"/>
-                <w:noProof/>
               </w:rPr>
               <w:t>3.1</w:t>
             </w:r>
             <w:r>
               <w:rPr>
                 <w:rFonts w:asciiTheme="minorHAnsi" w:eastAsiaTheme="minorEastAsia" w:hAnsiTheme="minorHAnsi"/>
-                <w:noProof/>
                 <w:lang w:eastAsia="cs-CZ"/>
               </w:rPr>
               <w:tab/>
@@ -1514,54 +1485,46 @@
             <w:r>
               <w:rPr>
                 <w:rStyle w:val="Hypertextovodkaz"/>
-                <w:noProof/>
               </w:rPr>
               <w:t>Unity</w:t>
             </w:r>
             <w:r>
               <w:rPr>
-                <w:noProof/>
                 <w:webHidden/>
               </w:rPr>
               <w:tab/>
             </w:r>
             <w:r>
               <w:rPr>
-                <w:noProof/>
                 <w:webHidden/>
               </w:rPr>
               <w:fldChar w:fldCharType="begin"/>
             </w:r>
             <w:r>
               <w:rPr>
-                <w:noProof/>
                 <w:webHidden/>
               </w:rPr>
               <w:instrText xml:space="preserve"> PAGEREF _Toc216029508 \h </w:instrText>
             </w:r>
             <w:r>
               <w:rPr>
-                <w:noProof/>
-                <w:webHidden/>
-              </w:rPr>
-            </w:r>
-            <w:r>
-              <w:rPr>
-                <w:noProof/>
+                <w:webHidden/>
+              </w:rPr>
+            </w:r>
+            <w:r>
+              <w:rPr>
                 <w:webHidden/>
               </w:rPr>
               <w:fldChar w:fldCharType="separate"/>
             </w:r>
             <w:r>
               <w:rPr>
-                <w:noProof/>
                 <w:webHidden/>
               </w:rPr>
               <w:t>10</w:t>
             </w:r>
             <w:r>
               <w:rPr>
-                <w:noProof/>
                 <w:webHidden/>
               </w:rPr>
               <w:fldChar w:fldCharType="end"/>
@@ -1577,7 +1540,6 @@
             </w:tabs>
             <w:rPr>
               <w:rFonts w:asciiTheme="minorHAnsi" w:eastAsiaTheme="minorEastAsia" w:hAnsiTheme="minorHAnsi"/>
-              <w:noProof/>
               <w:lang w:eastAsia="cs-CZ"/>
             </w:rPr>
           </w:pPr>
@@ -1585,14 +1547,12 @@
             <w:r>
               <w:rPr>
                 <w:rStyle w:val="Hypertextovodkaz"/>
-                <w:noProof/>
               </w:rPr>
               <w:t>3.2</w:t>
             </w:r>
             <w:r>
               <w:rPr>
                 <w:rFonts w:asciiTheme="minorHAnsi" w:eastAsiaTheme="minorEastAsia" w:hAnsiTheme="minorHAnsi"/>
-                <w:noProof/>
                 <w:lang w:eastAsia="cs-CZ"/>
               </w:rPr>
               <w:tab/>
@@ -1600,54 +1560,46 @@
             <w:r>
               <w:rPr>
                 <w:rStyle w:val="Hypertextovodkaz"/>
-                <w:noProof/>
               </w:rPr>
               <w:t>C#</w:t>
             </w:r>
             <w:r>
               <w:rPr>
-                <w:noProof/>
                 <w:webHidden/>
               </w:rPr>
               <w:tab/>
             </w:r>
             <w:r>
               <w:rPr>
-                <w:noProof/>
                 <w:webHidden/>
               </w:rPr>
               <w:fldChar w:fldCharType="begin"/>
             </w:r>
             <w:r>
               <w:rPr>
-                <w:noProof/>
                 <w:webHidden/>
               </w:rPr>
               <w:instrText xml:space="preserve"> PAGEREF _Toc216029509 \h </w:instrText>
             </w:r>
             <w:r>
               <w:rPr>
-                <w:noProof/>
-                <w:webHidden/>
-              </w:rPr>
-            </w:r>
-            <w:r>
-              <w:rPr>
-                <w:noProof/>
+                <w:webHidden/>
+              </w:rPr>
+            </w:r>
+            <w:r>
+              <w:rPr>
                 <w:webHidden/>
               </w:rPr>
               <w:fldChar w:fldCharType="separate"/>
             </w:r>
             <w:r>
               <w:rPr>
-                <w:noProof/>
                 <w:webHidden/>
               </w:rPr>
               <w:t>10</w:t>
             </w:r>
             <w:r>
               <w:rPr>
-                <w:noProof/>
                 <w:webHidden/>
               </w:rPr>
               <w:fldChar w:fldCharType="end"/>
@@ -1663,7 +1615,6 @@
             </w:tabs>
             <w:rPr>
               <w:rFonts w:asciiTheme="minorHAnsi" w:eastAsiaTheme="minorEastAsia" w:hAnsiTheme="minorHAnsi"/>
-              <w:noProof/>
               <w:lang w:eastAsia="cs-CZ"/>
             </w:rPr>
           </w:pPr>
@@ -1671,14 +1622,12 @@
             <w:r>
               <w:rPr>
                 <w:rStyle w:val="Hypertextovodkaz"/>
-                <w:noProof/>
               </w:rPr>
               <w:t>3.3</w:t>
             </w:r>
             <w:r>
               <w:rPr>
                 <w:rFonts w:asciiTheme="minorHAnsi" w:eastAsiaTheme="minorEastAsia" w:hAnsiTheme="minorHAnsi"/>
-                <w:noProof/>
                 <w:lang w:eastAsia="cs-CZ"/>
               </w:rPr>
               <w:tab/>
@@ -1686,54 +1635,46 @@
             <w:r>
               <w:rPr>
                 <w:rStyle w:val="Hypertextovodkaz"/>
-                <w:noProof/>
               </w:rPr>
               <w:t>Blender</w:t>
             </w:r>
             <w:r>
               <w:rPr>
-                <w:noProof/>
                 <w:webHidden/>
               </w:rPr>
               <w:tab/>
             </w:r>
             <w:r>
               <w:rPr>
-                <w:noProof/>
                 <w:webHidden/>
               </w:rPr>
               <w:fldChar w:fldCharType="begin"/>
             </w:r>
             <w:r>
               <w:rPr>
-                <w:noProof/>
                 <w:webHidden/>
               </w:rPr>
               <w:instrText xml:space="preserve"> PAGEREF _Toc216029510 \h </w:instrText>
             </w:r>
             <w:r>
               <w:rPr>
-                <w:noProof/>
-                <w:webHidden/>
-              </w:rPr>
-            </w:r>
-            <w:r>
-              <w:rPr>
-                <w:noProof/>
+                <w:webHidden/>
+              </w:rPr>
+            </w:r>
+            <w:r>
+              <w:rPr>
                 <w:webHidden/>
               </w:rPr>
               <w:fldChar w:fldCharType="separate"/>
             </w:r>
             <w:r>
               <w:rPr>
-                <w:noProof/>
                 <w:webHidden/>
               </w:rPr>
               <w:t>10</w:t>
             </w:r>
             <w:r>
               <w:rPr>
-                <w:noProof/>
                 <w:webHidden/>
               </w:rPr>
               <w:fldChar w:fldCharType="end"/>
@@ -1749,7 +1690,6 @@
             </w:tabs>
             <w:rPr>
               <w:rFonts w:asciiTheme="minorHAnsi" w:eastAsiaTheme="minorEastAsia" w:hAnsiTheme="minorHAnsi"/>
-              <w:noProof/>
               <w:lang w:eastAsia="cs-CZ"/>
             </w:rPr>
           </w:pPr>
@@ -1757,14 +1697,12 @@
             <w:r>
               <w:rPr>
                 <w:rStyle w:val="Hypertextovodkaz"/>
-                <w:noProof/>
               </w:rPr>
               <w:t>4.</w:t>
             </w:r>
             <w:r>
               <w:rPr>
                 <w:rFonts w:asciiTheme="minorHAnsi" w:eastAsiaTheme="minorEastAsia" w:hAnsiTheme="minorHAnsi"/>
-                <w:noProof/>
                 <w:lang w:eastAsia="cs-CZ"/>
               </w:rPr>
               <w:tab/>
@@ -1772,54 +1710,46 @@
             <w:r>
               <w:rPr>
                 <w:rStyle w:val="Hypertextovodkaz"/>
-                <w:noProof/>
               </w:rPr>
               <w:t>Herní úrovně</w:t>
             </w:r>
             <w:r>
               <w:rPr>
-                <w:noProof/>
                 <w:webHidden/>
               </w:rPr>
               <w:tab/>
             </w:r>
             <w:r>
               <w:rPr>
-                <w:noProof/>
                 <w:webHidden/>
               </w:rPr>
               <w:fldChar w:fldCharType="begin"/>
             </w:r>
             <w:r>
               <w:rPr>
-                <w:noProof/>
                 <w:webHidden/>
               </w:rPr>
               <w:instrText xml:space="preserve"> PAGEREF _Toc216029511 \h </w:instrText>
             </w:r>
             <w:r>
               <w:rPr>
-                <w:noProof/>
-                <w:webHidden/>
-              </w:rPr>
-            </w:r>
-            <w:r>
-              <w:rPr>
-                <w:noProof/>
+                <w:webHidden/>
+              </w:rPr>
+            </w:r>
+            <w:r>
+              <w:rPr>
                 <w:webHidden/>
               </w:rPr>
               <w:fldChar w:fldCharType="separate"/>
             </w:r>
             <w:r>
               <w:rPr>
-                <w:noProof/>
                 <w:webHidden/>
               </w:rPr>
               <w:t>10</w:t>
             </w:r>
             <w:r>
               <w:rPr>
-                <w:noProof/>
                 <w:webHidden/>
               </w:rPr>
               <w:fldChar w:fldCharType="end"/>
@@ -1835,7 +1765,6 @@
             </w:tabs>
             <w:rPr>
               <w:rFonts w:asciiTheme="minorHAnsi" w:eastAsiaTheme="minorEastAsia" w:hAnsiTheme="minorHAnsi"/>
-              <w:noProof/>
               <w:lang w:eastAsia="cs-CZ"/>
             </w:rPr>
           </w:pPr>
@@ -1843,14 +1772,12 @@
             <w:r>
               <w:rPr>
                 <w:rStyle w:val="Hypertextovodkaz"/>
-                <w:noProof/>
               </w:rPr>
               <w:t>4.1</w:t>
             </w:r>
             <w:r>
               <w:rPr>
                 <w:rFonts w:asciiTheme="minorHAnsi" w:eastAsiaTheme="minorEastAsia" w:hAnsiTheme="minorHAnsi"/>
-                <w:noProof/>
                 <w:lang w:eastAsia="cs-CZ"/>
               </w:rPr>
               <w:tab/>
@@ -1858,54 +1785,46 @@
             <w:r>
               <w:rPr>
                 <w:rStyle w:val="Hypertextovodkaz"/>
-                <w:noProof/>
               </w:rPr>
               <w:t>Úroveň 1</w:t>
             </w:r>
             <w:r>
               <w:rPr>
-                <w:noProof/>
                 <w:webHidden/>
               </w:rPr>
               <w:tab/>
             </w:r>
             <w:r>
               <w:rPr>
-                <w:noProof/>
                 <w:webHidden/>
               </w:rPr>
               <w:fldChar w:fldCharType="begin"/>
             </w:r>
             <w:r>
               <w:rPr>
-                <w:noProof/>
                 <w:webHidden/>
               </w:rPr>
               <w:instrText xml:space="preserve"> PAGEREF _Toc216029512 \h </w:instrText>
             </w:r>
             <w:r>
               <w:rPr>
-                <w:noProof/>
-                <w:webHidden/>
-              </w:rPr>
-            </w:r>
-            <w:r>
-              <w:rPr>
-                <w:noProof/>
+                <w:webHidden/>
+              </w:rPr>
+            </w:r>
+            <w:r>
+              <w:rPr>
                 <w:webHidden/>
               </w:rPr>
               <w:fldChar w:fldCharType="separate"/>
             </w:r>
             <w:r>
               <w:rPr>
-                <w:noProof/>
                 <w:webHidden/>
               </w:rPr>
               <w:t>11</w:t>
             </w:r>
             <w:r>
               <w:rPr>
-                <w:noProof/>
                 <w:webHidden/>
               </w:rPr>
               <w:fldChar w:fldCharType="end"/>
@@ -1921,7 +1840,6 @@
             </w:tabs>
             <w:rPr>
               <w:rFonts w:asciiTheme="minorHAnsi" w:eastAsiaTheme="minorEastAsia" w:hAnsiTheme="minorHAnsi"/>
-              <w:noProof/>
               <w:lang w:eastAsia="cs-CZ"/>
             </w:rPr>
           </w:pPr>
@@ -1929,14 +1847,12 @@
             <w:r>
               <w:rPr>
                 <w:rStyle w:val="Hypertextovodkaz"/>
-                <w:noProof/>
               </w:rPr>
               <w:t>4.2</w:t>
             </w:r>
             <w:r>
               <w:rPr>
                 <w:rFonts w:asciiTheme="minorHAnsi" w:eastAsiaTheme="minorEastAsia" w:hAnsiTheme="minorHAnsi"/>
-                <w:noProof/>
                 <w:lang w:eastAsia="cs-CZ"/>
               </w:rPr>
               <w:tab/>
@@ -1944,54 +1860,46 @@
             <w:r>
               <w:rPr>
                 <w:rStyle w:val="Hypertextovodkaz"/>
-                <w:noProof/>
               </w:rPr>
               <w:t>Úroveň 2</w:t>
             </w:r>
             <w:r>
               <w:rPr>
-                <w:noProof/>
                 <w:webHidden/>
               </w:rPr>
               <w:tab/>
             </w:r>
             <w:r>
               <w:rPr>
-                <w:noProof/>
                 <w:webHidden/>
               </w:rPr>
               <w:fldChar w:fldCharType="begin"/>
             </w:r>
             <w:r>
               <w:rPr>
-                <w:noProof/>
                 <w:webHidden/>
               </w:rPr>
               <w:instrText xml:space="preserve"> PAGEREF _Toc216029513 \h </w:instrText>
             </w:r>
             <w:r>
               <w:rPr>
-                <w:noProof/>
-                <w:webHidden/>
-              </w:rPr>
-            </w:r>
-            <w:r>
-              <w:rPr>
-                <w:noProof/>
+                <w:webHidden/>
+              </w:rPr>
+            </w:r>
+            <w:r>
+              <w:rPr>
                 <w:webHidden/>
               </w:rPr>
               <w:fldChar w:fldCharType="separate"/>
             </w:r>
             <w:r>
               <w:rPr>
-                <w:noProof/>
                 <w:webHidden/>
               </w:rPr>
               <w:t>11</w:t>
             </w:r>
             <w:r>
               <w:rPr>
-                <w:noProof/>
                 <w:webHidden/>
               </w:rPr>
               <w:fldChar w:fldCharType="end"/>
@@ -2007,7 +1915,6 @@
             </w:tabs>
             <w:rPr>
               <w:rFonts w:asciiTheme="minorHAnsi" w:eastAsiaTheme="minorEastAsia" w:hAnsiTheme="minorHAnsi"/>
-              <w:noProof/>
               <w:lang w:eastAsia="cs-CZ"/>
             </w:rPr>
           </w:pPr>
@@ -2015,14 +1922,12 @@
             <w:r>
               <w:rPr>
                 <w:rStyle w:val="Hypertextovodkaz"/>
-                <w:noProof/>
               </w:rPr>
               <w:t>4.3</w:t>
             </w:r>
             <w:r>
               <w:rPr>
                 <w:rFonts w:asciiTheme="minorHAnsi" w:eastAsiaTheme="minorEastAsia" w:hAnsiTheme="minorHAnsi"/>
-                <w:noProof/>
                 <w:lang w:eastAsia="cs-CZ"/>
               </w:rPr>
               <w:tab/>
@@ -2030,54 +1935,46 @@
             <w:r>
               <w:rPr>
                 <w:rStyle w:val="Hypertextovodkaz"/>
-                <w:noProof/>
               </w:rPr>
               <w:t>Úroveň 3</w:t>
             </w:r>
             <w:r>
               <w:rPr>
-                <w:noProof/>
                 <w:webHidden/>
               </w:rPr>
               <w:tab/>
             </w:r>
             <w:r>
               <w:rPr>
-                <w:noProof/>
                 <w:webHidden/>
               </w:rPr>
               <w:fldChar w:fldCharType="begin"/>
             </w:r>
             <w:r>
               <w:rPr>
-                <w:noProof/>
                 <w:webHidden/>
               </w:rPr>
               <w:instrText xml:space="preserve"> PAGEREF _Toc216029514 \h </w:instrText>
             </w:r>
             <w:r>
               <w:rPr>
-                <w:noProof/>
-                <w:webHidden/>
-              </w:rPr>
-            </w:r>
-            <w:r>
-              <w:rPr>
-                <w:noProof/>
+                <w:webHidden/>
+              </w:rPr>
+            </w:r>
+            <w:r>
+              <w:rPr>
                 <w:webHidden/>
               </w:rPr>
               <w:fldChar w:fldCharType="separate"/>
             </w:r>
             <w:r>
               <w:rPr>
-                <w:noProof/>
                 <w:webHidden/>
               </w:rPr>
               <w:t>11</w:t>
             </w:r>
             <w:r>
               <w:rPr>
-                <w:noProof/>
                 <w:webHidden/>
               </w:rPr>
               <w:fldChar w:fldCharType="end"/>
@@ -2093,7 +1990,6 @@
             </w:tabs>
             <w:rPr>
               <w:rFonts w:asciiTheme="minorHAnsi" w:eastAsiaTheme="minorEastAsia" w:hAnsiTheme="minorHAnsi"/>
-              <w:noProof/>
               <w:lang w:eastAsia="cs-CZ"/>
             </w:rPr>
           </w:pPr>
@@ -2101,14 +1997,12 @@
             <w:r>
               <w:rPr>
                 <w:rStyle w:val="Hypertextovodkaz"/>
-                <w:noProof/>
               </w:rPr>
               <w:t>4.4</w:t>
             </w:r>
             <w:r>
               <w:rPr>
                 <w:rFonts w:asciiTheme="minorHAnsi" w:eastAsiaTheme="minorEastAsia" w:hAnsiTheme="minorHAnsi"/>
-                <w:noProof/>
                 <w:lang w:eastAsia="cs-CZ"/>
               </w:rPr>
               <w:tab/>
@@ -2116,54 +2010,46 @@
             <w:r>
               <w:rPr>
                 <w:rStyle w:val="Hypertextovodkaz"/>
-                <w:noProof/>
               </w:rPr>
               <w:t>Úroveň 4</w:t>
             </w:r>
             <w:r>
               <w:rPr>
-                <w:noProof/>
                 <w:webHidden/>
               </w:rPr>
               <w:tab/>
             </w:r>
             <w:r>
               <w:rPr>
-                <w:noProof/>
                 <w:webHidden/>
               </w:rPr>
               <w:fldChar w:fldCharType="begin"/>
             </w:r>
             <w:r>
               <w:rPr>
-                <w:noProof/>
                 <w:webHidden/>
               </w:rPr>
               <w:instrText xml:space="preserve"> PAGEREF _Toc216029515 \h </w:instrText>
             </w:r>
             <w:r>
               <w:rPr>
-                <w:noProof/>
-                <w:webHidden/>
-              </w:rPr>
-            </w:r>
-            <w:r>
-              <w:rPr>
-                <w:noProof/>
+                <w:webHidden/>
+              </w:rPr>
+            </w:r>
+            <w:r>
+              <w:rPr>
                 <w:webHidden/>
               </w:rPr>
               <w:fldChar w:fldCharType="separate"/>
             </w:r>
             <w:r>
               <w:rPr>
-                <w:noProof/>
                 <w:webHidden/>
               </w:rPr>
               <w:t>11</w:t>
             </w:r>
             <w:r>
               <w:rPr>
-                <w:noProof/>
                 <w:webHidden/>
               </w:rPr>
               <w:fldChar w:fldCharType="end"/>
@@ -2179,7 +2065,6 @@
             </w:tabs>
             <w:rPr>
               <w:rFonts w:asciiTheme="minorHAnsi" w:eastAsiaTheme="minorEastAsia" w:hAnsiTheme="minorHAnsi"/>
-              <w:noProof/>
               <w:lang w:eastAsia="cs-CZ"/>
             </w:rPr>
           </w:pPr>
@@ -2187,14 +2072,12 @@
             <w:r>
               <w:rPr>
                 <w:rStyle w:val="Hypertextovodkaz"/>
-                <w:noProof/>
               </w:rPr>
               <w:t>4.5</w:t>
             </w:r>
             <w:r>
               <w:rPr>
                 <w:rFonts w:asciiTheme="minorHAnsi" w:eastAsiaTheme="minorEastAsia" w:hAnsiTheme="minorHAnsi"/>
-                <w:noProof/>
                 <w:lang w:eastAsia="cs-CZ"/>
               </w:rPr>
               <w:tab/>
@@ -2202,54 +2085,46 @@
             <w:r>
               <w:rPr>
                 <w:rStyle w:val="Hypertextovodkaz"/>
-                <w:noProof/>
               </w:rPr>
               <w:t>Úroveň 5</w:t>
             </w:r>
             <w:r>
               <w:rPr>
-                <w:noProof/>
                 <w:webHidden/>
               </w:rPr>
               <w:tab/>
             </w:r>
             <w:r>
               <w:rPr>
-                <w:noProof/>
                 <w:webHidden/>
               </w:rPr>
               <w:fldChar w:fldCharType="begin"/>
             </w:r>
             <w:r>
               <w:rPr>
-                <w:noProof/>
                 <w:webHidden/>
               </w:rPr>
               <w:instrText xml:space="preserve"> PAGEREF _Toc216029516 \h </w:instrText>
             </w:r>
             <w:r>
               <w:rPr>
-                <w:noProof/>
-                <w:webHidden/>
-              </w:rPr>
-            </w:r>
-            <w:r>
-              <w:rPr>
-                <w:noProof/>
+                <w:webHidden/>
+              </w:rPr>
+            </w:r>
+            <w:r>
+              <w:rPr>
                 <w:webHidden/>
               </w:rPr>
               <w:fldChar w:fldCharType="separate"/>
             </w:r>
             <w:r>
               <w:rPr>
-                <w:noProof/>
                 <w:webHidden/>
               </w:rPr>
               <w:t>11</w:t>
             </w:r>
             <w:r>
               <w:rPr>
-                <w:noProof/>
                 <w:webHidden/>
               </w:rPr>
               <w:fldChar w:fldCharType="end"/>
@@ -2265,7 +2140,6 @@
             </w:tabs>
             <w:rPr>
               <w:rFonts w:asciiTheme="minorHAnsi" w:eastAsiaTheme="minorEastAsia" w:hAnsiTheme="minorHAnsi"/>
-              <w:noProof/>
               <w:lang w:eastAsia="cs-CZ"/>
             </w:rPr>
           </w:pPr>
@@ -2273,14 +2147,12 @@
             <w:r>
               <w:rPr>
                 <w:rStyle w:val="Hypertextovodkaz"/>
-                <w:noProof/>
               </w:rPr>
               <w:t>5.</w:t>
             </w:r>
             <w:r>
               <w:rPr>
                 <w:rFonts w:asciiTheme="minorHAnsi" w:eastAsiaTheme="minorEastAsia" w:hAnsiTheme="minorHAnsi"/>
-                <w:noProof/>
                 <w:lang w:eastAsia="cs-CZ"/>
               </w:rPr>
               <w:tab/>
@@ -2288,54 +2160,46 @@
             <w:r>
               <w:rPr>
                 <w:rStyle w:val="Hypertextovodkaz"/>
-                <w:noProof/>
               </w:rPr>
               <w:t>Tvorba postavy</w:t>
             </w:r>
             <w:r>
               <w:rPr>
-                <w:noProof/>
                 <w:webHidden/>
               </w:rPr>
               <w:tab/>
             </w:r>
             <w:r>
               <w:rPr>
-                <w:noProof/>
                 <w:webHidden/>
               </w:rPr>
               <w:fldChar w:fldCharType="begin"/>
             </w:r>
             <w:r>
               <w:rPr>
-                <w:noProof/>
                 <w:webHidden/>
               </w:rPr>
               <w:instrText xml:space="preserve"> PAGEREF _Toc216029517 \h </w:instrText>
             </w:r>
             <w:r>
               <w:rPr>
-                <w:noProof/>
-                <w:webHidden/>
-              </w:rPr>
-            </w:r>
-            <w:r>
-              <w:rPr>
-                <w:noProof/>
+                <w:webHidden/>
+              </w:rPr>
+            </w:r>
+            <w:r>
+              <w:rPr>
                 <w:webHidden/>
               </w:rPr>
               <w:fldChar w:fldCharType="separate"/>
             </w:r>
             <w:r>
               <w:rPr>
-                <w:noProof/>
                 <w:webHidden/>
               </w:rPr>
               <w:t>12</w:t>
             </w:r>
             <w:r>
               <w:rPr>
-                <w:noProof/>
                 <w:webHidden/>
               </w:rPr>
               <w:fldChar w:fldCharType="end"/>
@@ -2351,7 +2215,6 @@
             </w:tabs>
             <w:rPr>
               <w:rFonts w:asciiTheme="minorHAnsi" w:eastAsiaTheme="minorEastAsia" w:hAnsiTheme="minorHAnsi"/>
-              <w:noProof/>
               <w:lang w:eastAsia="cs-CZ"/>
             </w:rPr>
           </w:pPr>
@@ -2359,14 +2222,12 @@
             <w:r>
               <w:rPr>
                 <w:rStyle w:val="Hypertextovodkaz"/>
-                <w:noProof/>
               </w:rPr>
               <w:t>5.1</w:t>
             </w:r>
             <w:r>
               <w:rPr>
                 <w:rFonts w:asciiTheme="minorHAnsi" w:eastAsiaTheme="minorEastAsia" w:hAnsiTheme="minorHAnsi"/>
-                <w:noProof/>
                 <w:lang w:eastAsia="cs-CZ"/>
               </w:rPr>
               <w:tab/>
@@ -2374,54 +2235,46 @@
             <w:r>
               <w:rPr>
                 <w:rStyle w:val="Hypertextovodkaz"/>
-                <w:noProof/>
               </w:rPr>
               <w:t>Pohyb</w:t>
             </w:r>
             <w:r>
               <w:rPr>
-                <w:noProof/>
                 <w:webHidden/>
               </w:rPr>
               <w:tab/>
             </w:r>
             <w:r>
               <w:rPr>
-                <w:noProof/>
                 <w:webHidden/>
               </w:rPr>
               <w:fldChar w:fldCharType="begin"/>
             </w:r>
             <w:r>
               <w:rPr>
-                <w:noProof/>
                 <w:webHidden/>
               </w:rPr>
               <w:instrText xml:space="preserve"> PAGEREF _Toc216029518 \h </w:instrText>
             </w:r>
             <w:r>
               <w:rPr>
-                <w:noProof/>
-                <w:webHidden/>
-              </w:rPr>
-            </w:r>
-            <w:r>
-              <w:rPr>
-                <w:noProof/>
+                <w:webHidden/>
+              </w:rPr>
+            </w:r>
+            <w:r>
+              <w:rPr>
                 <w:webHidden/>
               </w:rPr>
               <w:fldChar w:fldCharType="separate"/>
             </w:r>
             <w:r>
               <w:rPr>
-                <w:noProof/>
                 <w:webHidden/>
               </w:rPr>
               <w:t>12</w:t>
             </w:r>
             <w:r>
               <w:rPr>
-                <w:noProof/>
                 <w:webHidden/>
               </w:rPr>
               <w:fldChar w:fldCharType="end"/>
@@ -2437,7 +2290,6 @@
             </w:tabs>
             <w:rPr>
               <w:rFonts w:asciiTheme="minorHAnsi" w:eastAsiaTheme="minorEastAsia" w:hAnsiTheme="minorHAnsi"/>
-              <w:noProof/>
               <w:lang w:eastAsia="cs-CZ"/>
             </w:rPr>
           </w:pPr>
@@ -2445,14 +2297,12 @@
             <w:r>
               <w:rPr>
                 <w:rStyle w:val="Hypertextovodkaz"/>
-                <w:noProof/>
               </w:rPr>
               <w:t>6.</w:t>
             </w:r>
             <w:r>
               <w:rPr>
                 <w:rFonts w:asciiTheme="minorHAnsi" w:eastAsiaTheme="minorEastAsia" w:hAnsiTheme="minorHAnsi"/>
-                <w:noProof/>
                 <w:lang w:eastAsia="cs-CZ"/>
               </w:rPr>
               <w:tab/>
@@ -2460,54 +2310,46 @@
             <w:r>
               <w:rPr>
                 <w:rStyle w:val="Hypertextovodkaz"/>
-                <w:noProof/>
               </w:rPr>
               <w:t>Kontrola dopravních předpisů</w:t>
             </w:r>
             <w:r>
               <w:rPr>
-                <w:noProof/>
                 <w:webHidden/>
               </w:rPr>
               <w:tab/>
             </w:r>
             <w:r>
               <w:rPr>
-                <w:noProof/>
                 <w:webHidden/>
               </w:rPr>
               <w:fldChar w:fldCharType="begin"/>
             </w:r>
             <w:r>
               <w:rPr>
-                <w:noProof/>
                 <w:webHidden/>
               </w:rPr>
               <w:instrText xml:space="preserve"> PAGEREF _Toc216029519 \h </w:instrText>
             </w:r>
             <w:r>
               <w:rPr>
-                <w:noProof/>
-                <w:webHidden/>
-              </w:rPr>
-            </w:r>
-            <w:r>
-              <w:rPr>
-                <w:noProof/>
+                <w:webHidden/>
+              </w:rPr>
+            </w:r>
+            <w:r>
+              <w:rPr>
                 <w:webHidden/>
               </w:rPr>
               <w:fldChar w:fldCharType="separate"/>
             </w:r>
             <w:r>
               <w:rPr>
-                <w:noProof/>
                 <w:webHidden/>
               </w:rPr>
               <w:t>12</w:t>
             </w:r>
             <w:r>
               <w:rPr>
-                <w:noProof/>
                 <w:webHidden/>
               </w:rPr>
               <w:fldChar w:fldCharType="end"/>
@@ -2523,7 +2365,6 @@
             </w:tabs>
             <w:rPr>
               <w:rFonts w:asciiTheme="minorHAnsi" w:eastAsiaTheme="minorEastAsia" w:hAnsiTheme="minorHAnsi"/>
-              <w:noProof/>
               <w:lang w:eastAsia="cs-CZ"/>
             </w:rPr>
           </w:pPr>
@@ -2531,14 +2372,12 @@
             <w:r>
               <w:rPr>
                 <w:rStyle w:val="Hypertextovodkaz"/>
-                <w:noProof/>
               </w:rPr>
               <w:t>6.1</w:t>
             </w:r>
             <w:r>
               <w:rPr>
                 <w:rFonts w:asciiTheme="minorHAnsi" w:eastAsiaTheme="minorEastAsia" w:hAnsiTheme="minorHAnsi"/>
-                <w:noProof/>
                 <w:lang w:eastAsia="cs-CZ"/>
               </w:rPr>
               <w:tab/>
@@ -2546,54 +2385,46 @@
             <w:r>
               <w:rPr>
                 <w:rStyle w:val="Hypertextovodkaz"/>
-                <w:noProof/>
               </w:rPr>
               <w:t>Dopravní značky</w:t>
             </w:r>
             <w:r>
               <w:rPr>
-                <w:noProof/>
                 <w:webHidden/>
               </w:rPr>
               <w:tab/>
             </w:r>
             <w:r>
               <w:rPr>
-                <w:noProof/>
                 <w:webHidden/>
               </w:rPr>
               <w:fldChar w:fldCharType="begin"/>
             </w:r>
             <w:r>
               <w:rPr>
-                <w:noProof/>
                 <w:webHidden/>
               </w:rPr>
               <w:instrText xml:space="preserve"> PAGEREF _Toc216029520 \h </w:instrText>
             </w:r>
             <w:r>
               <w:rPr>
-                <w:noProof/>
-                <w:webHidden/>
-              </w:rPr>
-            </w:r>
-            <w:r>
-              <w:rPr>
-                <w:noProof/>
+                <w:webHidden/>
+              </w:rPr>
+            </w:r>
+            <w:r>
+              <w:rPr>
                 <w:webHidden/>
               </w:rPr>
               <w:fldChar w:fldCharType="separate"/>
             </w:r>
             <w:r>
               <w:rPr>
-                <w:noProof/>
                 <w:webHidden/>
               </w:rPr>
               <w:t>12</w:t>
             </w:r>
             <w:r>
               <w:rPr>
-                <w:noProof/>
                 <w:webHidden/>
               </w:rPr>
               <w:fldChar w:fldCharType="end"/>
@@ -2609,7 +2440,6 @@
             </w:tabs>
             <w:rPr>
               <w:rFonts w:asciiTheme="minorHAnsi" w:eastAsiaTheme="minorEastAsia" w:hAnsiTheme="minorHAnsi"/>
-              <w:noProof/>
               <w:lang w:eastAsia="cs-CZ"/>
             </w:rPr>
           </w:pPr>
@@ -2617,14 +2447,12 @@
             <w:r>
               <w:rPr>
                 <w:rStyle w:val="Hypertextovodkaz"/>
-                <w:noProof/>
               </w:rPr>
               <w:t>6.2</w:t>
             </w:r>
             <w:r>
               <w:rPr>
                 <w:rFonts w:asciiTheme="minorHAnsi" w:eastAsiaTheme="minorEastAsia" w:hAnsiTheme="minorHAnsi"/>
-                <w:noProof/>
                 <w:lang w:eastAsia="cs-CZ"/>
               </w:rPr>
               <w:tab/>
@@ -2632,54 +2460,46 @@
             <w:r>
               <w:rPr>
                 <w:rStyle w:val="Hypertextovodkaz"/>
-                <w:noProof/>
               </w:rPr>
               <w:t>Rychlostní limit</w:t>
             </w:r>
             <w:r>
               <w:rPr>
-                <w:noProof/>
                 <w:webHidden/>
               </w:rPr>
               <w:tab/>
             </w:r>
             <w:r>
               <w:rPr>
-                <w:noProof/>
                 <w:webHidden/>
               </w:rPr>
               <w:fldChar w:fldCharType="begin"/>
             </w:r>
             <w:r>
               <w:rPr>
-                <w:noProof/>
                 <w:webHidden/>
               </w:rPr>
               <w:instrText xml:space="preserve"> PAGEREF _Toc216029521 \h </w:instrText>
             </w:r>
             <w:r>
               <w:rPr>
-                <w:noProof/>
-                <w:webHidden/>
-              </w:rPr>
-            </w:r>
-            <w:r>
-              <w:rPr>
-                <w:noProof/>
+                <w:webHidden/>
+              </w:rPr>
+            </w:r>
+            <w:r>
+              <w:rPr>
                 <w:webHidden/>
               </w:rPr>
               <w:fldChar w:fldCharType="separate"/>
             </w:r>
             <w:r>
               <w:rPr>
-                <w:noProof/>
                 <w:webHidden/>
               </w:rPr>
               <w:t>12</w:t>
             </w:r>
             <w:r>
               <w:rPr>
-                <w:noProof/>
                 <w:webHidden/>
               </w:rPr>
               <w:fldChar w:fldCharType="end"/>
@@ -2695,7 +2515,6 @@
             </w:tabs>
             <w:rPr>
               <w:rFonts w:asciiTheme="minorHAnsi" w:eastAsiaTheme="minorEastAsia" w:hAnsiTheme="minorHAnsi"/>
-              <w:noProof/>
               <w:lang w:eastAsia="cs-CZ"/>
             </w:rPr>
           </w:pPr>
@@ -2703,14 +2522,12 @@
             <w:r>
               <w:rPr>
                 <w:rStyle w:val="Hypertextovodkaz"/>
-                <w:noProof/>
               </w:rPr>
               <w:t>6.3</w:t>
             </w:r>
             <w:r>
               <w:rPr>
                 <w:rFonts w:asciiTheme="minorHAnsi" w:eastAsiaTheme="minorEastAsia" w:hAnsiTheme="minorHAnsi"/>
-                <w:noProof/>
                 <w:lang w:eastAsia="cs-CZ"/>
               </w:rPr>
               <w:tab/>
@@ -2718,54 +2535,46 @@
             <w:r>
               <w:rPr>
                 <w:rStyle w:val="Hypertextovodkaz"/>
-                <w:noProof/>
               </w:rPr>
               <w:t>Kontrola přednosti</w:t>
             </w:r>
             <w:r>
               <w:rPr>
-                <w:noProof/>
                 <w:webHidden/>
               </w:rPr>
               <w:tab/>
             </w:r>
             <w:r>
               <w:rPr>
-                <w:noProof/>
                 <w:webHidden/>
               </w:rPr>
               <w:fldChar w:fldCharType="begin"/>
             </w:r>
             <w:r>
               <w:rPr>
-                <w:noProof/>
                 <w:webHidden/>
               </w:rPr>
               <w:instrText xml:space="preserve"> PAGEREF _Toc216029522 \h </w:instrText>
             </w:r>
             <w:r>
               <w:rPr>
-                <w:noProof/>
-                <w:webHidden/>
-              </w:rPr>
-            </w:r>
-            <w:r>
-              <w:rPr>
-                <w:noProof/>
+                <w:webHidden/>
+              </w:rPr>
+            </w:r>
+            <w:r>
+              <w:rPr>
                 <w:webHidden/>
               </w:rPr>
               <w:fldChar w:fldCharType="separate"/>
             </w:r>
             <w:r>
               <w:rPr>
-                <w:noProof/>
                 <w:webHidden/>
               </w:rPr>
               <w:t>12</w:t>
             </w:r>
             <w:r>
               <w:rPr>
-                <w:noProof/>
                 <w:webHidden/>
               </w:rPr>
               <w:fldChar w:fldCharType="end"/>
@@ -2781,7 +2590,6 @@
             </w:tabs>
             <w:rPr>
               <w:rFonts w:asciiTheme="minorHAnsi" w:eastAsiaTheme="minorEastAsia" w:hAnsiTheme="minorHAnsi"/>
-              <w:noProof/>
               <w:lang w:eastAsia="cs-CZ"/>
             </w:rPr>
           </w:pPr>
@@ -2789,14 +2597,12 @@
             <w:r>
               <w:rPr>
                 <w:rStyle w:val="Hypertextovodkaz"/>
-                <w:noProof/>
               </w:rPr>
               <w:t>6.4</w:t>
             </w:r>
             <w:r>
               <w:rPr>
                 <w:rFonts w:asciiTheme="minorHAnsi" w:eastAsiaTheme="minorEastAsia" w:hAnsiTheme="minorHAnsi"/>
-                <w:noProof/>
                 <w:lang w:eastAsia="cs-CZ"/>
               </w:rPr>
               <w:tab/>
@@ -2804,54 +2610,46 @@
             <w:r>
               <w:rPr>
                 <w:rStyle w:val="Hypertextovodkaz"/>
-                <w:noProof/>
               </w:rPr>
               <w:t>Funkcionalita semaforů</w:t>
             </w:r>
             <w:r>
               <w:rPr>
-                <w:noProof/>
                 <w:webHidden/>
               </w:rPr>
               <w:tab/>
             </w:r>
             <w:r>
               <w:rPr>
-                <w:noProof/>
                 <w:webHidden/>
               </w:rPr>
               <w:fldChar w:fldCharType="begin"/>
             </w:r>
             <w:r>
               <w:rPr>
-                <w:noProof/>
                 <w:webHidden/>
               </w:rPr>
               <w:instrText xml:space="preserve"> PAGEREF _Toc216029523 \h </w:instrText>
             </w:r>
             <w:r>
               <w:rPr>
-                <w:noProof/>
-                <w:webHidden/>
-              </w:rPr>
-            </w:r>
-            <w:r>
-              <w:rPr>
-                <w:noProof/>
+                <w:webHidden/>
+              </w:rPr>
+            </w:r>
+            <w:r>
+              <w:rPr>
                 <w:webHidden/>
               </w:rPr>
               <w:fldChar w:fldCharType="separate"/>
             </w:r>
             <w:r>
               <w:rPr>
-                <w:noProof/>
                 <w:webHidden/>
               </w:rPr>
               <w:t>12</w:t>
             </w:r>
             <w:r>
               <w:rPr>
-                <w:noProof/>
                 <w:webHidden/>
               </w:rPr>
               <w:fldChar w:fldCharType="end"/>
@@ -2867,7 +2665,6 @@
             </w:tabs>
             <w:rPr>
               <w:rFonts w:asciiTheme="minorHAnsi" w:eastAsiaTheme="minorEastAsia" w:hAnsiTheme="minorHAnsi"/>
-              <w:noProof/>
               <w:lang w:eastAsia="cs-CZ"/>
             </w:rPr>
           </w:pPr>
@@ -2875,14 +2672,12 @@
             <w:r>
               <w:rPr>
                 <w:rStyle w:val="Hypertextovodkaz"/>
-                <w:noProof/>
               </w:rPr>
               <w:t>7.</w:t>
             </w:r>
             <w:r>
               <w:rPr>
                 <w:rFonts w:asciiTheme="minorHAnsi" w:eastAsiaTheme="minorEastAsia" w:hAnsiTheme="minorHAnsi"/>
-                <w:noProof/>
                 <w:lang w:eastAsia="cs-CZ"/>
               </w:rPr>
               <w:tab/>
@@ -2890,54 +2685,46 @@
             <w:r>
               <w:rPr>
                 <w:rStyle w:val="Hypertextovodkaz"/>
-                <w:noProof/>
               </w:rPr>
               <w:t>Grafická stránka hry</w:t>
             </w:r>
             <w:r>
               <w:rPr>
-                <w:noProof/>
                 <w:webHidden/>
               </w:rPr>
               <w:tab/>
             </w:r>
             <w:r>
               <w:rPr>
-                <w:noProof/>
                 <w:webHidden/>
               </w:rPr>
               <w:fldChar w:fldCharType="begin"/>
             </w:r>
             <w:r>
               <w:rPr>
-                <w:noProof/>
                 <w:webHidden/>
               </w:rPr>
               <w:instrText xml:space="preserve"> PAGEREF _Toc216029524 \h </w:instrText>
             </w:r>
             <w:r>
               <w:rPr>
-                <w:noProof/>
-                <w:webHidden/>
-              </w:rPr>
-            </w:r>
-            <w:r>
-              <w:rPr>
-                <w:noProof/>
+                <w:webHidden/>
+              </w:rPr>
+            </w:r>
+            <w:r>
+              <w:rPr>
                 <w:webHidden/>
               </w:rPr>
               <w:fldChar w:fldCharType="separate"/>
             </w:r>
             <w:r>
               <w:rPr>
-                <w:noProof/>
                 <w:webHidden/>
               </w:rPr>
               <w:t>12</w:t>
             </w:r>
             <w:r>
               <w:rPr>
-                <w:noProof/>
                 <w:webHidden/>
               </w:rPr>
               <w:fldChar w:fldCharType="end"/>
@@ -2953,7 +2740,6 @@
             </w:tabs>
             <w:rPr>
               <w:rFonts w:asciiTheme="minorHAnsi" w:eastAsiaTheme="minorEastAsia" w:hAnsiTheme="minorHAnsi"/>
-              <w:noProof/>
               <w:lang w:eastAsia="cs-CZ"/>
             </w:rPr>
           </w:pPr>
@@ -2961,14 +2747,12 @@
             <w:r>
               <w:rPr>
                 <w:rStyle w:val="Hypertextovodkaz"/>
-                <w:noProof/>
               </w:rPr>
               <w:t>7.1</w:t>
             </w:r>
             <w:r>
               <w:rPr>
                 <w:rFonts w:asciiTheme="minorHAnsi" w:eastAsiaTheme="minorEastAsia" w:hAnsiTheme="minorHAnsi"/>
-                <w:noProof/>
                 <w:lang w:eastAsia="cs-CZ"/>
               </w:rPr>
               <w:tab/>
@@ -2976,54 +2760,46 @@
             <w:r>
               <w:rPr>
                 <w:rStyle w:val="Hypertextovodkaz"/>
-                <w:noProof/>
               </w:rPr>
               <w:t>Šipky určující směr jízdy</w:t>
             </w:r>
             <w:r>
               <w:rPr>
-                <w:noProof/>
                 <w:webHidden/>
               </w:rPr>
               <w:tab/>
             </w:r>
             <w:r>
               <w:rPr>
-                <w:noProof/>
                 <w:webHidden/>
               </w:rPr>
               <w:fldChar w:fldCharType="begin"/>
             </w:r>
             <w:r>
               <w:rPr>
-                <w:noProof/>
                 <w:webHidden/>
               </w:rPr>
               <w:instrText xml:space="preserve"> PAGEREF _Toc216029525 \h </w:instrText>
             </w:r>
             <w:r>
               <w:rPr>
-                <w:noProof/>
-                <w:webHidden/>
-              </w:rPr>
-            </w:r>
-            <w:r>
-              <w:rPr>
-                <w:noProof/>
+                <w:webHidden/>
+              </w:rPr>
+            </w:r>
+            <w:r>
+              <w:rPr>
                 <w:webHidden/>
               </w:rPr>
               <w:fldChar w:fldCharType="separate"/>
             </w:r>
             <w:r>
               <w:rPr>
-                <w:noProof/>
                 <w:webHidden/>
               </w:rPr>
               <w:t>12</w:t>
             </w:r>
             <w:r>
               <w:rPr>
-                <w:noProof/>
                 <w:webHidden/>
               </w:rPr>
               <w:fldChar w:fldCharType="end"/>
@@ -3039,7 +2815,6 @@
             </w:tabs>
             <w:rPr>
               <w:rFonts w:asciiTheme="minorHAnsi" w:eastAsiaTheme="minorEastAsia" w:hAnsiTheme="minorHAnsi"/>
-              <w:noProof/>
               <w:lang w:eastAsia="cs-CZ"/>
             </w:rPr>
           </w:pPr>
@@ -3047,14 +2822,12 @@
             <w:r>
               <w:rPr>
                 <w:rStyle w:val="Hypertextovodkaz"/>
-                <w:noProof/>
               </w:rPr>
               <w:t>7.2</w:t>
             </w:r>
             <w:r>
               <w:rPr>
                 <w:rFonts w:asciiTheme="minorHAnsi" w:eastAsiaTheme="minorEastAsia" w:hAnsiTheme="minorHAnsi"/>
-                <w:noProof/>
                 <w:lang w:eastAsia="cs-CZ"/>
               </w:rPr>
               <w:tab/>
@@ -3062,54 +2835,46 @@
             <w:r>
               <w:rPr>
                 <w:rStyle w:val="Hypertextovodkaz"/>
-                <w:noProof/>
               </w:rPr>
               <w:t>Dopravní značky</w:t>
             </w:r>
             <w:r>
               <w:rPr>
-                <w:noProof/>
                 <w:webHidden/>
               </w:rPr>
               <w:tab/>
             </w:r>
             <w:r>
               <w:rPr>
-                <w:noProof/>
                 <w:webHidden/>
               </w:rPr>
               <w:fldChar w:fldCharType="begin"/>
             </w:r>
             <w:r>
               <w:rPr>
-                <w:noProof/>
                 <w:webHidden/>
               </w:rPr>
               <w:instrText xml:space="preserve"> PAGEREF _Toc216029526 \h </w:instrText>
             </w:r>
             <w:r>
               <w:rPr>
-                <w:noProof/>
-                <w:webHidden/>
-              </w:rPr>
-            </w:r>
-            <w:r>
-              <w:rPr>
-                <w:noProof/>
+                <w:webHidden/>
+              </w:rPr>
+            </w:r>
+            <w:r>
+              <w:rPr>
                 <w:webHidden/>
               </w:rPr>
               <w:fldChar w:fldCharType="separate"/>
             </w:r>
             <w:r>
               <w:rPr>
-                <w:noProof/>
                 <w:webHidden/>
               </w:rPr>
               <w:t>13</w:t>
             </w:r>
             <w:r>
               <w:rPr>
-                <w:noProof/>
                 <w:webHidden/>
               </w:rPr>
               <w:fldChar w:fldCharType="end"/>
@@ -3125,7 +2890,6 @@
             </w:tabs>
             <w:rPr>
               <w:rFonts w:asciiTheme="minorHAnsi" w:eastAsiaTheme="minorEastAsia" w:hAnsiTheme="minorHAnsi"/>
-              <w:noProof/>
               <w:lang w:eastAsia="cs-CZ"/>
             </w:rPr>
           </w:pPr>
@@ -3133,14 +2897,12 @@
             <w:r>
               <w:rPr>
                 <w:rStyle w:val="Hypertextovodkaz"/>
-                <w:noProof/>
               </w:rPr>
               <w:t>7.3</w:t>
             </w:r>
             <w:r>
               <w:rPr>
                 <w:rFonts w:asciiTheme="minorHAnsi" w:eastAsiaTheme="minorEastAsia" w:hAnsiTheme="minorHAnsi"/>
-                <w:noProof/>
                 <w:lang w:eastAsia="cs-CZ"/>
               </w:rPr>
               <w:tab/>
@@ -3148,54 +2910,46 @@
             <w:r>
               <w:rPr>
                 <w:rStyle w:val="Hypertextovodkaz"/>
-                <w:noProof/>
               </w:rPr>
               <w:t>Souhrn nesplněných dopravních předpisů</w:t>
             </w:r>
             <w:r>
               <w:rPr>
-                <w:noProof/>
                 <w:webHidden/>
               </w:rPr>
               <w:tab/>
             </w:r>
             <w:r>
               <w:rPr>
-                <w:noProof/>
                 <w:webHidden/>
               </w:rPr>
               <w:fldChar w:fldCharType="begin"/>
             </w:r>
             <w:r>
               <w:rPr>
-                <w:noProof/>
                 <w:webHidden/>
               </w:rPr>
               <w:instrText xml:space="preserve"> PAGEREF _Toc216029527 \h </w:instrText>
             </w:r>
             <w:r>
               <w:rPr>
-                <w:noProof/>
-                <w:webHidden/>
-              </w:rPr>
-            </w:r>
-            <w:r>
-              <w:rPr>
-                <w:noProof/>
+                <w:webHidden/>
+              </w:rPr>
+            </w:r>
+            <w:r>
+              <w:rPr>
                 <w:webHidden/>
               </w:rPr>
               <w:fldChar w:fldCharType="separate"/>
             </w:r>
             <w:r>
               <w:rPr>
-                <w:noProof/>
                 <w:webHidden/>
               </w:rPr>
               <w:t>13</w:t>
             </w:r>
             <w:r>
               <w:rPr>
-                <w:noProof/>
                 <w:webHidden/>
               </w:rPr>
               <w:fldChar w:fldCharType="end"/>
@@ -3211,7 +2965,6 @@
             </w:tabs>
             <w:rPr>
               <w:rFonts w:asciiTheme="minorHAnsi" w:eastAsiaTheme="minorEastAsia" w:hAnsiTheme="minorHAnsi"/>
-              <w:noProof/>
               <w:lang w:eastAsia="cs-CZ"/>
             </w:rPr>
           </w:pPr>
@@ -3219,14 +2972,12 @@
             <w:r>
               <w:rPr>
                 <w:rStyle w:val="Hypertextovodkaz"/>
-                <w:noProof/>
               </w:rPr>
               <w:t>7.4</w:t>
             </w:r>
             <w:r>
               <w:rPr>
                 <w:rFonts w:asciiTheme="minorHAnsi" w:eastAsiaTheme="minorEastAsia" w:hAnsiTheme="minorHAnsi"/>
-                <w:noProof/>
                 <w:lang w:eastAsia="cs-CZ"/>
               </w:rPr>
               <w:tab/>
@@ -3234,54 +2985,46 @@
             <w:r>
               <w:rPr>
                 <w:rStyle w:val="Hypertextovodkaz"/>
-                <w:noProof/>
               </w:rPr>
               <w:t>Materiály</w:t>
             </w:r>
             <w:r>
               <w:rPr>
-                <w:noProof/>
                 <w:webHidden/>
               </w:rPr>
               <w:tab/>
             </w:r>
             <w:r>
               <w:rPr>
-                <w:noProof/>
                 <w:webHidden/>
               </w:rPr>
               <w:fldChar w:fldCharType="begin"/>
             </w:r>
             <w:r>
               <w:rPr>
-                <w:noProof/>
                 <w:webHidden/>
               </w:rPr>
               <w:instrText xml:space="preserve"> PAGEREF _Toc216029528 \h </w:instrText>
             </w:r>
             <w:r>
               <w:rPr>
-                <w:noProof/>
-                <w:webHidden/>
-              </w:rPr>
-            </w:r>
-            <w:r>
-              <w:rPr>
-                <w:noProof/>
+                <w:webHidden/>
+              </w:rPr>
+            </w:r>
+            <w:r>
+              <w:rPr>
                 <w:webHidden/>
               </w:rPr>
               <w:fldChar w:fldCharType="separate"/>
             </w:r>
             <w:r>
               <w:rPr>
-                <w:noProof/>
                 <w:webHidden/>
               </w:rPr>
               <w:t>13</w:t>
             </w:r>
             <w:r>
               <w:rPr>
-                <w:noProof/>
                 <w:webHidden/>
               </w:rPr>
               <w:fldChar w:fldCharType="end"/>
@@ -3315,29 +3058,17 @@
           <w:ilvl w:val="0"/>
           <w:numId w:val="0"/>
         </w:numPr>
-      </w:pPr>
-      <w:proofErr w:type="spellStart"/>
-      <w:r>
+        <w:rPr>
+          <w:lang w:val="cs-CZ"/>
+        </w:rPr>
+      </w:pPr>
+      <w:r>
+        <w:rPr>
+          <w:lang w:val="cs-CZ"/>
+        </w:rPr>
         <w:lastRenderedPageBreak/>
-        <w:t>Seznam</w:t>
-      </w:r>
-      <w:proofErr w:type="spellEnd"/>
-      <w:r>
-        <w:t xml:space="preserve"> </w:t>
-      </w:r>
-      <w:proofErr w:type="spellStart"/>
-      <w:r>
-        <w:t>obrázků</w:t>
-      </w:r>
-      <w:proofErr w:type="spellEnd"/>
-      <w:r>
-        <w:t xml:space="preserve"> a </w:t>
-      </w:r>
-      <w:proofErr w:type="spellStart"/>
-      <w:r>
-        <w:t>tabulek</w:t>
-      </w:r>
-      <w:proofErr w:type="spellEnd"/>
+        <w:t>Seznam obrázků a tabulek</w:t>
+      </w:r>
     </w:p>
     <w:p>
       <w:pPr>
@@ -3423,6 +3154,32 @@
       <w:pPr>
         <w:spacing w:after="160" w:line="278" w:lineRule="auto"/>
         <w:jc w:val="left"/>
+      </w:pPr>
+      <w:r>
+        <w:fldChar w:fldCharType="begin"/>
+      </w:r>
+      <w:r>
+        <w:instrText xml:space="preserve"> TOC \h \z \c "Obrázek" </w:instrText>
+      </w:r>
+      <w:r>
+        <w:fldChar w:fldCharType="separate"/>
+      </w:r>
+      <w:r>
+        <w:rPr>
+          <w:b/>
+          <w:bCs/>
+          <w:noProof/>
+        </w:rPr>
+        <w:t>Nenalezena položka seznamu obrázků.</w:t>
+      </w:r>
+      <w:r>
+        <w:fldChar w:fldCharType="end"/>
+      </w:r>
+    </w:p>
+    <w:p>
+      <w:pPr>
+        <w:spacing w:after="160" w:line="278" w:lineRule="auto"/>
+        <w:jc w:val="left"/>
         <w:rPr>
           <w:rFonts w:eastAsiaTheme="majorEastAsia" w:cstheme="majorBidi"/>
           <w:b/>
@@ -3430,7 +3187,6 @@
           <w:kern w:val="36"/>
           <w:sz w:val="36"/>
           <w:szCs w:val="36"/>
-          <w:lang w:val="en-US"/>
         </w:rPr>
       </w:pPr>
       <w:r>
@@ -3444,13 +3200,17 @@
           <w:ilvl w:val="0"/>
           <w:numId w:val="0"/>
         </w:numPr>
-      </w:pPr>
-      <w:proofErr w:type="spellStart"/>
-      <w:r>
+        <w:rPr>
+          <w:lang w:val="cs-CZ"/>
+        </w:rPr>
+      </w:pPr>
+      <w:r>
+        <w:rPr>
+          <w:lang w:val="cs-CZ"/>
+        </w:rPr>
         <w:lastRenderedPageBreak/>
         <w:t>Úvod</w:t>
       </w:r>
-      <w:proofErr w:type="spellEnd"/>
     </w:p>
     <w:p>
       <w:pPr>
@@ -3591,27 +3351,28 @@
     <w:p>
       <w:pPr>
         <w:pStyle w:val="Nadpis1"/>
-      </w:pPr>
-      <w:r>
+        <w:rPr>
+          <w:lang w:val="cs-CZ"/>
+        </w:rPr>
+      </w:pPr>
+      <w:r>
+        <w:rPr>
+          <w:lang w:val="cs-CZ"/>
+        </w:rPr>
         <w:t xml:space="preserve"> </w:t>
       </w:r>
       <w:bookmarkStart w:id="2" w:name="_Toc216029505"/>
       <w:r>
+        <w:rPr>
+          <w:lang w:val="cs-CZ"/>
+        </w:rPr>
         <w:t>Inspirace</w:t>
       </w:r>
       <w:bookmarkEnd w:id="2"/>
     </w:p>
     <w:p>
       <w:r>
-        <w:t xml:space="preserve">City Car </w:t>
-      </w:r>
-      <w:proofErr w:type="spellStart"/>
-      <w:r>
-        <w:t>Driving</w:t>
-      </w:r>
-      <w:proofErr w:type="spellEnd"/>
-      <w:r>
-        <w:t xml:space="preserve"> je simulátor zaměřený na běžnou městskou silniční dopravu. Řeší různé dopravní situace</w:t>
+        <w:t>City Car Driving je simulátor zaměřený na běžnou městskou silniční dopravu. Řeší různé dopravní situace</w:t>
       </w:r>
       <w:r>
         <w:t xml:space="preserve"> (např. křižovatky, řízení se semafory, </w:t>
@@ -3671,23 +3432,12 @@
         <w:t>.</w:t>
       </w:r>
       <w:r>
-        <w:t xml:space="preserve"> </w:t>
-      </w:r>
-      <w:r>
-        <w:t>[1]</w:t>
-      </w:r>
-    </w:p>
-    <w:p>
-      <w:r>
-        <w:t xml:space="preserve">Další inspirací byl </w:t>
-      </w:r>
-      <w:proofErr w:type="spellStart"/>
-      <w:r>
-        <w:t>Virtual</w:t>
-      </w:r>
-      <w:proofErr w:type="spellEnd"/>
-      <w:r>
-        <w:t xml:space="preserve"> Driving School</w:t>
+        <w:t xml:space="preserve"> [1]</w:t>
+      </w:r>
+    </w:p>
+    <w:p>
+      <w:r>
+        <w:t>Další inspirací byl Virtual Driving School</w:t>
       </w:r>
       <w:r>
         <w:t xml:space="preserve"> (dále VDS)</w:t>
@@ -3738,9 +3488,15 @@
     <w:p>
       <w:pPr>
         <w:pStyle w:val="Nadpis1"/>
+        <w:rPr>
+          <w:lang w:val="cs-CZ"/>
+        </w:rPr>
       </w:pPr>
       <w:bookmarkStart w:id="3" w:name="_Toc216029506"/>
       <w:r>
+        <w:rPr>
+          <w:lang w:val="cs-CZ"/>
+        </w:rPr>
         <w:lastRenderedPageBreak/>
         <w:t>Dopravní předpisy</w:t>
       </w:r>
@@ -3772,9 +3528,15 @@
     <w:p>
       <w:pPr>
         <w:pStyle w:val="Nadpis1"/>
+        <w:rPr>
+          <w:lang w:val="cs-CZ"/>
+        </w:rPr>
       </w:pPr>
       <w:bookmarkStart w:id="4" w:name="_Toc216029507"/>
       <w:r>
+        <w:rPr>
+          <w:lang w:val="cs-CZ"/>
+        </w:rPr>
         <w:t>Použité technologie</w:t>
       </w:r>
       <w:bookmarkEnd w:id="4"/>
@@ -3783,12 +3545,21 @@
     <w:p>
       <w:pPr>
         <w:pStyle w:val="Nadpis2"/>
-      </w:pPr>
-      <w:r>
+        <w:rPr>
+          <w:lang w:val="cs-CZ"/>
+        </w:rPr>
+      </w:pPr>
+      <w:r>
+        <w:rPr>
+          <w:lang w:val="cs-CZ"/>
+        </w:rPr>
         <w:t xml:space="preserve"> </w:t>
       </w:r>
       <w:bookmarkStart w:id="5" w:name="_Toc216029508"/>
       <w:r>
+        <w:rPr>
+          <w:lang w:val="cs-CZ"/>
+        </w:rPr>
         <w:t>Unity</w:t>
       </w:r>
       <w:bookmarkEnd w:id="5"/>
@@ -3797,12 +3568,21 @@
     <w:p>
       <w:pPr>
         <w:pStyle w:val="Nadpis2"/>
-      </w:pPr>
-      <w:r>
+        <w:rPr>
+          <w:lang w:val="cs-CZ"/>
+        </w:rPr>
+      </w:pPr>
+      <w:r>
+        <w:rPr>
+          <w:lang w:val="cs-CZ"/>
+        </w:rPr>
         <w:t xml:space="preserve"> </w:t>
       </w:r>
       <w:bookmarkStart w:id="6" w:name="_Toc216029509"/>
       <w:r>
+        <w:rPr>
+          <w:lang w:val="cs-CZ"/>
+        </w:rPr>
         <w:t>C#</w:t>
       </w:r>
       <w:bookmarkEnd w:id="6"/>
@@ -3811,23 +3591,58 @@
     <w:p>
       <w:pPr>
         <w:pStyle w:val="Nadpis2"/>
-      </w:pPr>
-      <w:r>
+        <w:rPr>
+          <w:lang w:val="cs-CZ"/>
+        </w:rPr>
+      </w:pPr>
+      <w:r>
+        <w:rPr>
+          <w:lang w:val="cs-CZ"/>
+        </w:rPr>
         <w:t xml:space="preserve"> </w:t>
       </w:r>
       <w:bookmarkStart w:id="7" w:name="_Toc216029510"/>
-      <w:r>
+      <w:proofErr w:type="spellStart"/>
+      <w:r>
+        <w:rPr>
+          <w:lang w:val="cs-CZ"/>
+        </w:rPr>
         <w:t>Blender</w:t>
       </w:r>
       <w:bookmarkEnd w:id="7"/>
+      <w:proofErr w:type="spellEnd"/>
     </w:p>
     <w:p/>
     <w:p>
       <w:pPr>
+        <w:pStyle w:val="Nadpis2"/>
+      </w:pPr>
+      <w:proofErr w:type="spellStart"/>
+      <w:r>
+        <w:t>Tinkercad</w:t>
+      </w:r>
+      <w:proofErr w:type="spellEnd"/>
+    </w:p>
+    <w:p>
+      <w:pPr>
+        <w:rPr>
+          <w:lang w:val="en-US"/>
+        </w:rPr>
+      </w:pPr>
+    </w:p>
+    <w:p>
+      <w:pPr>
         <w:pStyle w:val="Nadpis1"/>
+        <w:rPr>
+          <w:lang w:val="cs-CZ"/>
+        </w:rPr>
       </w:pPr>
       <w:bookmarkStart w:id="8" w:name="_Toc216029511"/>
       <w:r>
+        <w:rPr>
+          <w:lang w:val="cs-CZ"/>
+        </w:rPr>
+        <w:lastRenderedPageBreak/>
         <w:t>Herní úrovně</w:t>
       </w:r>
       <w:bookmarkEnd w:id="8"/>
@@ -3836,250 +3651,553 @@
     <w:p>
       <w:pPr>
         <w:pStyle w:val="Nadpis2"/>
-      </w:pPr>
-      <w:r>
+        <w:rPr>
+          <w:lang w:val="cs-CZ"/>
+        </w:rPr>
+      </w:pPr>
+      <w:r>
+        <w:rPr>
+          <w:lang w:val="cs-CZ"/>
+        </w:rPr>
+        <w:t xml:space="preserve"> </w:t>
+      </w:r>
+      <w:bookmarkStart w:id="9" w:name="_Toc216029512"/>
+      <w:r>
+        <w:rPr>
+          <w:lang w:val="cs-CZ"/>
+        </w:rPr>
+        <w:t>Úroveň 1</w:t>
+      </w:r>
+      <w:bookmarkEnd w:id="9"/>
+    </w:p>
+    <w:p>
+      <w:r>
+        <w:t xml:space="preserve">První úroveň je určena pro úplné začátečníky. Obsahuje nejzákladnější dopravní </w:t>
+      </w:r>
+      <w:proofErr w:type="gramStart"/>
+      <w:r>
+        <w:t>předpis</w:t>
+      </w:r>
+      <w:proofErr w:type="gramEnd"/>
+      <w:r>
+        <w:t xml:space="preserve"> kterým je maximální </w:t>
+      </w:r>
+      <w:r>
+        <w:t>povolen</w:t>
+      </w:r>
+      <w:r>
+        <w:t>á</w:t>
+      </w:r>
+      <w:r>
+        <w:t xml:space="preserve"> rychlost </w:t>
+      </w:r>
+      <w:r>
+        <w:t>(50km za hodinu). Také se hráči seznamují se jízdou v jízdním pruhu a zatáčením do jiných ulic bez nechtěného vjezdu do protisměru. Hráč má za úkol dojet a zaparkovat u nedalekého obchodu</w:t>
+      </w:r>
+      <w:r>
+        <w:t xml:space="preserve">, následně pokračovat podle směru jízdy šipek a </w:t>
+      </w:r>
+      <w:r>
+        <w:t>dokončit úroveň u určeného domu.</w:t>
+      </w:r>
+    </w:p>
+    <w:p>
+      <w:pPr>
+        <w:pStyle w:val="Nadpis2"/>
+        <w:rPr>
+          <w:lang w:val="cs-CZ"/>
+        </w:rPr>
+      </w:pPr>
+      <w:r>
+        <w:rPr>
+          <w:lang w:val="cs-CZ"/>
+        </w:rPr>
+        <w:t xml:space="preserve"> </w:t>
+      </w:r>
+      <w:bookmarkStart w:id="10" w:name="_Toc216029513"/>
+      <w:r>
+        <w:rPr>
+          <w:lang w:val="cs-CZ"/>
+        </w:rPr>
+        <w:t>Úroveň 2</w:t>
+      </w:r>
+      <w:bookmarkEnd w:id="10"/>
+    </w:p>
+    <w:p>
+      <w:r>
+        <w:t>Druhá úroveň</w:t>
+      </w:r>
+    </w:p>
+    <w:p>
+      <w:pPr>
+        <w:pStyle w:val="Nadpis2"/>
+        <w:rPr>
+          <w:lang w:val="cs-CZ"/>
+        </w:rPr>
+      </w:pPr>
+      <w:r>
+        <w:rPr>
+          <w:lang w:val="cs-CZ"/>
+        </w:rPr>
+        <w:t xml:space="preserve"> </w:t>
+      </w:r>
+      <w:bookmarkStart w:id="11" w:name="_Toc216029514"/>
+      <w:r>
+        <w:rPr>
+          <w:lang w:val="cs-CZ"/>
+        </w:rPr>
+        <w:t>Úroveň 3</w:t>
+      </w:r>
+      <w:bookmarkEnd w:id="11"/>
+    </w:p>
+    <w:p/>
+    <w:p>
+      <w:pPr>
+        <w:pStyle w:val="Nadpis2"/>
+        <w:rPr>
+          <w:lang w:val="cs-CZ"/>
+        </w:rPr>
+      </w:pPr>
+      <w:r>
+        <w:rPr>
+          <w:lang w:val="cs-CZ"/>
+        </w:rPr>
+        <w:t xml:space="preserve"> </w:t>
+      </w:r>
+      <w:bookmarkStart w:id="12" w:name="_Toc216029515"/>
+      <w:r>
+        <w:rPr>
+          <w:lang w:val="cs-CZ"/>
+        </w:rPr>
+        <w:t>Úroveň 4</w:t>
+      </w:r>
+      <w:bookmarkEnd w:id="12"/>
+    </w:p>
+    <w:p/>
+    <w:p>
+      <w:pPr>
+        <w:pStyle w:val="Nadpis2"/>
+        <w:rPr>
+          <w:lang w:val="cs-CZ"/>
+        </w:rPr>
+      </w:pPr>
+      <w:r>
+        <w:rPr>
+          <w:lang w:val="cs-CZ"/>
+        </w:rPr>
+        <w:t xml:space="preserve"> </w:t>
+      </w:r>
+      <w:bookmarkStart w:id="13" w:name="_Toc216029516"/>
+      <w:r>
+        <w:rPr>
+          <w:lang w:val="cs-CZ"/>
+        </w:rPr>
+        <w:t>Úroveň 5</w:t>
+      </w:r>
+      <w:bookmarkEnd w:id="13"/>
+    </w:p>
+    <w:p/>
+    <w:p>
+      <w:pPr>
+        <w:spacing w:after="160" w:line="278" w:lineRule="auto"/>
+        <w:jc w:val="left"/>
+      </w:pPr>
+      <w:r>
+        <w:br w:type="page"/>
+      </w:r>
+    </w:p>
+    <w:p>
+      <w:pPr>
+        <w:pStyle w:val="Nadpis01"/>
+        <w:rPr>
+          <w:lang w:val="cs-CZ"/>
+        </w:rPr>
+      </w:pPr>
+      <w:r>
+        <w:rPr>
+          <w:lang w:val="cs-CZ"/>
+        </w:rPr>
+        <w:lastRenderedPageBreak/>
+        <w:t>Praktická část</w:t>
+      </w:r>
+    </w:p>
+    <w:p>
+      <w:pPr>
+        <w:pStyle w:val="Nadpis1"/>
+        <w:rPr>
+          <w:lang w:val="cs-CZ"/>
+        </w:rPr>
+      </w:pPr>
+      <w:bookmarkStart w:id="14" w:name="_Toc216029517"/>
+      <w:r>
+        <w:rPr>
+          <w:lang w:val="cs-CZ"/>
+        </w:rPr>
+        <w:t>Tvorba postavy</w:t>
+      </w:r>
+      <w:bookmarkEnd w:id="14"/>
+    </w:p>
+    <w:p/>
+    <w:p>
+      <w:pPr>
+        <w:pStyle w:val="Nadpis2"/>
+        <w:rPr>
+          <w:lang w:val="cs-CZ"/>
+        </w:rPr>
+      </w:pPr>
+      <w:r>
+        <w:rPr>
+          <w:lang w:val="cs-CZ"/>
+        </w:rPr>
+        <w:t xml:space="preserve"> </w:t>
+      </w:r>
+      <w:bookmarkStart w:id="15" w:name="_Toc216029518"/>
+      <w:r>
+        <w:rPr>
+          <w:lang w:val="cs-CZ"/>
+        </w:rPr>
+        <w:t>Pohyb</w:t>
+      </w:r>
+      <w:bookmarkEnd w:id="15"/>
+    </w:p>
+    <w:p/>
+    <w:p>
+      <w:pPr>
+        <w:pStyle w:val="Nadpis1"/>
+        <w:rPr>
+          <w:lang w:val="cs-CZ"/>
+        </w:rPr>
+      </w:pPr>
+      <w:bookmarkStart w:id="16" w:name="_Toc216029519"/>
+      <w:r>
+        <w:rPr>
+          <w:lang w:val="cs-CZ"/>
+        </w:rPr>
+        <w:t>Kontrola dopravních předpisů</w:t>
+      </w:r>
+      <w:bookmarkEnd w:id="16"/>
+    </w:p>
+    <w:p/>
+    <w:p>
+      <w:pPr>
+        <w:pStyle w:val="Nadpis2"/>
+        <w:rPr>
+          <w:lang w:val="cs-CZ"/>
+        </w:rPr>
+      </w:pPr>
+      <w:r>
+        <w:rPr>
+          <w:lang w:val="cs-CZ"/>
+        </w:rPr>
+        <w:t xml:space="preserve"> </w:t>
+      </w:r>
+      <w:bookmarkStart w:id="17" w:name="_Toc216029520"/>
+      <w:r>
+        <w:rPr>
+          <w:lang w:val="cs-CZ"/>
+        </w:rPr>
+        <w:t>Dopravní značky</w:t>
+      </w:r>
+      <w:bookmarkEnd w:id="17"/>
+    </w:p>
+    <w:p/>
+    <w:p>
+      <w:pPr>
+        <w:pStyle w:val="Nadpis2"/>
+        <w:rPr>
+          <w:lang w:val="cs-CZ"/>
+        </w:rPr>
+      </w:pPr>
+      <w:bookmarkStart w:id="18" w:name="_Toc216029521"/>
+      <w:r>
+        <w:rPr>
+          <w:lang w:val="cs-CZ"/>
+        </w:rPr>
+        <w:t>Rychlostní limit</w:t>
+      </w:r>
+      <w:bookmarkEnd w:id="18"/>
+    </w:p>
+    <w:p>
+      <w:r>
+        <w:t>Kontrolu rychlosti stanovuje</w:t>
+      </w:r>
+      <w:r>
+        <w:t xml:space="preserve"> neviditelný</w:t>
+      </w:r>
+      <w:r>
+        <w:t xml:space="preserve"> objekt, který</w:t>
+      </w:r>
+      <w:r>
+        <w:t xml:space="preserve"> po přejezdu hráčem nastaví maximální povolenou rychlost na 50 km v hodině. Hlavní skript, který počítá rychlost hráče, </w:t>
+      </w:r>
+      <w:r>
+        <w:t>neustále kontroluje, zda rychlost hráče je vyšší, než je maximální povolená rychlost.</w:t>
+      </w:r>
+    </w:p>
+    <w:p/>
+    <w:p>
+      <w:pPr>
+        <w:pStyle w:val="Nadpis2"/>
+        <w:rPr>
+          <w:lang w:val="cs-CZ"/>
+        </w:rPr>
+      </w:pPr>
+      <w:r>
+        <w:rPr>
+          <w:lang w:val="cs-CZ"/>
+        </w:rPr>
+        <w:t xml:space="preserve"> </w:t>
+      </w:r>
+      <w:bookmarkStart w:id="19" w:name="_Toc216029522"/>
+      <w:r>
+        <w:rPr>
+          <w:lang w:val="cs-CZ"/>
+        </w:rPr>
+        <w:t>Kontrola přednosti</w:t>
+      </w:r>
+      <w:bookmarkEnd w:id="19"/>
+    </w:p>
+    <w:p/>
+    <w:p>
+      <w:pPr>
+        <w:pStyle w:val="Nadpis2"/>
+        <w:rPr>
+          <w:lang w:val="cs-CZ"/>
+        </w:rPr>
+      </w:pPr>
+      <w:r>
+        <w:rPr>
+          <w:lang w:val="cs-CZ"/>
+        </w:rPr>
+        <w:t xml:space="preserve"> </w:t>
+      </w:r>
+      <w:bookmarkStart w:id="20" w:name="_Toc216029523"/>
+      <w:r>
+        <w:rPr>
+          <w:lang w:val="cs-CZ"/>
+        </w:rPr>
+        <w:t>Funkcionalita semaforů</w:t>
+      </w:r>
+      <w:bookmarkEnd w:id="20"/>
+    </w:p>
+    <w:p/>
+    <w:p>
+      <w:pPr>
+        <w:pStyle w:val="Nadpis1"/>
+        <w:rPr>
+          <w:lang w:val="cs-CZ"/>
+        </w:rPr>
+      </w:pPr>
+      <w:bookmarkStart w:id="21" w:name="_Toc216029524"/>
+      <w:r>
+        <w:rPr>
+          <w:lang w:val="cs-CZ"/>
+        </w:rPr>
+        <w:t>Grafická stránka hry</w:t>
+      </w:r>
+      <w:bookmarkEnd w:id="21"/>
+    </w:p>
+    <w:p/>
+    <w:p>
+      <w:pPr>
+        <w:pStyle w:val="Nadpis2"/>
+        <w:rPr>
+          <w:lang w:val="cs-CZ"/>
+        </w:rPr>
+      </w:pPr>
+      <w:r>
+        <w:rPr>
+          <w:lang w:val="cs-CZ"/>
+        </w:rPr>
         <w:lastRenderedPageBreak/>
         <w:t xml:space="preserve"> </w:t>
       </w:r>
-      <w:bookmarkStart w:id="9" w:name="_Toc216029512"/>
-      <w:r>
-        <w:t>Úroveň 1</w:t>
-      </w:r>
-      <w:bookmarkEnd w:id="9"/>
+      <w:bookmarkStart w:id="22" w:name="_Toc216029525"/>
+      <w:r>
+        <w:rPr>
+          <w:lang w:val="cs-CZ"/>
+        </w:rPr>
+        <w:t xml:space="preserve">Šipky určující </w:t>
+      </w:r>
+      <w:bookmarkEnd w:id="22"/>
+      <w:r>
+        <w:rPr>
+          <w:lang w:val="cs-CZ"/>
+        </w:rPr>
+        <w:t>trasu</w:t>
+      </w:r>
+    </w:p>
+    <w:p>
+      <w:r>
+        <w:t>Tři</w:t>
+      </w:r>
+      <w:r>
+        <w:t xml:space="preserve"> typy šipek určujících trasu jsou vymodelované ve webové aplikaci </w:t>
+      </w:r>
+      <w:proofErr w:type="spellStart"/>
+      <w:r>
+        <w:t>Tinker</w:t>
+      </w:r>
+      <w:r>
+        <w:t>c</w:t>
+      </w:r>
+      <w:r>
+        <w:t>ad</w:t>
+      </w:r>
+      <w:proofErr w:type="spellEnd"/>
+      <w:r>
+        <w:t xml:space="preserve">. Každá z šipek je složená z trojúhelníku, alespoň jednoho </w:t>
+      </w:r>
+      <w:r>
+        <w:t>obdélníku</w:t>
+      </w:r>
+      <w:r>
+        <w:t xml:space="preserve"> a dvou kruhů. Určují</w:t>
+      </w:r>
+      <w:r>
+        <w:t xml:space="preserve">, kdy má hráč zatočit, kdy jet rovně nebo otočit. </w:t>
+      </w:r>
+      <w:r>
+        <w:t xml:space="preserve">Změna barvy byla učiněna importováním modelů do aplikace </w:t>
+      </w:r>
+      <w:proofErr w:type="spellStart"/>
+      <w:r>
+        <w:t>Blender</w:t>
+      </w:r>
+      <w:proofErr w:type="spellEnd"/>
+      <w:r>
+        <w:t>, následné vytvoření materiálu, který jsem změnil na růžovou barvu. Modely jsou výsledkem vlastní práce.</w:t>
+      </w:r>
+    </w:p>
+    <w:p>
+      <w:r>
+        <w:rPr>
+          <w:noProof/>
+        </w:rPr>
+        <w:drawing>
+          <wp:inline distT="0" distB="0" distL="0" distR="0" wp14:anchorId="58D63B95" wp14:editId="17C068C0">
+            <wp:extent cx="5612130" cy="1282700"/>
+            <wp:effectExtent l="0" t="0" r="7620" b="0"/>
+            <wp:docPr id="1997615601" name="Obrázek 1" descr="Obsah obrázku text, snímek obrazovky, Písmo, číslo&#10;&#10;Obsah generovaný pomocí AI může být nesprávný."/>
+            <wp:cNvGraphicFramePr>
+              <a:graphicFrameLocks xmlns:a="http://schemas.openxmlformats.org/drawingml/2006/main" noChangeAspect="1"/>
+            </wp:cNvGraphicFramePr>
+            <a:graphic xmlns:a="http://schemas.openxmlformats.org/drawingml/2006/main">
+              <a:graphicData uri="http://schemas.openxmlformats.org/drawingml/2006/picture">
+                <pic:pic xmlns:pic="http://schemas.openxmlformats.org/drawingml/2006/picture">
+                  <pic:nvPicPr>
+                    <pic:cNvPr id="1997615601" name="Obrázek 1" descr="Obsah obrázku text, snímek obrazovky, Písmo, číslo&#10;&#10;Obsah generovaný pomocí AI může být nesprávný."/>
+                    <pic:cNvPicPr/>
+                  </pic:nvPicPr>
+                  <pic:blipFill>
+                    <a:blip r:embed="rId9"/>
+                    <a:stretch>
+                      <a:fillRect/>
+                    </a:stretch>
+                  </pic:blipFill>
+                  <pic:spPr>
+                    <a:xfrm>
+                      <a:off x="0" y="0"/>
+                      <a:ext cx="5612130" cy="1282700"/>
+                    </a:xfrm>
+                    <a:prstGeom prst="rect">
+                      <a:avLst/>
+                    </a:prstGeom>
+                  </pic:spPr>
+                </pic:pic>
+              </a:graphicData>
+            </a:graphic>
+          </wp:inline>
+        </w:drawing>
+      </w:r>
+    </w:p>
+    <w:p>
+      <w:pPr>
+        <w:pStyle w:val="Titulek"/>
+      </w:pPr>
+      <w:r>
+        <w:t>Modely š</w:t>
+      </w:r>
+      <w:r>
+        <w:t>ip</w:t>
+      </w:r>
+      <w:r>
+        <w:t>ek</w:t>
+      </w:r>
+      <w:r>
+        <w:t xml:space="preserve"> určující</w:t>
+      </w:r>
+      <w:r>
+        <w:t>ch</w:t>
+      </w:r>
+      <w:r>
+        <w:t xml:space="preserve"> trasu</w:t>
+      </w:r>
+    </w:p>
+    <w:p>
+      <w:pPr>
+        <w:pStyle w:val="Nadpis2"/>
+        <w:rPr>
+          <w:lang w:val="cs-CZ"/>
+        </w:rPr>
+      </w:pPr>
+      <w:r>
+        <w:rPr>
+          <w:lang w:val="cs-CZ"/>
+        </w:rPr>
+        <w:t xml:space="preserve"> </w:t>
+      </w:r>
+      <w:bookmarkStart w:id="23" w:name="_Toc216029526"/>
+      <w:r>
+        <w:rPr>
+          <w:lang w:val="cs-CZ"/>
+        </w:rPr>
+        <w:t>Dopravní značky</w:t>
+      </w:r>
+      <w:bookmarkEnd w:id="23"/>
     </w:p>
     <w:p/>
     <w:p>
       <w:pPr>
         <w:pStyle w:val="Nadpis2"/>
-      </w:pPr>
-      <w:r>
+        <w:rPr>
+          <w:lang w:val="cs-CZ"/>
+        </w:rPr>
+      </w:pPr>
+      <w:r>
+        <w:rPr>
+          <w:lang w:val="cs-CZ"/>
+        </w:rPr>
         <w:t xml:space="preserve"> </w:t>
       </w:r>
-      <w:bookmarkStart w:id="10" w:name="_Toc216029513"/>
-      <w:r>
-        <w:t>Úroveň 2</w:t>
-      </w:r>
-      <w:bookmarkEnd w:id="10"/>
+      <w:bookmarkStart w:id="24" w:name="_Toc216029527"/>
+      <w:r>
+        <w:rPr>
+          <w:lang w:val="cs-CZ"/>
+        </w:rPr>
+        <w:t>Souhrn nesplněných dopravních předpisů</w:t>
+      </w:r>
+      <w:bookmarkEnd w:id="24"/>
     </w:p>
     <w:p/>
     <w:p>
       <w:pPr>
         <w:pStyle w:val="Nadpis2"/>
-      </w:pPr>
-      <w:r>
+        <w:rPr>
+          <w:lang w:val="cs-CZ"/>
+        </w:rPr>
+      </w:pPr>
+      <w:r>
+        <w:rPr>
+          <w:lang w:val="cs-CZ"/>
+        </w:rPr>
         <w:t xml:space="preserve"> </w:t>
       </w:r>
-      <w:bookmarkStart w:id="11" w:name="_Toc216029514"/>
-      <w:r>
-        <w:t>Úroveň 3</w:t>
-      </w:r>
-      <w:bookmarkEnd w:id="11"/>
-    </w:p>
-    <w:p/>
-    <w:p>
-      <w:pPr>
-        <w:pStyle w:val="Nadpis2"/>
-      </w:pPr>
-      <w:r>
-        <w:t xml:space="preserve"> </w:t>
-      </w:r>
-      <w:bookmarkStart w:id="12" w:name="_Toc216029515"/>
-      <w:r>
-        <w:t>Úroveň 4</w:t>
-      </w:r>
-      <w:bookmarkEnd w:id="12"/>
-    </w:p>
-    <w:p/>
-    <w:p>
-      <w:pPr>
-        <w:pStyle w:val="Nadpis2"/>
-      </w:pPr>
-      <w:r>
-        <w:t xml:space="preserve"> </w:t>
-      </w:r>
-      <w:bookmarkStart w:id="13" w:name="_Toc216029516"/>
-      <w:r>
-        <w:t>Úroveň 5</w:t>
-      </w:r>
-      <w:bookmarkEnd w:id="13"/>
-    </w:p>
-    <w:p/>
-    <w:p>
-      <w:pPr>
-        <w:spacing w:after="160" w:line="278" w:lineRule="auto"/>
-        <w:jc w:val="left"/>
-      </w:pPr>
-      <w:r>
-        <w:br w:type="page"/>
-      </w:r>
-    </w:p>
-    <w:p>
-      <w:pPr>
-        <w:pStyle w:val="Nadpis01"/>
+      <w:bookmarkStart w:id="25" w:name="_Toc216029528"/>
+      <w:r>
         <w:rPr>
           <w:lang w:val="cs-CZ"/>
         </w:rPr>
-      </w:pPr>
-      <w:r>
-        <w:rPr>
-          <w:lang w:val="cs-CZ"/>
-        </w:rPr>
-        <w:lastRenderedPageBreak/>
-        <w:t>Praktická část</w:t>
-      </w:r>
-    </w:p>
-    <w:p>
-      <w:pPr>
-        <w:pStyle w:val="Nadpis1"/>
-      </w:pPr>
-      <w:bookmarkStart w:id="14" w:name="_Toc216029517"/>
-      <w:r>
-        <w:t>Tvorba postavy</w:t>
-      </w:r>
-      <w:bookmarkEnd w:id="14"/>
-    </w:p>
-    <w:p/>
-    <w:p>
-      <w:pPr>
-        <w:pStyle w:val="Nadpis2"/>
-      </w:pPr>
-      <w:r>
-        <w:t xml:space="preserve"> </w:t>
-      </w:r>
-      <w:bookmarkStart w:id="15" w:name="_Toc216029518"/>
-      <w:r>
-        <w:t>Pohyb</w:t>
-      </w:r>
-      <w:bookmarkEnd w:id="15"/>
-    </w:p>
-    <w:p/>
-    <w:p>
-      <w:pPr>
-        <w:pStyle w:val="Nadpis1"/>
-      </w:pPr>
-      <w:bookmarkStart w:id="16" w:name="_Toc216029519"/>
-      <w:r>
-        <w:t>Kontrola dopravních předpisů</w:t>
-      </w:r>
-      <w:bookmarkEnd w:id="16"/>
-    </w:p>
-    <w:p/>
-    <w:p>
-      <w:pPr>
-        <w:pStyle w:val="Nadpis2"/>
-      </w:pPr>
-      <w:r>
-        <w:t xml:space="preserve"> </w:t>
-      </w:r>
-      <w:bookmarkStart w:id="17" w:name="_Toc216029520"/>
-      <w:r>
-        <w:t>Dopravní značky</w:t>
-      </w:r>
-      <w:bookmarkEnd w:id="17"/>
-    </w:p>
-    <w:p/>
-    <w:p>
-      <w:pPr>
-        <w:pStyle w:val="Nadpis2"/>
-      </w:pPr>
-      <w:bookmarkStart w:id="18" w:name="_Toc216029521"/>
-      <w:r>
-        <w:t>Rychlostní limit</w:t>
-      </w:r>
-      <w:bookmarkEnd w:id="18"/>
-    </w:p>
-    <w:p/>
-    <w:p>
-      <w:pPr>
-        <w:pStyle w:val="Nadpis2"/>
-      </w:pPr>
-      <w:r>
-        <w:t xml:space="preserve"> </w:t>
-      </w:r>
-      <w:bookmarkStart w:id="19" w:name="_Toc216029522"/>
-      <w:r>
-        <w:t>Kontrola přednosti</w:t>
-      </w:r>
-      <w:bookmarkEnd w:id="19"/>
-    </w:p>
-    <w:p/>
-    <w:p>
-      <w:pPr>
-        <w:pStyle w:val="Nadpis2"/>
-      </w:pPr>
-      <w:r>
-        <w:t xml:space="preserve"> </w:t>
-      </w:r>
-      <w:bookmarkStart w:id="20" w:name="_Toc216029523"/>
-      <w:r>
-        <w:t>Funkcionalita semaforů</w:t>
-      </w:r>
-      <w:bookmarkEnd w:id="20"/>
-    </w:p>
-    <w:p/>
-    <w:p>
-      <w:pPr>
-        <w:pStyle w:val="Nadpis1"/>
-      </w:pPr>
-      <w:bookmarkStart w:id="21" w:name="_Toc216029524"/>
-      <w:r>
-        <w:t>Grafická stránka hry</w:t>
-      </w:r>
-      <w:bookmarkEnd w:id="21"/>
-    </w:p>
-    <w:p/>
-    <w:p>
-      <w:pPr>
-        <w:pStyle w:val="Nadpis2"/>
-      </w:pPr>
-      <w:r>
-        <w:t xml:space="preserve"> </w:t>
-      </w:r>
-      <w:bookmarkStart w:id="22" w:name="_Toc216029525"/>
-      <w:r>
-        <w:t>Šipky určující směr jízdy</w:t>
-      </w:r>
-      <w:bookmarkEnd w:id="22"/>
-    </w:p>
-    <w:p/>
-    <w:p>
-      <w:pPr>
-        <w:pStyle w:val="Nadpis2"/>
-      </w:pPr>
-      <w:r>
-        <w:lastRenderedPageBreak/>
-        <w:t xml:space="preserve"> </w:t>
-      </w:r>
-      <w:bookmarkStart w:id="23" w:name="_Toc216029526"/>
-      <w:r>
-        <w:t>Dopravní značky</w:t>
-      </w:r>
-      <w:bookmarkEnd w:id="23"/>
-    </w:p>
-    <w:p/>
-    <w:p>
-      <w:pPr>
-        <w:pStyle w:val="Nadpis2"/>
-      </w:pPr>
-      <w:r>
-        <w:t xml:space="preserve"> </w:t>
-      </w:r>
-      <w:bookmarkStart w:id="24" w:name="_Toc216029527"/>
-      <w:r>
-        <w:t>Souhrn nesplněných dopravních předpisů</w:t>
-      </w:r>
-      <w:bookmarkEnd w:id="24"/>
-    </w:p>
-    <w:p/>
-    <w:p>
-      <w:pPr>
-        <w:pStyle w:val="Nadpis2"/>
-      </w:pPr>
-      <w:r>
-        <w:t xml:space="preserve"> </w:t>
-      </w:r>
-      <w:bookmarkStart w:id="25" w:name="_Toc216029528"/>
-      <w:r>
         <w:t>Materiály</w:t>
       </w:r>
       <w:bookmarkEnd w:id="25"/>
@@ -4110,7 +4228,7 @@
                     <pic:cNvPicPr/>
                   </pic:nvPicPr>
                   <pic:blipFill>
-                    <a:blip r:embed="rId9">
+                    <a:blip r:embed="rId10">
                       <a:extLst>
                         <a:ext uri="{28A0092B-C50C-407E-A947-70E740481C1C}">
                           <a14:useLocalDpi xmlns:a14="http://schemas.microsoft.com/office/drawing/2010/main" val="0"/>
@@ -4143,10 +4261,7 @@
       </w:pPr>
       <w:bookmarkStart w:id="26" w:name="_Toc215762693"/>
       <w:r>
-        <w:t>Nastavení</w:t>
-      </w:r>
-      <w:r>
-        <w:t xml:space="preserve"> průhledného materiálu</w:t>
+        <w:t>Nastavení průhledného materiálu</w:t>
       </w:r>
       <w:bookmarkEnd w:id="26"/>
     </w:p>
@@ -4175,8 +4290,15 @@
           <w:ilvl w:val="0"/>
           <w:numId w:val="0"/>
         </w:numPr>
-      </w:pPr>
-      <w:r>
+        <w:rPr>
+          <w:lang w:val="cs-CZ"/>
+        </w:rPr>
+      </w:pPr>
+      <w:r>
+        <w:rPr>
+          <w:lang w:val="cs-CZ"/>
+        </w:rPr>
+        <w:lastRenderedPageBreak/>
         <w:t>Závěr</w:t>
       </w:r>
     </w:p>
@@ -4196,8 +4318,14 @@
           <w:ilvl w:val="0"/>
           <w:numId w:val="0"/>
         </w:numPr>
-      </w:pPr>
-      <w:r>
+        <w:rPr>
+          <w:lang w:val="cs-CZ"/>
+        </w:rPr>
+      </w:pPr>
+      <w:r>
+        <w:rPr>
+          <w:lang w:val="cs-CZ"/>
+        </w:rPr>
         <w:lastRenderedPageBreak/>
         <w:t>Použitá literatura</w:t>
       </w:r>
@@ -4210,7 +4338,7 @@
       <w:r>
         <w:t xml:space="preserve">CITY CAR DRIVING. City Car Driving on Steam [online]. ©2024. Dostupné z: </w:t>
       </w:r>
-      <w:hyperlink r:id="rId10" w:tgtFrame="_new" w:history="1">
+      <w:hyperlink r:id="rId11" w:tgtFrame="_new" w:history="1">
         <w:r>
           <w:rPr>
             <w:rStyle w:val="Hypertextovodkaz"/>
@@ -4227,7 +4355,7 @@
       <w:r>
         <w:t xml:space="preserve">VIRTUAL DRIVING SCHOOL. Virtual Driving School on Steam [online]. ©2023. Dostupné z: </w:t>
       </w:r>
-      <w:hyperlink r:id="rId11" w:tgtFrame="_new" w:history="1">
+      <w:hyperlink r:id="rId12" w:tgtFrame="_new" w:history="1">
         <w:r>
           <w:rPr>
             <w:rStyle w:val="Hypertextovodkaz"/>
@@ -4252,8 +4380,14 @@
           <w:ilvl w:val="0"/>
           <w:numId w:val="0"/>
         </w:numPr>
-      </w:pPr>
-      <w:r>
+        <w:rPr>
+          <w:lang w:val="cs-CZ"/>
+        </w:rPr>
+      </w:pPr>
+      <w:r>
+        <w:rPr>
+          <w:lang w:val="cs-CZ"/>
+        </w:rPr>
         <w:lastRenderedPageBreak/>
         <w:t>Seznam příloh</w:t>
       </w:r>
@@ -4268,8 +4402,8 @@
       </w:pPr>
     </w:p>
     <w:sectPr>
-      <w:footerReference w:type="default" r:id="rId12"/>
-      <w:footerReference w:type="first" r:id="rId13"/>
+      <w:footerReference w:type="default" r:id="rId13"/>
+      <w:footerReference w:type="first" r:id="rId14"/>
       <w:footnotePr>
         <w:pos w:val="beneathText"/>
       </w:footnotePr>
@@ -4317,7 +4451,6 @@
         <w:docPartUnique/>
       </w:docPartObj>
     </w:sdtPr>
-    <w:sdtEndPr/>
     <w:sdtContent>
       <w:p>
         <w:pPr>
@@ -4360,7 +4493,6 @@
         <w:docPartUnique/>
       </w:docPartObj>
     </w:sdtPr>
-    <w:sdtEndPr/>
     <w:sdtContent>
       <w:p>
         <w:pPr>

</xml_diff>

<commit_message>
feat(documentation): Controll point 5
</commit_message>
<xml_diff>
--- a/Documents/IMP - Dokumentace.docx
+++ b/Documents/IMP - Dokumentace.docx
@@ -2,15 +2,6 @@
 <file path=word/document.xml><?xml version="1.0" encoding="utf-8"?>
 <w:document xmlns:wpc="http://schemas.microsoft.com/office/word/2010/wordprocessingCanvas" xmlns:cx="http://schemas.microsoft.com/office/drawing/2014/chartex" xmlns:cx1="http://schemas.microsoft.com/office/drawing/2015/9/8/chartex" xmlns:cx2="http://schemas.microsoft.com/office/drawing/2015/10/21/chartex" xmlns:cx3="http://schemas.microsoft.com/office/drawing/2016/5/9/chartex" xmlns:cx4="http://schemas.microsoft.com/office/drawing/2016/5/10/chartex" xmlns:cx5="http://schemas.microsoft.com/office/drawing/2016/5/11/chartex" xmlns:cx6="http://schemas.microsoft.com/office/drawing/2016/5/12/chartex" xmlns:cx7="http://schemas.microsoft.com/office/drawing/2016/5/13/chartex" xmlns:cx8="http://schemas.microsoft.com/office/drawing/2016/5/14/chartex" xmlns:mc="http://schemas.openxmlformats.org/markup-compatibility/2006" xmlns:aink="http://schemas.microsoft.com/office/drawing/2016/ink" xmlns:am3d="http://schemas.microsoft.com/office/drawing/2017/model3d" xmlns:o="urn:schemas-microsoft-com:office:office" xmlns:oel="http://schemas.microsoft.com/office/2019/extlst" xmlns:r="http://schemas.openxmlformats.org/officeDocument/2006/relationships" xmlns:m="http://schemas.openxmlformats.org/officeDocument/2006/math" xmlns:v="urn:schemas-microsoft-com:vml" xmlns:wp14="http://schemas.microsoft.com/office/word/2010/wordprocessingDrawing" xmlns:wp="http://schemas.openxmlformats.org/drawingml/2006/wordprocessingDrawing" xmlns:w10="urn:schemas-microsoft-com:office:word" xmlns:w="http://schemas.openxmlformats.org/wordprocessingml/2006/main" xmlns:w14="http://schemas.microsoft.com/office/word/2010/wordml" xmlns:w15="http://schemas.microsoft.com/office/word/2012/wordml" xmlns:w16cex="http://schemas.microsoft.com/office/word/2018/wordml/cex" xmlns:w16cid="http://schemas.microsoft.com/office/word/2016/wordml/cid" xmlns:w16="http://schemas.microsoft.com/office/word/2018/wordml" xmlns:w16du="http://schemas.microsoft.com/office/word/2023/wordml/word16du" xmlns:w16sdtdh="http://schemas.microsoft.com/office/word/2020/wordml/sdtdatahash" xmlns:w16sdtfl="http://schemas.microsoft.com/office/word/2024/wordml/sdtformatlock" xmlns:w16se="http://schemas.microsoft.com/office/word/2015/wordml/symex" xmlns:wpg="http://schemas.microsoft.com/office/word/2010/wordprocessingGroup" xmlns:wpi="http://schemas.microsoft.com/office/word/2010/wordprocessingInk" xmlns:wne="http://schemas.microsoft.com/office/word/2006/wordml" xmlns:wps="http://schemas.microsoft.com/office/word/2010/wordprocessingShape" mc:Ignorable="w14 w15 w16se w16cid w16 w16cex w16sdtdh w16sdtfl w16du wp14">
   <w:body>
-    <w:p>
-      <w:pPr>
-        <w:jc w:val="center"/>
-        <w:rPr>
-          <w:b/>
-          <w:bCs/>
-        </w:rPr>
-      </w:pPr>
-    </w:p>
     <w:p>
       <w:pPr>
         <w:jc w:val="center"/>
@@ -106,7 +97,6 @@
         <w:jc w:val="left"/>
       </w:pPr>
       <w:r>
-        <w:lastRenderedPageBreak/>
         <w:br w:type="page"/>
       </w:r>
     </w:p>
@@ -984,6 +974,9 @@
       </w:pPr>
       <w:r>
         <w:t>V Jičíně dne</w:t>
+      </w:r>
+      <w:r>
+        <w:t xml:space="preserve"> 15.3.2026</w:t>
       </w:r>
     </w:p>
     <w:p>
@@ -1855,19 +1848,7 @@
               <w:rPr>
                 <w:rStyle w:val="Hypertextovodkaz"/>
               </w:rPr>
-              <w:t>Úro</w:t>
-            </w:r>
-            <w:r>
-              <w:rPr>
-                <w:rStyle w:val="Hypertextovodkaz"/>
-              </w:rPr>
-              <w:t>v</w:t>
-            </w:r>
-            <w:r>
-              <w:rPr>
-                <w:rStyle w:val="Hypertextovodkaz"/>
-              </w:rPr>
-              <w:t>eň 2</w:t>
+              <w:t>Úroveň 2</w:t>
             </w:r>
             <w:r>
               <w:rPr>
@@ -3060,10 +3041,6 @@
     <w:p>
       <w:pPr>
         <w:pStyle w:val="Nadpis1"/>
-        <w:numPr>
-          <w:ilvl w:val="0"/>
-          <w:numId w:val="0"/>
-        </w:numPr>
         <w:rPr>
           <w:lang w:val="cs-CZ"/>
         </w:rPr>
@@ -3201,10 +3178,6 @@
     <w:p>
       <w:pPr>
         <w:pStyle w:val="Nadpis1"/>
-        <w:numPr>
-          <w:ilvl w:val="0"/>
-          <w:numId w:val="0"/>
-        </w:numPr>
         <w:rPr>
           <w:lang w:val="cs-CZ"/>
         </w:rPr>
@@ -3527,7 +3500,122 @@
         <w:t>Součástí předpisů jsou také pravidla pro jízdu v jízdních pruzích, správné předjíždění (které se ovšem čerstvě novým řidičům nedoporučuje) i objíždění překážek. Řidiči se musí řídit také pokyny policie nebo osob pověřených řízením dopravy, které mají vždy přednost před světelnými signály i dopravními značkami. Neméně důležitou oblastí je chování na železničních přejezdech, kde je povinnost zastavit při výstražných signálech a dbát zvýšené opatrnosti kvůli delší brzdné dráze vlaků. Jestliže železniční přejezd nemá bezpečnostní závory</w:t>
       </w:r>
       <w:r>
-        <w:t xml:space="preserve">, je třeba rozhlédnout se na obě strany kolejiště a po přesvědčení, že je situace bezpečná, pomalu přejet na druhou stranu kolejiště. </w:t>
+        <w:t xml:space="preserve">, je třeba rozhlédnout se na obě strany </w:t>
+      </w:r>
+      <w:r>
+        <w:t>přejezdu</w:t>
+      </w:r>
+      <w:r>
+        <w:t xml:space="preserve"> a po přesvědčení, že je situace bezpečná, pomalu přejet na druhou stranu </w:t>
+      </w:r>
+      <w:r>
+        <w:t>přejezdu</w:t>
+      </w:r>
+      <w:r>
+        <w:t>.</w:t>
+      </w:r>
+      <w:r>
+        <w:t xml:space="preserve"> Jako první implementuji do hry základní omezení rychlosti pro pohyb v obci. Maximální povolená rychlost v obci je nastavena na padesát kilometrů v hodině. Tato hodnota je nastavena z důvodu zvýšení bezpečnosti chodců a ostatních účastníků silničního provozu v obydlené oblasti. </w:t>
+      </w:r>
+      <w:r>
+        <w:t xml:space="preserve">Dále zavádím zákazovou dopravní značku </w:t>
+      </w:r>
+      <w:r>
+        <w:t xml:space="preserve">[3] </w:t>
+      </w:r>
+      <w:r>
+        <w:t>o maximální dovolené rychlosti 50 kilometrů v</w:t>
+      </w:r>
+      <w:r>
+        <w:t> </w:t>
+      </w:r>
+      <w:r>
+        <w:t xml:space="preserve">hodině, abychom nového hráče upozornili, že i toto pravidlo je ve hře zakomponované. Následně </w:t>
+      </w:r>
+      <w:r>
+        <w:t>zde používám příkazové dopravní</w:t>
+      </w:r>
+      <w:r>
+        <w:t xml:space="preserve"> [3]</w:t>
+      </w:r>
+      <w:r>
+        <w:t xml:space="preserve"> značky pro určení směru jízdy v případě, že by se hráč rozhodl jet </w:t>
+      </w:r>
+      <w:r>
+        <w:t>jinak</w:t>
+      </w:r>
+      <w:r>
+        <w:t xml:space="preserve"> než podle určených šipek. </w:t>
+      </w:r>
+      <w:r>
+        <w:t xml:space="preserve">Ve hře jsou použity značky typu Přikázaný směr jízdy vpravo a Přikázaný směr jízdy vlevo. </w:t>
+      </w:r>
+      <w:r>
+        <w:t xml:space="preserve">Zároveň slouží jako informativní </w:t>
+      </w:r>
+      <w:r>
+        <w:t>prvek,</w:t>
+      </w:r>
+      <w:r>
+        <w:t xml:space="preserve"> aby se hráč seznámil i s tímto typem značek, který je jinak stejně důležitý, jako typ zákazový. </w:t>
+      </w:r>
+      <w:r>
+        <w:t xml:space="preserve">Dále jsou zde zavedeny i informativní dopravní značky. [3] </w:t>
+      </w:r>
+      <w:r>
+        <w:t xml:space="preserve">Ty informují o dopravní situaci následující za touto značkou. Slouží například k účelu vyšší opatrnosti řidiče, ochrany před poškozením vlastního </w:t>
+      </w:r>
+      <w:r>
+        <w:t>vozidla</w:t>
+      </w:r>
+      <w:r>
+        <w:t xml:space="preserve"> nebo ochrany chodce na přechodu pro chodce. </w:t>
+      </w:r>
+      <w:r>
+        <w:t xml:space="preserve">Ve hře jsou obsaženy značky doporučující rychlost při přejezdu přes koleje, pro jisté přejetí kolejí bez poškození podvozku či jiných části automobilu. Následně je i zapojena značka Přechodu pro chodce, je-li zasněžený přechod nebo je jinak snížená viditelnost na vozovce, měl řidič čas zareagovat, předvídat možný vstup chodců na vozovku a případně zabrzdit svůj automobil. Ve hře </w:t>
+      </w:r>
+      <w:r>
+        <w:t>jsou obsaženy</w:t>
+      </w:r>
+      <w:r>
+        <w:t xml:space="preserve"> značky upravující přednost [3]</w:t>
+      </w:r>
+      <w:r>
+        <w:t>. Jedna z velice důležitých a základních značek je značka Hlavní pozemní komunikace. Tato značka určuje, který automobil se nachází na hlavní silnici a tím má přednostní právo pokračovat v jízdě. Při umístění u křižovatky se k této značce dodává i dodatková tabulka [3] informující řidiče, který automobil má přednostní právo pokračování v jízdě. V poslední řadě hra obsahuje semafory</w:t>
+      </w:r>
+      <w:r>
+        <w:t xml:space="preserve">, které fungují na principu světelných signálů. </w:t>
+      </w:r>
+      <w:r>
+        <w:t xml:space="preserve">Signály pro vozidla pro plynulost provozu zajištuje S1 Tříbarevná soustava s plnými signály.  </w:t>
+      </w:r>
+      <w:r>
+        <w:lastRenderedPageBreak/>
+        <w:t xml:space="preserve">[5] Červená barva značí </w:t>
+      </w:r>
+      <w:r>
+        <w:t>vozidlu,</w:t>
+      </w:r>
+      <w:r>
+        <w:t xml:space="preserve"> aby neprodleně zastavil vozidlo. Zelená dává pokyn pro </w:t>
+      </w:r>
+      <w:r>
+        <w:t xml:space="preserve">započetí jízdy do příslušného směru řidiče. </w:t>
+      </w:r>
+      <w:r>
+        <w:t xml:space="preserve">Oranžová </w:t>
+      </w:r>
+      <w:r>
+        <w:t xml:space="preserve">naopak </w:t>
+      </w:r>
+      <w:r>
+        <w:t xml:space="preserve">upozorňuje řidiče pro přípravu zastavení </w:t>
+      </w:r>
+      <w:r>
+        <w:t>vozidla,</w:t>
+      </w:r>
+      <w:r>
+        <w:t xml:space="preserve"> jelikož se brzy rozsvítí červené světlo.</w:t>
       </w:r>
     </w:p>
     <w:p>
@@ -3553,45 +3641,220 @@
           <w:lang w:val="cs-CZ"/>
         </w:rPr>
       </w:pPr>
+      <w:bookmarkStart w:id="5" w:name="_Toc216029508"/>
       <w:r>
         <w:rPr>
           <w:lang w:val="cs-CZ"/>
         </w:rPr>
+        <w:t>Unity</w:t>
+      </w:r>
+      <w:bookmarkEnd w:id="5"/>
+    </w:p>
+    <w:p>
+      <w:r>
+        <w:t xml:space="preserve">Unity je herní engine používaný pro tvorbu výhradně her, ale může být použit i pro jiné aplikace, simulátory či jiné programy. Umí úzce spolupracovat s programem Microsoft Visual Studio </w:t>
+      </w:r>
+      <w:r>
+        <w:t xml:space="preserve">2022 </w:t>
+      </w:r>
+      <w:r>
+        <w:t xml:space="preserve">pro vývoj logické části hry. </w:t>
+      </w:r>
+      <w:r>
+        <w:t>Nabízí</w:t>
+      </w:r>
+      <w:r>
+        <w:t xml:space="preserve"> však i grafické okno, kde lze vidět či upravovat grafické rozhraní. Lze pracovat s 2D, 3D </w:t>
+      </w:r>
+      <w:r>
+        <w:t>prostorem i vyvíjet programy pro virtuální či rozšířenou realitu kterou poté nahrajete do speciálních brýlí podporující tyto technologie.</w:t>
+      </w:r>
+      <w:r>
+        <w:t xml:space="preserve"> Osobně jsem tento engine využil pro tvorbu většinové části hry. </w:t>
+      </w:r>
+      <w:r>
+        <w:t>Používal jsem výhradně 3D objekty pro simulování reálného světa tak, jak ho vidíme a tím co nejblíže přiblížil hráče skutečné zkušenosti.</w:t>
+      </w:r>
+    </w:p>
+    <w:p>
+      <w:pPr>
+        <w:pStyle w:val="Nadpis2"/>
+        <w:rPr>
+          <w:lang w:val="cs-CZ"/>
+        </w:rPr>
+      </w:pPr>
+      <w:bookmarkStart w:id="6" w:name="_Toc216029509"/>
+      <w:r>
+        <w:rPr>
+          <w:lang w:val="cs-CZ"/>
+        </w:rPr>
+        <w:t>C#</w:t>
+      </w:r>
+      <w:bookmarkEnd w:id="6"/>
+    </w:p>
+    <w:p>
+      <w:r>
+        <w:t>C# je programový jazyk, který umožňuje programovat nejrůznější typy aplikací</w:t>
+      </w:r>
+      <w:r>
+        <w:t xml:space="preserve">. Nejvíce jsem tento jazyk využil v programu Microsoft Visual Studio 2022. Vyvinul jsem v tomto jazyce veškerou logiku hry, od kontroly dopravních předpisů po ovládání </w:t>
+      </w:r>
+      <w:r>
+        <w:t>auta hráče</w:t>
+      </w:r>
+      <w:r>
+        <w:t>. Kód lze snadno a přehledně vytvářet či upravovat.</w:t>
+      </w:r>
+    </w:p>
+    <w:p>
+      <w:pPr>
+        <w:pStyle w:val="Nadpis2"/>
+        <w:rPr>
+          <w:lang w:val="cs-CZ"/>
+        </w:rPr>
+      </w:pPr>
+      <w:r>
+        <w:rPr>
+          <w:lang w:val="cs-CZ"/>
+        </w:rPr>
+        <w:t>Tinkercad</w:t>
+      </w:r>
+    </w:p>
+    <w:p>
+      <w:r>
+        <w:t>Tinkecad je 3D modelový program od společnosti AutoCad výhradně využívaný pro tvorbu 3D modelů. Lze ho ale i využít pro tvorbu zapojení elektronických zařízení a programování kódu pro jednotlivé funkce či využití</w:t>
+      </w:r>
+      <w:r>
+        <w:t xml:space="preserve"> tzv.</w:t>
+      </w:r>
+      <w:r>
+        <w:t xml:space="preserve"> codeblocků podobným stylem</w:t>
+      </w:r>
+      <w:r>
+        <w:t>,</w:t>
+      </w:r>
+      <w:r>
+        <w:t xml:space="preserve"> jako v uživatelském prostředí Scratch. Tento program jsem využil pro tvorbu šipek ukazujících směr pro navigaci hráče pro dokončení levelu.</w:t>
+      </w:r>
+    </w:p>
+    <w:p>
+      <w:pPr>
+        <w:pStyle w:val="Nadpis2"/>
+        <w:rPr>
+          <w:lang w:val="cs-CZ"/>
+        </w:rPr>
+      </w:pPr>
+      <w:bookmarkStart w:id="7" w:name="_Toc216029510"/>
+      <w:r>
+        <w:rPr>
+          <w:lang w:val="cs-CZ"/>
+        </w:rPr>
+        <w:t>Blender</w:t>
+      </w:r>
+      <w:bookmarkEnd w:id="7"/>
+    </w:p>
+    <w:p>
+      <w:r>
+        <w:t>Blender je 3D modelový software</w:t>
+      </w:r>
+      <w:r>
+        <w:t xml:space="preserve"> vyvinutý společností Blender Foundation </w:t>
+      </w:r>
+      <w:r>
+        <w:t xml:space="preserve">využívaný pro tvorbu 3D objektů či animací. Mnoho tvůrců a firem ho také používá při tvorbě svých reklam které jsou následně vysílány na multimédiových platformách. Objekty lze následně exportovat do několika formátů včetně .obj nebo .svg pro laserovou přesnost například při </w:t>
+      </w:r>
+      <w:r>
+        <w:lastRenderedPageBreak/>
+        <w:t xml:space="preserve">výřezu tvaru. Tento program jsem využil pro změnu barvy šipek ukazujících směr, aby bylo zřejmé, že tyto šipky na silnici v běžném provozu nejsou. </w:t>
+      </w:r>
+    </w:p>
+    <w:p>
+      <w:pPr>
+        <w:pStyle w:val="Nadpis1"/>
+        <w:rPr>
+          <w:lang w:val="cs-CZ"/>
+        </w:rPr>
+      </w:pPr>
+      <w:bookmarkStart w:id="8" w:name="_Toc216029511"/>
+      <w:r>
+        <w:rPr>
+          <w:lang w:val="cs-CZ"/>
+        </w:rPr>
+        <w:t>Herní úrovně</w:t>
+      </w:r>
+      <w:bookmarkEnd w:id="8"/>
+    </w:p>
+    <w:p>
+      <w:r>
+        <w:t>Hra obsahuje 5 úrovní. V každé úrovni se obtížnost postupně zvyšuje a více přibližuje reálnému provozu ve světě. Hráč se zde</w:t>
+      </w:r>
+      <w:r>
+        <w:t xml:space="preserve"> například</w:t>
+      </w:r>
+      <w:r>
+        <w:t xml:space="preserve"> naučí ovládat auto, řídit se dopravními předpisy, určovat pořadí přednosti v</w:t>
+      </w:r>
+      <w:r>
+        <w:t> </w:t>
+      </w:r>
+      <w:r>
+        <w:t>jízdě</w:t>
+      </w:r>
+      <w:r>
+        <w:t xml:space="preserve">, přizpůsobit jízdu okolní situaci nebo </w:t>
+      </w:r>
+      <w:r>
+        <w:t>dát přednost chodci na přechodu pro chodce.</w:t>
+      </w:r>
+      <w:r>
         <w:t xml:space="preserve"> </w:t>
       </w:r>
-      <w:bookmarkStart w:id="5" w:name="_Toc216029508"/>
-      <w:r>
+    </w:p>
+    <w:p>
+      <w:pPr>
+        <w:pStyle w:val="Nadpis2"/>
         <w:rPr>
           <w:lang w:val="cs-CZ"/>
         </w:rPr>
-        <w:t>Unity</w:t>
-      </w:r>
-      <w:bookmarkEnd w:id="5"/>
-    </w:p>
-    <w:p>
-      <w:r>
-        <w:t xml:space="preserve">Unity je herní engine používaný pro tvorbu výhradně her, ale může být použit i pro jiné aplikace, simulátory či jiné programy. Umí úzce spolupracovat s programem Microsoft Visual Studio </w:t>
-      </w:r>
-      <w:r>
-        <w:t xml:space="preserve">2022 </w:t>
-      </w:r>
-      <w:r>
-        <w:t xml:space="preserve">pro vývoj logické části hry. </w:t>
-      </w:r>
-      <w:r>
-        <w:t>Nabízí</w:t>
-      </w:r>
-      <w:r>
-        <w:t xml:space="preserve"> však i grafické okno, kde lze vidět či upravovat grafické rozhraní. Lze pracovat s 2D, 3D </w:t>
-      </w:r>
-      <w:r>
-        <w:t>prostorem i vyvíjet programy pro virtuální či rozšířenou realitu kterou poté nahrajete do speciálních brýlí podporující tyto technologie.</w:t>
-      </w:r>
-      <w:r>
-        <w:t xml:space="preserve"> Osobně jsem tento engine využil pro tvorbu většinové části hry. </w:t>
-      </w:r>
-      <w:r>
-        <w:t xml:space="preserve">Používal jsem výhradně 3D objekty pro simulování reálného světa tak, jak ho vidíme a tím co nejblíže přiblížil hráče skutečné zkušenosti. </w:t>
+      </w:pPr>
+      <w:bookmarkStart w:id="9" w:name="_Toc216029512"/>
+      <w:r>
+        <w:rPr>
+          <w:lang w:val="cs-CZ"/>
+        </w:rPr>
+        <w:t>Úroveň 1</w:t>
+      </w:r>
+      <w:bookmarkEnd w:id="9"/>
+    </w:p>
+    <w:p>
+      <w:r>
+        <w:t xml:space="preserve">První úroveň je určena pro úplné začátečníky. Obsahuje nejzákladnější dopravní </w:t>
+      </w:r>
+      <w:proofErr w:type="gramStart"/>
+      <w:r>
+        <w:t>předpis</w:t>
+      </w:r>
+      <w:proofErr w:type="gramEnd"/>
+      <w:r>
+        <w:t xml:space="preserve"> kterým je maximální </w:t>
+      </w:r>
+      <w:r>
+        <w:t>povolen</w:t>
+      </w:r>
+      <w:r>
+        <w:t>á</w:t>
+      </w:r>
+      <w:r>
+        <w:t xml:space="preserve"> rychlost </w:t>
+      </w:r>
+      <w:r>
+        <w:t>(50km za hodinu). Také se hráči seznamují se jízdou v jízdním pruhu a zatáčením do jiných ulic bez nechtěného vjezdu do protisměru. Hráč má za úkol dojet a zaparkovat u nedalekého obchodu</w:t>
+      </w:r>
+      <w:r>
+        <w:t xml:space="preserve">, následně pokračovat podle směru jízdy šipek a </w:t>
+      </w:r>
+      <w:r>
+        <w:t>dokončit úroveň u určeného domu.</w:t>
       </w:r>
     </w:p>
     <w:p>
@@ -3601,27 +3864,137 @@
           <w:lang w:val="cs-CZ"/>
         </w:rPr>
       </w:pPr>
+      <w:bookmarkStart w:id="10" w:name="_Toc216029513"/>
       <w:r>
         <w:rPr>
           <w:lang w:val="cs-CZ"/>
         </w:rPr>
+        <w:t>Úroveň 2</w:t>
+      </w:r>
+      <w:bookmarkEnd w:id="10"/>
+    </w:p>
+    <w:p>
+      <w:r>
+        <w:t>Druhá úroveň</w:t>
+      </w:r>
+      <w:r>
+        <w:t xml:space="preserve"> představuje </w:t>
+      </w:r>
+      <w:r>
+        <w:t>pokročilejší jízdu po městě i přes les za městem. Obsahuje všechny kontrolní prvky z předchozí úrovně. J</w:t>
+      </w:r>
+      <w:r>
+        <w:t xml:space="preserve">e zde přidán přejezd přes </w:t>
+      </w:r>
+      <w:r>
+        <w:t>přejezd</w:t>
+      </w:r>
+      <w:r>
+        <w:t xml:space="preserve"> a informační zna</w:t>
+      </w:r>
+      <w:r>
+        <w:t xml:space="preserve">čka doporučujícící rychlost při přejezdu. Hráč má za úkol zaparkovat u nedalekého obchodu, vyjet z města k přejezdu v lese, přejet přes protisměr do obydlené ulice a zaparkovat u uvedeného domu. </w:t>
+      </w:r>
+    </w:p>
+    <w:p>
+      <w:pPr>
+        <w:pStyle w:val="Nadpis2"/>
+        <w:rPr>
+          <w:lang w:val="cs-CZ"/>
+        </w:rPr>
+      </w:pPr>
+      <w:bookmarkStart w:id="11" w:name="_Toc216029514"/>
+      <w:r>
+        <w:rPr>
+          <w:lang w:val="cs-CZ"/>
+        </w:rPr>
+        <w:t>Úroveň 3</w:t>
+      </w:r>
+      <w:bookmarkEnd w:id="11"/>
+    </w:p>
+    <w:p>
+      <w:r>
+        <w:t xml:space="preserve">Čtvrtá úroveň je jen lehce těžší než předešlá třetí úroveň. Jsou zde přidaní chodci, aby si hráč zvykl na jejich přítomnost a nebral je jako rušivý element při jízdě na silnici. Někteří </w:t>
+      </w:r>
+      <w:r>
+        <w:t>c</w:t>
+      </w:r>
+      <w:r>
+        <w:t>hodci přecházejí po přechodu pro chodce</w:t>
+      </w:r>
+      <w:r>
+        <w:t xml:space="preserve"> pro nasimulování této </w:t>
+      </w:r>
+      <w:proofErr w:type="gramStart"/>
+      <w:r>
+        <w:t>situace</w:t>
+      </w:r>
+      <w:proofErr w:type="gramEnd"/>
+      <w:r>
+        <w:t xml:space="preserve"> aby byli hráči připravení na tuto situaci. Taktéž jsou přidány značky pro seznámení hrače s hlavní a vedlejší silnicí.</w:t>
+      </w:r>
+    </w:p>
+    <w:p>
+      <w:pPr>
+        <w:pStyle w:val="Nadpis2"/>
+        <w:rPr>
+          <w:lang w:val="cs-CZ"/>
+        </w:rPr>
+      </w:pPr>
+      <w:bookmarkStart w:id="12" w:name="_Toc216029515"/>
+      <w:r>
+        <w:rPr>
+          <w:lang w:val="cs-CZ"/>
+        </w:rPr>
+        <w:t>Úroveň 4</w:t>
+      </w:r>
+      <w:bookmarkEnd w:id="12"/>
+    </w:p>
+    <w:p>
+      <w:r>
+        <w:t xml:space="preserve">Třetí úroveň zahrňuje přítomnost dalších řidičů na vozovce. Další řidiči jsou ovládáni umělou inteligencí zahrnutou v komponenty Nav Mesh, díky které se mohou objekty pohybovat. Řidiči taktéž dodržují všechny dopravní předpisy. V úrovni jsou zahrnuty všechny funkce </w:t>
+      </w:r>
+      <w:r>
+        <w:lastRenderedPageBreak/>
+        <w:t>z předešlých úrovní kromě chodců. Chodci jsou vynechaní, aby si hráč zvykl na další řidiče a jejich chování.</w:t>
+      </w:r>
+      <w:r>
         <w:t xml:space="preserve"> </w:t>
       </w:r>
-      <w:bookmarkStart w:id="6" w:name="_Toc216029509"/>
-      <w:r>
+    </w:p>
+    <w:p>
+      <w:pPr>
+        <w:pStyle w:val="Nadpis2"/>
         <w:rPr>
           <w:lang w:val="cs-CZ"/>
         </w:rPr>
-        <w:t>C#</w:t>
-      </w:r>
-      <w:bookmarkEnd w:id="6"/>
-    </w:p>
-    <w:p>
-      <w:r>
-        <w:t>C# je programový jazyk, který umožňuje programovat nejrůznější typy aplikací</w:t>
-      </w:r>
-      <w:r>
-        <w:t>. Nejvíce jsem tento jazyk využil v programu Microsoft Visual Studio 2022. Vyvinul jsem v tomto jazyce veškerou logiku hry, od kontroly dopravních předpisů po ovládání hráče auta. Kód lze snadno a přehledně vytvářet či upravovat.</w:t>
+      </w:pPr>
+      <w:bookmarkStart w:id="13" w:name="_Toc216029516"/>
+      <w:r>
+        <w:rPr>
+          <w:lang w:val="cs-CZ"/>
+        </w:rPr>
+        <w:t>Úroveň 5</w:t>
+      </w:r>
+      <w:bookmarkEnd w:id="13"/>
+    </w:p>
+    <w:p>
+      <w:r>
+        <w:t>Pátá úroveň je poslední a zároveň nejtěžší v této hře. Obsahuje chodce, další řidiče, rozhodování o přednosti jízdy a funkce z předešlých úrovní pro co nejlepěímu přiblížení situace silničnímu provozu v reálném provozu.</w:t>
+      </w:r>
+    </w:p>
+    <w:p>
+      <w:pPr>
+        <w:pStyle w:val="Nadpis01"/>
+        <w:rPr>
+          <w:lang w:val="cs-CZ"/>
+        </w:rPr>
+      </w:pPr>
+      <w:r>
+        <w:rPr>
+          <w:lang w:val="cs-CZ"/>
+        </w:rPr>
+        <w:t>Praktická část</w:t>
       </w:r>
     </w:p>
     <w:p>
@@ -3631,471 +4004,104 @@
           <w:lang w:val="cs-CZ"/>
         </w:rPr>
       </w:pPr>
+      <w:bookmarkStart w:id="14" w:name="_Toc216029518"/>
       <w:r>
         <w:rPr>
           <w:lang w:val="cs-CZ"/>
         </w:rPr>
-        <w:lastRenderedPageBreak/>
-        <w:t>Tinkercad</w:t>
-      </w:r>
-    </w:p>
-    <w:p>
-      <w:r>
-        <w:t>Tinkecad je 3D modelový program od společnosti AutoCad výhradně využívaný pro tvorbu 3D modelů. Lze ho ale i využít pro tvorbu zapojení elektronických zařízení a programování kódu pro jednotlivé funkce či využití</w:t>
-      </w:r>
-      <w:r>
-        <w:t xml:space="preserve"> tzv.</w:t>
-      </w:r>
-      <w:r>
-        <w:t xml:space="preserve"> codeblocků podobným stylem</w:t>
-      </w:r>
-      <w:r>
-        <w:t>,</w:t>
-      </w:r>
-      <w:r>
-        <w:t xml:space="preserve"> jako v uživatelském prostředí Scratch. Tento program jsem využil pro tvorbu šipek ukazujících směr pro navigaci hráče pro dokončení levelu.</w:t>
-      </w:r>
-    </w:p>
-    <w:p>
-      <w:pPr>
-        <w:pStyle w:val="Nadpis2"/>
+        <w:t>Pohyb</w:t>
+      </w:r>
+      <w:bookmarkEnd w:id="14"/>
+      <w:r>
         <w:rPr>
           <w:lang w:val="cs-CZ"/>
         </w:rPr>
-      </w:pPr>
-      <w:r>
-        <w:rPr>
-          <w:lang w:val="cs-CZ"/>
-        </w:rPr>
-        <w:t xml:space="preserve"> </w:t>
-      </w:r>
-      <w:bookmarkStart w:id="7" w:name="_Toc216029510"/>
-      <w:r>
-        <w:rPr>
-          <w:lang w:val="cs-CZ"/>
-        </w:rPr>
-        <w:t>Blender</w:t>
-      </w:r>
-      <w:bookmarkEnd w:id="7"/>
-    </w:p>
-    <w:p>
-      <w:r>
-        <w:t>Blender je 3D modelový software</w:t>
-      </w:r>
-      <w:r>
-        <w:t xml:space="preserve"> vyvinutý společností Blender Foundation </w:t>
-      </w:r>
-      <w:r>
-        <w:t xml:space="preserve">využívaný pro tvorbu 3D objektů či animací. Mnoho tvůrců a firem ho také používá při tvorbě svých reklam které jsou následně vysílány na multimédiových platformách. Objekty lze následně exportovat do několika formátů včetně .obj nebo .svg pro laserovou přesnost například při výřezu tvaru. Tento program jsem využil pro změnu barvy šipek ukazujících směr, aby bylo zřejmé, že tyto šipky na silnici v běžném provozu nejsou. </w:t>
-      </w:r>
-    </w:p>
-    <w:p>
-      <w:pPr>
-        <w:pStyle w:val="Nadpis1"/>
-        <w:rPr>
-          <w:lang w:val="cs-CZ"/>
-        </w:rPr>
-      </w:pPr>
-      <w:bookmarkStart w:id="8" w:name="_Toc216029511"/>
-      <w:r>
-        <w:rPr>
-          <w:lang w:val="cs-CZ"/>
-        </w:rPr>
-        <w:t>Herní úrovně</w:t>
-      </w:r>
-      <w:bookmarkEnd w:id="8"/>
-    </w:p>
-    <w:p>
-      <w:r>
-        <w:t>Hra obsahuje 5 úrovní. V každé úrovni se obtížnost postupně zvyšuje a více přibližuje reálnému provozu ve světě. Hráč se zde</w:t>
-      </w:r>
-      <w:r>
-        <w:t xml:space="preserve"> například</w:t>
-      </w:r>
-      <w:r>
-        <w:t xml:space="preserve"> naučí ovládat auto, řídit se dopravními předpisy, určovat pořadí přednosti v</w:t>
+        <w:t xml:space="preserve"> NPC postav</w:t>
+      </w:r>
+    </w:p>
+    <w:p>
+      <w:r>
+        <w:t xml:space="preserve">Pohyb NPC postav je založen na funkci NavMesh zabudovanou v Unity Editoru. Funkce NavMesh řídí </w:t>
+      </w:r>
+      <w:r>
+        <w:t xml:space="preserve">základní pohyb hráčem neovládaných postav. </w:t>
+      </w:r>
+      <w:r>
+        <w:t>Nejdříve vytvořím</w:t>
+      </w:r>
+      <w:r>
+        <w:t>e</w:t>
+      </w:r>
+      <w:r>
+        <w:t xml:space="preserve"> nové vrstvy Road a Sidewalk. </w:t>
+      </w:r>
+      <w:r>
+        <w:t xml:space="preserve">V hiearchii si také vytvoříme Empty </w:t>
+      </w:r>
+      <w:proofErr w:type="gramStart"/>
+      <w:r>
+        <w:t>object</w:t>
+      </w:r>
+      <w:proofErr w:type="gramEnd"/>
+      <w:r>
+        <w:t xml:space="preserve"> který pojmenujeme </w:t>
+      </w:r>
+      <w:r>
+        <w:t>Silnice,</w:t>
+      </w:r>
+      <w:r>
+        <w:t xml:space="preserve"> a všechny bloky silnice přesuneme pod tento objekt (aby byly všechny bloky silnice child objectem objectu </w:t>
+      </w:r>
+      <w:r>
+        <w:t>Silnice</w:t>
+      </w:r>
+      <w:r>
+        <w:t>). Toto děláme z důvodu přehlednosti v</w:t>
       </w:r>
       <w:r>
         <w:t> </w:t>
       </w:r>
       <w:r>
-        <w:t>jízdě</w:t>
-      </w:r>
-      <w:r>
-        <w:t xml:space="preserve">, přizpůsobit jízdu okolní situaci nebo </w:t>
-      </w:r>
-      <w:r>
-        <w:t>dát přednost chodci na přechodu pro chodce.</w:t>
-      </w:r>
-      <w:r>
-        <w:t xml:space="preserve"> </w:t>
-      </w:r>
-    </w:p>
-    <w:p>
-      <w:pPr>
-        <w:pStyle w:val="Nadpis2"/>
-        <w:rPr>
-          <w:lang w:val="cs-CZ"/>
-        </w:rPr>
-      </w:pPr>
-      <w:r>
-        <w:rPr>
-          <w:lang w:val="cs-CZ"/>
-        </w:rPr>
-        <w:t xml:space="preserve"> </w:t>
-      </w:r>
-      <w:bookmarkStart w:id="9" w:name="_Toc216029512"/>
-      <w:r>
-        <w:rPr>
-          <w:lang w:val="cs-CZ"/>
-        </w:rPr>
-        <w:t>Úroveň 1</w:t>
-      </w:r>
-      <w:bookmarkEnd w:id="9"/>
-    </w:p>
-    <w:p>
-      <w:r>
-        <w:t xml:space="preserve">První úroveň je určena pro úplné začátečníky. Obsahuje nejzákladnější dopravní </w:t>
-      </w:r>
-      <w:proofErr w:type="gramStart"/>
-      <w:r>
-        <w:t>předpis</w:t>
-      </w:r>
-      <w:proofErr w:type="gramEnd"/>
-      <w:r>
-        <w:t xml:space="preserve"> kterým je maximální </w:t>
-      </w:r>
-      <w:r>
-        <w:t>povolen</w:t>
-      </w:r>
-      <w:r>
-        <w:t>á</w:t>
-      </w:r>
-      <w:r>
-        <w:t xml:space="preserve"> rychlost </w:t>
-      </w:r>
-      <w:r>
-        <w:t>(50km za hodinu). Také se hráči seznamují se jízdou v jízdním pruhu a zatáčením do jiných ulic bez nechtěného vjezdu do protisměru. Hráč má za úkol dojet a zaparkovat u nedalekého obchodu</w:t>
-      </w:r>
-      <w:r>
-        <w:t xml:space="preserve">, následně pokračovat podle směru jízdy šipek a </w:t>
-      </w:r>
-      <w:r>
-        <w:t>dokončit úroveň u určeného domu.</w:t>
-      </w:r>
-    </w:p>
-    <w:p>
-      <w:pPr>
-        <w:pStyle w:val="Nadpis2"/>
-        <w:rPr>
-          <w:lang w:val="cs-CZ"/>
-        </w:rPr>
-      </w:pPr>
-      <w:r>
-        <w:rPr>
-          <w:lang w:val="cs-CZ"/>
-        </w:rPr>
-        <w:t xml:space="preserve"> </w:t>
-      </w:r>
-      <w:bookmarkStart w:id="10" w:name="_Toc216029513"/>
-      <w:r>
-        <w:rPr>
-          <w:lang w:val="cs-CZ"/>
-        </w:rPr>
-        <w:t>Úroveň 2</w:t>
-      </w:r>
-      <w:bookmarkEnd w:id="10"/>
-    </w:p>
-    <w:p>
-      <w:r>
-        <w:t>Druhá úroveň</w:t>
-      </w:r>
-      <w:r>
-        <w:t xml:space="preserve"> představuje </w:t>
-      </w:r>
-      <w:r>
-        <w:t>pokročilejší jízdu po městě i přes les za městem. Obsahuje všechny kontrolní prvky z předchozí úrovně. J</w:t>
-      </w:r>
-      <w:r>
-        <w:t>e zde přidán přejezd přes koleje a informační zna</w:t>
-      </w:r>
-      <w:r>
-        <w:t xml:space="preserve">čka doporučujícící rychlost při přejezdu. Hráč má za úkol zaparkovat u nedalekého obchodu, vyjet z města k přejezdu v lese, přejet přes protisměr do obydlené ulice a zaparkovat u uvedeného domu. </w:t>
-      </w:r>
-    </w:p>
-    <w:p>
-      <w:pPr>
-        <w:pStyle w:val="Nadpis2"/>
-        <w:rPr>
-          <w:lang w:val="cs-CZ"/>
-        </w:rPr>
-      </w:pPr>
-      <w:r>
-        <w:rPr>
-          <w:lang w:val="cs-CZ"/>
-        </w:rPr>
-        <w:lastRenderedPageBreak/>
-        <w:t xml:space="preserve"> </w:t>
-      </w:r>
-      <w:bookmarkStart w:id="11" w:name="_Toc216029514"/>
-      <w:r>
-        <w:rPr>
-          <w:lang w:val="cs-CZ"/>
-        </w:rPr>
-        <w:t>Úroveň 3</w:t>
-      </w:r>
-      <w:bookmarkEnd w:id="11"/>
-    </w:p>
-    <w:p>
-      <w:r>
-        <w:t xml:space="preserve">Čtvrtá úroveň je jen lehce těžší než předešlá třetí úroveň. Jsou zde přidaní chodci, aby si hráč zvykl na jejich přítomnost a nebral je jako rušivý element při jízdě na silnici. </w:t>
-      </w:r>
-      <w:r>
-        <w:t xml:space="preserve">Někteří </w:t>
-      </w:r>
-      <w:r>
-        <w:t>c</w:t>
-      </w:r>
-      <w:r>
-        <w:t>hodci přecházejí po přechodu pro chodce</w:t>
-      </w:r>
-      <w:r>
-        <w:t xml:space="preserve"> pro nasimulování této </w:t>
-      </w:r>
-      <w:proofErr w:type="gramStart"/>
-      <w:r>
-        <w:t>situace</w:t>
-      </w:r>
-      <w:proofErr w:type="gramEnd"/>
-      <w:r>
-        <w:t xml:space="preserve"> aby byli hráči připravení na tuto situaci. Taktéž jsou přidány značky pro seznámení hrače s hlavní a vedlejší silnicí.</w:t>
-      </w:r>
-    </w:p>
-    <w:p>
-      <w:pPr>
-        <w:pStyle w:val="Nadpis2"/>
-        <w:rPr>
-          <w:lang w:val="cs-CZ"/>
-        </w:rPr>
-      </w:pPr>
-      <w:r>
-        <w:rPr>
-          <w:lang w:val="cs-CZ"/>
-        </w:rPr>
-        <w:t xml:space="preserve"> </w:t>
-      </w:r>
-      <w:bookmarkStart w:id="12" w:name="_Toc216029515"/>
-      <w:r>
-        <w:rPr>
-          <w:lang w:val="cs-CZ"/>
-        </w:rPr>
-        <w:t>Úroveň 4</w:t>
-      </w:r>
-      <w:bookmarkEnd w:id="12"/>
-    </w:p>
-    <w:p>
-      <w:r>
-        <w:t>Třetí úroveň zahrňuje přítomnost dalších řidičů na vozovce. Další řidiči jsou ovládáni umělou inteligencí zahrnutou v komponenty Nav Mesh, díky které se mohou objekty pohybovat. Řidiči taktéž dodržují všechny dopravní předpisy</w:t>
+        <w:t>hiearchii</w:t>
+      </w:r>
+      <w:r>
+        <w:t xml:space="preserve"> a snadnější manipulací se silnicí v editoru</w:t>
+      </w:r>
+      <w:r>
+        <w:t xml:space="preserve">. </w:t>
+      </w:r>
+      <w:r>
+        <w:t>Poté si nastavíme všechny bloky silnice na</w:t>
+      </w:r>
+      <w:r>
+        <w:t xml:space="preserve">stavíme na vrstvu Road. To můžeme udělat tak, že označíme object </w:t>
+      </w:r>
+      <w:r>
+        <w:t>Silnice</w:t>
+      </w:r>
+      <w:r>
+        <w:t xml:space="preserve"> (parent object všech bloků silnice) a nastavíme jeho vrstvu na Road. </w:t>
+      </w:r>
+      <w:r>
+        <w:t>Zobrazí se</w:t>
+      </w:r>
+      <w:r>
+        <w:t xml:space="preserve"> nám dialogové okno, zda chceme změnit i vrstvu všech child objectů. </w:t>
+      </w:r>
+      <w:r>
+        <w:t>Zaškrtneme první vyznačenou možnost, tedy „Ano, změnit children“</w:t>
       </w:r>
       <w:r>
         <w:t>.</w:t>
       </w:r>
-      <w:r>
-        <w:t xml:space="preserve"> V úrovni jsou zahrnuty všechny funkce z předešlých úrovní kromě chodců. Chodci jsou </w:t>
-      </w:r>
-      <w:r>
-        <w:t>vynechaní,</w:t>
-      </w:r>
-      <w:r>
-        <w:t xml:space="preserve"> aby si hráč zvykl na další řidiče a jejich chování.</w:t>
-      </w:r>
-      <w:r>
-        <w:t xml:space="preserve"> </w:t>
-      </w:r>
-    </w:p>
-    <w:p>
-      <w:pPr>
-        <w:pStyle w:val="Nadpis2"/>
-        <w:rPr>
-          <w:lang w:val="cs-CZ"/>
-        </w:rPr>
-      </w:pPr>
-      <w:r>
-        <w:rPr>
-          <w:lang w:val="cs-CZ"/>
-        </w:rPr>
-        <w:t xml:space="preserve"> </w:t>
-      </w:r>
-      <w:bookmarkStart w:id="13" w:name="_Toc216029516"/>
-      <w:r>
-        <w:rPr>
-          <w:lang w:val="cs-CZ"/>
-        </w:rPr>
-        <w:t>Úroveň 5</w:t>
-      </w:r>
-      <w:bookmarkEnd w:id="13"/>
-    </w:p>
-    <w:p>
-      <w:r>
-        <w:t>Pátá úroveň je poslední a zároveň nejtěžší v této hře. Obsahuje chodce, další řidiče, rozhodování o přednosti jízdy a funkce z předešlých úrovní pro co nejlepěímu přiblížení situace silničnímu provozu v reálném provozu.</w:t>
-      </w:r>
-    </w:p>
-    <w:p>
-      <w:pPr>
-        <w:spacing w:after="160" w:line="278" w:lineRule="auto"/>
-        <w:jc w:val="left"/>
-      </w:pPr>
-      <w:r>
-        <w:br w:type="page"/>
-      </w:r>
-    </w:p>
-    <w:p>
-      <w:pPr>
-        <w:pStyle w:val="Nadpis01"/>
-        <w:rPr>
-          <w:lang w:val="cs-CZ"/>
-        </w:rPr>
-      </w:pPr>
-      <w:r>
-        <w:rPr>
-          <w:lang w:val="cs-CZ"/>
-        </w:rPr>
-        <w:lastRenderedPageBreak/>
-        <w:t>Praktická část</w:t>
-      </w:r>
-    </w:p>
-    <w:p>
-      <w:pPr>
-        <w:pStyle w:val="Nadpis1"/>
-        <w:rPr>
-          <w:lang w:val="cs-CZ"/>
-        </w:rPr>
-      </w:pPr>
-      <w:bookmarkStart w:id="14" w:name="_Toc216029517"/>
-      <w:r>
-        <w:rPr>
-          <w:lang w:val="cs-CZ"/>
-        </w:rPr>
-        <w:t>Tvorba postavy</w:t>
-      </w:r>
-      <w:bookmarkEnd w:id="14"/>
-    </w:p>
-    <w:p/>
-    <w:p>
-      <w:pPr>
-        <w:pStyle w:val="Nadpis2"/>
-        <w:rPr>
-          <w:lang w:val="cs-CZ"/>
-        </w:rPr>
-      </w:pPr>
-      <w:r>
-        <w:rPr>
-          <w:lang w:val="cs-CZ"/>
-        </w:rPr>
-        <w:t xml:space="preserve"> </w:t>
-      </w:r>
-      <w:bookmarkStart w:id="15" w:name="_Toc216029518"/>
-      <w:r>
-        <w:rPr>
-          <w:lang w:val="cs-CZ"/>
-        </w:rPr>
-        <w:t>Pohyb</w:t>
-      </w:r>
-      <w:bookmarkEnd w:id="15"/>
-    </w:p>
-    <w:p/>
-    <w:p>
-      <w:pPr>
-        <w:pStyle w:val="Nadpis1"/>
-        <w:rPr>
-          <w:lang w:val="cs-CZ"/>
-        </w:rPr>
-      </w:pPr>
-      <w:bookmarkStart w:id="16" w:name="_Toc216029519"/>
-      <w:r>
-        <w:rPr>
-          <w:lang w:val="cs-CZ"/>
-        </w:rPr>
-        <w:t>Kontrola dopravních předpisů</w:t>
-      </w:r>
-      <w:bookmarkEnd w:id="16"/>
-    </w:p>
-    <w:p>
-      <w:r>
-        <w:t xml:space="preserve">Zde uvádím, jak kontroluji dodržení či porušení dopravních předpisů. </w:t>
-      </w:r>
-    </w:p>
-    <w:p>
-      <w:pPr>
-        <w:pStyle w:val="Nadpis2"/>
-        <w:rPr>
-          <w:lang w:val="cs-CZ"/>
-        </w:rPr>
-      </w:pPr>
-      <w:r>
-        <w:rPr>
-          <w:lang w:val="cs-CZ"/>
-        </w:rPr>
-        <w:t xml:space="preserve"> </w:t>
-      </w:r>
-      <w:bookmarkStart w:id="17" w:name="_Toc216029520"/>
-      <w:r>
-        <w:rPr>
-          <w:lang w:val="cs-CZ"/>
-        </w:rPr>
-        <w:t>Dopravní značky</w:t>
-      </w:r>
-      <w:bookmarkEnd w:id="17"/>
-    </w:p>
-    <w:p>
-      <w:r>
-        <w:t xml:space="preserve">Dopravní značky jsou velice důležitou součástí </w:t>
-      </w:r>
-      <w:r>
-        <w:t>každodenního provozu na vozovce. Značky dělíme na několik kategorií. Ve hře jsou nejčastěji použité zákazové, příkazové a informativní.</w:t>
-      </w:r>
-    </w:p>
-    <w:p>
-      <w:pPr>
-        <w:pStyle w:val="Nadpis3"/>
-        <w:rPr>
-          <w:lang w:val="cs-CZ"/>
-        </w:rPr>
-      </w:pPr>
-      <w:r>
-        <w:rPr>
-          <w:lang w:val="cs-CZ"/>
-        </w:rPr>
-        <w:t>Zákazové dopravní značky</w:t>
-      </w:r>
-    </w:p>
-    <w:p>
-      <w:r>
-        <w:t xml:space="preserve">Zákazové dopravní značení má za úkol předejít nejvážnějším dopravním nehodám, které mohou v nejhorším případě končí smrtí. Za tímto důvodem se uvádí nejvyšší trest při jejich porušení nejen ve hře, ale i ve skutečném provozu. </w:t>
-      </w:r>
-      <w:r>
-        <w:t>Ve hře je použita značka určující maximální povolenou rychlost</w:t>
-      </w:r>
-      <w:r>
-        <w:t>.</w:t>
-      </w:r>
-      <w:r>
-        <w:t xml:space="preserve"> [3]</w:t>
-      </w:r>
-    </w:p>
-    <w:p>
-      <w:r>
-        <w:t xml:space="preserve"> </w:t>
-      </w:r>
-      <w:r>
-        <w:rPr>
-          <w:noProof/>
-        </w:rPr>
+    </w:p>
+    <w:p>
+      <w:r>
         <w:drawing>
-          <wp:inline distT="0" distB="0" distL="0" distR="0" wp14:anchorId="244236A8" wp14:editId="0EC96F02">
-            <wp:extent cx="1884460" cy="1884460"/>
-            <wp:effectExtent l="0" t="0" r="1905" b="1905"/>
-            <wp:docPr id="1369197728" name="Obrázek 1"/>
+          <wp:inline distT="0" distB="0" distL="0" distR="0" wp14:anchorId="5F944017" wp14:editId="18FA66E6">
+            <wp:extent cx="4172532" cy="1564698"/>
+            <wp:effectExtent l="0" t="0" r="0" b="0"/>
+            <wp:docPr id="631259981" name="Obrázek 1"/>
             <wp:cNvGraphicFramePr>
               <a:graphicFrameLocks xmlns:a="http://schemas.openxmlformats.org/drawingml/2006/main" noChangeAspect="1"/>
             </wp:cNvGraphicFramePr>
@@ -4103,7 +4109,7 @@
               <a:graphicData uri="http://schemas.openxmlformats.org/drawingml/2006/picture">
                 <pic:pic xmlns:pic="http://schemas.openxmlformats.org/drawingml/2006/picture">
                   <pic:nvPicPr>
-                    <pic:cNvPr id="1369197728" name="Obrázek 1369197728"/>
+                    <pic:cNvPr id="631259981" name="Obrázek 1"/>
                     <pic:cNvPicPr/>
                   </pic:nvPicPr>
                   <pic:blipFill>
@@ -4121,7 +4127,7 @@
                   <pic:spPr>
                     <a:xfrm>
                       <a:off x="0" y="0"/>
-                      <a:ext cx="1890411" cy="1890411"/>
+                      <a:ext cx="4172532" cy="1564698"/>
                     </a:xfrm>
                     <a:prstGeom prst="rect">
                       <a:avLst/>
@@ -4139,17 +4145,67 @@
         <w:pStyle w:val="Titulek"/>
       </w:pPr>
       <w:r>
-        <w:t>Nejvyšší dovolená rychlost 50km/h</w:t>
-      </w:r>
-    </w:p>
-    <w:p>
+        <w:t>Dialogové okno změny vrstvy</w:t>
+      </w:r>
+    </w:p>
+    <w:p>
+      <w:r>
+        <w:t xml:space="preserve">Poté si otevřu Navigation okno (záložka vedle inspectoru), kliknu na Areas a přidám si Sidewalk a Road. Ploše Sidewalk nastavím cenu 3 a ploše Road cenu 4. To proto, že NavMesh počítá a používá vždy nejkratší cestu k cíli. My taktéž chceme, aby chodci měli umožněno chodit přes </w:t>
+      </w:r>
+      <w:r>
+        <w:t>silnici,</w:t>
+      </w:r>
+      <w:r>
+        <w:t xml:space="preserve"> ale auta přes chodníky by jezdit neměli. Proto tato cena udává, kolik bude postavu stát cesta přes přechod na silnici a kolik použití pouze chodníku.</w:t>
+      </w:r>
+      <w:r>
+        <w:t xml:space="preserve"> Když už jsme v okně Navigation, vytvoříme a nastavíme si základní parametry NPC postav. Z Areas přepneme na Agents a zde už vidíme základní nastavení pohybu NPC. Nejdříve si </w:t>
+      </w:r>
       <w:r>
         <w:lastRenderedPageBreak/>
+        <w:t>přejmenujeme agenta na Car</w:t>
+      </w:r>
+      <w:r>
+        <w:t xml:space="preserve"> (Auto)</w:t>
+      </w:r>
+      <w:r>
+        <w:t xml:space="preserve">. </w:t>
+      </w:r>
+      <w:r>
+        <w:t>Nastavíme si Radius na šířku našeho auta, Height by měla odpovídat výšce auta, Step Height značí výšku, které může auto bez potíží vyjet. Takovýto Step znamená například výšku obrubníku</w:t>
+      </w:r>
+      <w:r>
+        <w:t>. V </w:t>
+      </w:r>
+      <w:r>
+        <w:t>poslední</w:t>
+      </w:r>
+      <w:r>
+        <w:t xml:space="preserve"> řadě si nastavíme Max Slope, který </w:t>
+      </w:r>
+      <w:r>
+        <w:t>značí,</w:t>
+      </w:r>
+      <w:r>
+        <w:t xml:space="preserve"> jaký úhel může auto vyjet a který už je přes jeho možnosti. A jelikož Drop Height i Jump Distance souvisí se skákáním (které my nepotřebujeme), necháme je na hodnotě 0. [</w:t>
+      </w:r>
+      <w:r>
+        <w:t>6</w:t>
+      </w:r>
+      <w:r>
+        <w:t>]</w:t>
+      </w:r>
+      <w:r>
+        <w:t xml:space="preserve"> Pomocí „pluska“ u Agent Types si vytvoříme dalšího agenta, kterého pojmenujeme Pedestrian (Chodec). A nastavíme podle podobných parametrů (přiměřenému chodci) jako u agenta typu Car. </w:t>
+      </w:r>
+    </w:p>
+    <w:p>
+      <w:r>
         <w:drawing>
-          <wp:inline distT="0" distB="0" distL="0" distR="0" wp14:anchorId="4B4B11D5" wp14:editId="578FE5F7">
-            <wp:extent cx="4420217" cy="1857634"/>
-            <wp:effectExtent l="0" t="0" r="0" b="9525"/>
-            <wp:docPr id="369330922" name="Obrázek 1" descr="Obsah obrázku text, snímek obrazovky, Písmo, řada/pruh&#10;&#10;Obsah generovaný pomocí AI může být nesprávný."/>
+          <wp:inline distT="0" distB="0" distL="0" distR="0" wp14:anchorId="04F1D7DB" wp14:editId="15289178">
+            <wp:extent cx="4353533" cy="4315427"/>
+            <wp:effectExtent l="0" t="0" r="9525" b="0"/>
+            <wp:docPr id="1520790049" name="Obrázek 1" descr="Obsah obrázku text, snímek obrazovky, software, diagram&#10;&#10;Obsah generovaný pomocí AI může být nesprávný."/>
             <wp:cNvGraphicFramePr>
               <a:graphicFrameLocks xmlns:a="http://schemas.openxmlformats.org/drawingml/2006/main" noChangeAspect="1"/>
             </wp:cNvGraphicFramePr>
@@ -4157,7 +4213,7 @@
               <a:graphicData uri="http://schemas.openxmlformats.org/drawingml/2006/picture">
                 <pic:pic xmlns:pic="http://schemas.openxmlformats.org/drawingml/2006/picture">
                   <pic:nvPicPr>
-                    <pic:cNvPr id="369330922" name="Obrázek 1" descr="Obsah obrázku text, snímek obrazovky, Písmo, řada/pruh&#10;&#10;Obsah generovaný pomocí AI může být nesprávný."/>
+                    <pic:cNvPr id="1520790049" name="Obrázek 1" descr="Obsah obrázku text, snímek obrazovky, software, diagram&#10;&#10;Obsah generovaný pomocí AI může být nesprávný."/>
                     <pic:cNvPicPr/>
                   </pic:nvPicPr>
                   <pic:blipFill>
@@ -4169,7 +4225,7 @@
                   <pic:spPr>
                     <a:xfrm>
                       <a:off x="0" y="0"/>
-                      <a:ext cx="4420217" cy="1857634"/>
+                      <a:ext cx="4353533" cy="4315427"/>
                     </a:xfrm>
                     <a:prstGeom prst="rect">
                       <a:avLst/>
@@ -4187,49 +4243,58 @@
         <w:pStyle w:val="Titulek"/>
       </w:pPr>
       <w:r>
-        <w:t>Kontrola dodržení nejvyšší dovolené rychlosti ve skriptu gameController</w:t>
-      </w:r>
-    </w:p>
-    <w:p>
-      <w:pPr>
-        <w:pStyle w:val="Nadpis3"/>
-        <w:rPr>
-          <w:lang w:val="cs-CZ"/>
-        </w:rPr>
-      </w:pPr>
-      <w:r>
-        <w:rPr>
-          <w:lang w:val="cs-CZ"/>
-        </w:rPr>
-        <w:t>Příkazové dopravní značky</w:t>
-      </w:r>
-    </w:p>
-    <w:p>
-      <w:r>
-        <w:rPr>
-          <w:noProof/>
-        </w:rPr>
+        <w:t>Nastavení agenta typu Car</w:t>
+      </w:r>
+    </w:p>
+    <w:p>
+      <w:r>
+        <w:t xml:space="preserve">Teď, když máme hotové definice agentů a ploch pohybu, můžeme je začít implementovat do mapy. </w:t>
+      </w:r>
+      <w:r>
+        <w:t xml:space="preserve">Nejprve jdeme implementovat NavMesh navigaci pro NPC auta. </w:t>
+      </w:r>
+      <w:r>
+        <w:t xml:space="preserve">Na </w:t>
+      </w:r>
+      <w:r>
+        <w:t>object</w:t>
+      </w:r>
+      <w:r>
+        <w:t xml:space="preserve"> Silnice (parent object pod kterým jsou všechny bloky silnice)</w:t>
+      </w:r>
+      <w:r>
+        <w:t xml:space="preserve"> přidám komponentu NavMesh Surface. </w:t>
+      </w:r>
+      <w:r>
+        <w:t xml:space="preserve">To je plocha, po které se může agent samostatně pohybovat. </w:t>
+      </w:r>
+      <w:r>
+        <w:t xml:space="preserve">V komponentně </w:t>
+      </w:r>
+      <w:r>
+        <w:t>nastavíme,</w:t>
+      </w:r>
+      <w:r>
+        <w:t xml:space="preserve"> pro jakého agenta bude surface platit</w:t>
+      </w:r>
+      <w:r>
+        <w:t xml:space="preserve"> a jeho výchozí area (v našem případě platí pro agenta Car výchozí area Road). </w:t>
+      </w:r>
+      <w:r>
+        <w:t>Jako poslední nastavíme Include Layers pouze na Road.</w:t>
+      </w:r>
+      <w:r>
+        <w:t xml:space="preserve"> A následně můžeme vytvořit plochu kliknutím na Bake (jako upéct koláček).</w:t>
+      </w:r>
+    </w:p>
+    <w:p>
+      <w:r>
+        <w:lastRenderedPageBreak/>
         <w:drawing>
-          <wp:anchor distT="0" distB="0" distL="114300" distR="114300" simplePos="0" relativeHeight="251659264" behindDoc="1" locked="0" layoutInCell="1" allowOverlap="1" wp14:anchorId="669F0590" wp14:editId="58A4A7CC">
-            <wp:simplePos x="0" y="0"/>
-            <wp:positionH relativeFrom="column">
-              <wp:posOffset>3393440</wp:posOffset>
-            </wp:positionH>
-            <wp:positionV relativeFrom="paragraph">
-              <wp:posOffset>1188582</wp:posOffset>
-            </wp:positionV>
-            <wp:extent cx="1591310" cy="1605915"/>
-            <wp:effectExtent l="0" t="0" r="8890" b="0"/>
-            <wp:wrapTight wrapText="bothSides">
-              <wp:wrapPolygon edited="0">
-                <wp:start x="0" y="0"/>
-                <wp:lineTo x="0" y="21267"/>
-                <wp:lineTo x="21462" y="21267"/>
-                <wp:lineTo x="21462" y="0"/>
-                <wp:lineTo x="0" y="0"/>
-              </wp:wrapPolygon>
-            </wp:wrapTight>
-            <wp:docPr id="444509186" name="Obrázek 3"/>
+          <wp:inline distT="0" distB="0" distL="0" distR="0" wp14:anchorId="78CA82D9" wp14:editId="1175436F">
+            <wp:extent cx="4315427" cy="4686954"/>
+            <wp:effectExtent l="0" t="0" r="9525" b="0"/>
+            <wp:docPr id="1883273757" name="Obrázek 1" descr="Obsah obrázku text, snímek obrazovky, software, číslo&#10;&#10;Obsah generovaný pomocí AI může být nesprávný."/>
             <wp:cNvGraphicFramePr>
               <a:graphicFrameLocks xmlns:a="http://schemas.openxmlformats.org/drawingml/2006/main" noChangeAspect="1"/>
             </wp:cNvGraphicFramePr>
@@ -4237,68 +4302,170 @@
               <a:graphicData uri="http://schemas.openxmlformats.org/drawingml/2006/picture">
                 <pic:pic xmlns:pic="http://schemas.openxmlformats.org/drawingml/2006/picture">
                   <pic:nvPicPr>
-                    <pic:cNvPr id="444509186" name="Obrázek 3"/>
+                    <pic:cNvPr id="1883273757" name="Obrázek 1" descr="Obsah obrázku text, snímek obrazovky, software, číslo&#10;&#10;Obsah generovaný pomocí AI může být nesprávný."/>
                     <pic:cNvPicPr/>
                   </pic:nvPicPr>
-                  <pic:blipFill rotWithShape="1">
-                    <a:blip r:embed="rId11" cstate="print">
-                      <a:extLst>
-                        <a:ext uri="{28A0092B-C50C-407E-A947-70E740481C1C}">
-                          <a14:useLocalDpi xmlns:a14="http://schemas.microsoft.com/office/drawing/2010/main" val="0"/>
-                        </a:ext>
-                      </a:extLst>
-                    </a:blip>
-                    <a:srcRect l="2201" t="2144" r="3133" b="4809"/>
+                  <pic:blipFill>
+                    <a:blip r:embed="rId11"/>
                     <a:stretch>
                       <a:fillRect/>
                     </a:stretch>
                   </pic:blipFill>
-                  <pic:spPr bwMode="auto">
+                  <pic:spPr>
                     <a:xfrm>
                       <a:off x="0" y="0"/>
-                      <a:ext cx="1591310" cy="1605915"/>
+                      <a:ext cx="4315427" cy="4686954"/>
                     </a:xfrm>
                     <a:prstGeom prst="rect">
                       <a:avLst/>
                     </a:prstGeom>
-                    <a:ln>
-                      <a:noFill/>
-                    </a:ln>
-                    <a:extLst>
-                      <a:ext uri="{53640926-AAD7-44D8-BBD7-CCE9431645EC}">
-                        <a14:shadowObscured xmlns:a14="http://schemas.microsoft.com/office/drawing/2010/main"/>
-                      </a:ext>
-                    </a:extLst>
                   </pic:spPr>
                 </pic:pic>
               </a:graphicData>
             </a:graphic>
-            <wp14:sizeRelH relativeFrom="margin">
-              <wp14:pctWidth>0</wp14:pctWidth>
-            </wp14:sizeRelH>
-            <wp14:sizeRelV relativeFrom="margin">
-              <wp14:pctHeight>0</wp14:pctHeight>
-            </wp14:sizeRelV>
-          </wp:anchor>
+          </wp:inline>
         </w:drawing>
       </w:r>
-      <w:r>
-        <w:rPr>
-          <w:noProof/>
-        </w:rPr>
+    </w:p>
+    <w:p>
+      <w:pPr>
+        <w:pStyle w:val="Titulek"/>
+      </w:pPr>
+      <w:r>
+        <w:t>Nastavení komponenty NavMesh Surface pro NPC aut</w:t>
+      </w:r>
+    </w:p>
+    <w:p>
+      <w:r>
+        <w:t xml:space="preserve">Můžeme i přidat object NavMesh Modifier Volume pomocí kterého upravujeme upečenou plochu pro náš AI navigační systém. Použijeme tento typ </w:t>
+      </w:r>
+      <w:proofErr w:type="gramStart"/>
+      <w:r>
+        <w:t>úpravy</w:t>
+      </w:r>
+      <w:proofErr w:type="gramEnd"/>
+      <w:r>
+        <w:t xml:space="preserve"> aby auta neměla tendenci si zkracovat cestu přes chodníky či jiné části Surface. V hiearchii si pravým kliknutím najdeme AI </w:t>
+      </w:r>
+      <w:r>
+        <w:sym w:font="Wingdings" w:char="F0E0"/>
+      </w:r>
+      <w:r>
+        <w:t xml:space="preserve"> NavMesh Modifier Volume, nastavíme si jeho velikost </w:t>
+      </w:r>
+      <w:r>
+        <w:t>(přes jakou plochu by auto nemělo jezdit), Area Type nastavíme jako Sidewalk (kam auto nemůže) a Affected Agents nastavíme Car.</w:t>
+      </w:r>
+      <w:r>
+        <w:t xml:space="preserve"> </w:t>
+      </w:r>
+      <w:r>
+        <w:t>Pro NPC chodce</w:t>
+      </w:r>
+      <w:r>
+        <w:t xml:space="preserve"> postupujeme stejně, jen místo agenta Car používáme Pedestrian a místo vrstvy Road použijeme Sidewalk.</w:t>
+      </w:r>
+    </w:p>
+    <w:p>
+      <w:pPr>
+        <w:spacing w:after="160" w:line="278" w:lineRule="auto"/>
+        <w:jc w:val="left"/>
+      </w:pPr>
+      <w:r>
+        <w:br w:type="page"/>
+      </w:r>
+    </w:p>
+    <w:p>
+      <w:pPr>
+        <w:pStyle w:val="Nadpis1"/>
+        <w:rPr>
+          <w:lang w:val="cs-CZ"/>
+        </w:rPr>
+      </w:pPr>
+      <w:bookmarkStart w:id="15" w:name="_Toc216029519"/>
+      <w:r>
+        <w:rPr>
+          <w:lang w:val="cs-CZ"/>
+        </w:rPr>
+        <w:lastRenderedPageBreak/>
+        <w:t>Kontrola dopravních předpisů</w:t>
+      </w:r>
+      <w:bookmarkEnd w:id="15"/>
+    </w:p>
+    <w:p>
+      <w:r>
+        <w:t>Zde uvádím, jak kontroluji dodržení či porušení dopravních předpisů</w:t>
+      </w:r>
+      <w:r>
+        <w:t xml:space="preserve"> ve hře</w:t>
+      </w:r>
+      <w:r>
+        <w:t xml:space="preserve">. </w:t>
+      </w:r>
+    </w:p>
+    <w:p>
+      <w:pPr>
+        <w:pStyle w:val="Nadpis2"/>
+        <w:rPr>
+          <w:lang w:val="cs-CZ"/>
+        </w:rPr>
+      </w:pPr>
+      <w:r>
+        <w:rPr>
+          <w:lang w:val="cs-CZ"/>
+        </w:rPr>
+        <w:t>Kontrolní válec</w:t>
+      </w:r>
+    </w:p>
+    <w:p>
+      <w:r>
+        <w:t xml:space="preserve">Kontrolní válec </w:t>
+      </w:r>
+      <w:r>
+        <w:t xml:space="preserve">je neviditelná složka na </w:t>
+      </w:r>
+      <w:proofErr w:type="gramStart"/>
+      <w:r>
+        <w:t>silnici</w:t>
+      </w:r>
+      <w:proofErr w:type="gramEnd"/>
+      <w:r>
+        <w:t xml:space="preserve"> která zaznamenává, od jakého místa začínají platit </w:t>
+      </w:r>
+      <w:r>
+        <w:t>určitá dopravní pravidla</w:t>
+      </w:r>
+      <w:r>
+        <w:t xml:space="preserve"> podle značky či semaforu poblíž válce. Má na sobě komponentu Box </w:t>
+      </w:r>
+      <w:proofErr w:type="gramStart"/>
+      <w:r>
+        <w:t>Collider</w:t>
+      </w:r>
+      <w:proofErr w:type="gramEnd"/>
+      <w:r>
+        <w:t xml:space="preserve"> u kterého je možné zapnout OnTrigger funkci. Box Collider (či obecně kterýkoliv Collider) má v</w:t>
+      </w:r>
+      <w:r>
+        <w:t>e výchozím nastavení použitelné</w:t>
+      </w:r>
+      <w:r>
+        <w:t xml:space="preserve"> 3 programové metody</w:t>
+      </w:r>
+      <w:r>
+        <w:t xml:space="preserve"> související s kolizí</w:t>
+      </w:r>
+      <w:r>
+        <w:t>: OnCollisionEnter, OnCollisionStay a OnCollisionExit.</w:t>
+      </w:r>
+    </w:p>
+    <w:p>
+      <w:r>
         <w:drawing>
-          <wp:anchor distT="0" distB="0" distL="114300" distR="114300" simplePos="0" relativeHeight="251658240" behindDoc="1" locked="0" layoutInCell="1" allowOverlap="1" wp14:anchorId="26BEDA44" wp14:editId="60939AC0">
-            <wp:simplePos x="0" y="0"/>
-            <wp:positionH relativeFrom="column">
-              <wp:posOffset>-1270</wp:posOffset>
-            </wp:positionH>
-            <wp:positionV relativeFrom="paragraph">
-              <wp:posOffset>1189273</wp:posOffset>
-            </wp:positionV>
-            <wp:extent cx="1605915" cy="1605915"/>
-            <wp:effectExtent l="0" t="0" r="0" b="0"/>
-            <wp:wrapTopAndBottom/>
-            <wp:docPr id="2032669946" name="Obrázek 2" descr="Obsah obrázku symbol, kruh, logo, Grafika&#10;&#10;Obsah generovaný pomocí AI může být nesprávný."/>
+          <wp:inline distT="0" distB="0" distL="0" distR="0" wp14:anchorId="5AA63273" wp14:editId="20418D72">
+            <wp:extent cx="5300283" cy="2525853"/>
+            <wp:effectExtent l="0" t="0" r="0" b="8255"/>
+            <wp:docPr id="411580549" name="Obrázek 1"/>
             <wp:cNvGraphicFramePr>
               <a:graphicFrameLocks xmlns:a="http://schemas.openxmlformats.org/drawingml/2006/main" noChangeAspect="1"/>
             </wp:cNvGraphicFramePr>
@@ -4306,7 +4473,7 @@
               <a:graphicData uri="http://schemas.openxmlformats.org/drawingml/2006/picture">
                 <pic:pic xmlns:pic="http://schemas.openxmlformats.org/drawingml/2006/picture">
                   <pic:nvPicPr>
-                    <pic:cNvPr id="2032669946" name="Obrázek 2" descr="Obsah obrázku symbol, kruh, logo, Grafika&#10;&#10;Obsah generovaný pomocí AI může být nesprávný."/>
+                    <pic:cNvPr id="411580549" name="Obrázek 1"/>
                     <pic:cNvPicPr/>
                   </pic:nvPicPr>
                   <pic:blipFill>
@@ -4324,7 +4491,7 @@
                   <pic:spPr>
                     <a:xfrm>
                       <a:off x="0" y="0"/>
-                      <a:ext cx="1605915" cy="1605915"/>
+                      <a:ext cx="5371012" cy="2559559"/>
                     </a:xfrm>
                     <a:prstGeom prst="rect">
                       <a:avLst/>
@@ -4333,15 +4500,209 @@
                 </pic:pic>
               </a:graphicData>
             </a:graphic>
-            <wp14:sizeRelH relativeFrom="margin">
-              <wp14:pctWidth>0</wp14:pctWidth>
-            </wp14:sizeRelH>
-            <wp14:sizeRelV relativeFrom="margin">
-              <wp14:pctHeight>0</wp14:pctHeight>
-            </wp14:sizeRelV>
-          </wp:anchor>
+          </wp:inline>
         </w:drawing>
       </w:r>
+    </w:p>
+    <w:p>
+      <w:pPr>
+        <w:pStyle w:val="Titulek"/>
+      </w:pPr>
+      <w:r>
+        <w:t xml:space="preserve">Popis kódového využití kolize objectu s jiným objectem </w:t>
+      </w:r>
+    </w:p>
+    <w:p>
+      <w:r>
+        <w:t>Poté tu máme I již zmíněné OnTrigger. OnTrigger funkce umožňuje mít 2 metody na kolizi a každá z nich dělá něco jiného, podle toho, který object s colliderem koliduje.</w:t>
+      </w:r>
+    </w:p>
+    <w:p>
+      <w:r>
+        <w:drawing>
+          <wp:inline distT="0" distB="0" distL="0" distR="0" wp14:anchorId="7E0BE744" wp14:editId="253A03E5">
+            <wp:extent cx="5339621" cy="1912244"/>
+            <wp:effectExtent l="0" t="0" r="0" b="0"/>
+            <wp:docPr id="44029478" name="Obrázek 1"/>
+            <wp:cNvGraphicFramePr>
+              <a:graphicFrameLocks xmlns:a="http://schemas.openxmlformats.org/drawingml/2006/main" noChangeAspect="1"/>
+            </wp:cNvGraphicFramePr>
+            <a:graphic xmlns:a="http://schemas.openxmlformats.org/drawingml/2006/main">
+              <a:graphicData uri="http://schemas.openxmlformats.org/drawingml/2006/picture">
+                <pic:pic xmlns:pic="http://schemas.openxmlformats.org/drawingml/2006/picture">
+                  <pic:nvPicPr>
+                    <pic:cNvPr id="44029478" name="Obrázek 1"/>
+                    <pic:cNvPicPr/>
+                  </pic:nvPicPr>
+                  <pic:blipFill>
+                    <a:blip r:embed="rId13">
+                      <a:extLst>
+                        <a:ext uri="{28A0092B-C50C-407E-A947-70E740481C1C}">
+                          <a14:useLocalDpi xmlns:a14="http://schemas.microsoft.com/office/drawing/2010/main" val="0"/>
+                        </a:ext>
+                      </a:extLst>
+                    </a:blip>
+                    <a:stretch>
+                      <a:fillRect/>
+                    </a:stretch>
+                  </pic:blipFill>
+                  <pic:spPr>
+                    <a:xfrm>
+                      <a:off x="0" y="0"/>
+                      <a:ext cx="5339621" cy="1912244"/>
+                    </a:xfrm>
+                    <a:prstGeom prst="rect">
+                      <a:avLst/>
+                    </a:prstGeom>
+                  </pic:spPr>
+                </pic:pic>
+              </a:graphicData>
+            </a:graphic>
+          </wp:inline>
+        </w:drawing>
+      </w:r>
+    </w:p>
+    <w:p>
+      <w:pPr>
+        <w:pStyle w:val="Titulek"/>
+      </w:pPr>
+      <w:r>
+        <w:t>Popis kódového využití funkce OnTrigger</w:t>
+      </w:r>
+    </w:p>
+    <w:p>
+      <w:pPr>
+        <w:pStyle w:val="Nadpis2"/>
+        <w:rPr>
+          <w:lang w:val="cs-CZ"/>
+        </w:rPr>
+      </w:pPr>
+      <w:bookmarkStart w:id="16" w:name="_Toc216029520"/>
+      <w:r>
+        <w:rPr>
+          <w:lang w:val="cs-CZ"/>
+        </w:rPr>
+        <w:lastRenderedPageBreak/>
+        <w:t>Dopravní značky</w:t>
+      </w:r>
+      <w:bookmarkEnd w:id="16"/>
+    </w:p>
+    <w:p>
+      <w:r>
+        <w:t xml:space="preserve">Dopravní značky jsou velice důležitou součástí </w:t>
+      </w:r>
+      <w:r>
+        <w:t>každodenního provozu na vozovce. Značky dělíme na několik kategorií. Ve hře jsou nejčastěji použité zákazové, příkazové a informativní.</w:t>
+      </w:r>
+    </w:p>
+    <w:p>
+      <w:pPr>
+        <w:pStyle w:val="Nadpis3"/>
+        <w:rPr>
+          <w:lang w:val="cs-CZ"/>
+        </w:rPr>
+      </w:pPr>
+      <w:r>
+        <w:rPr>
+          <w:lang w:val="cs-CZ"/>
+        </w:rPr>
+        <w:t>Zákazové dopravní značky</w:t>
+      </w:r>
+    </w:p>
+    <w:p>
+      <w:r>
+        <w:t xml:space="preserve">Zákazové dopravní značení má za úkol předejít nejvážnějším dopravním nehodám, které mohou v nejhorším případě končí smrtí. Za tímto důvodem se uvádí nejvyšší trest při jejich porušení nejen ve hře, ale i ve skutečném provozu. </w:t>
+      </w:r>
+      <w:r>
+        <w:t>Ve hře je použita značka určující maximální povolenou rychlost</w:t>
+      </w:r>
+      <w:r>
+        <w:t>.</w:t>
+      </w:r>
+      <w:r>
+        <w:t xml:space="preserve"> [3]</w:t>
+      </w:r>
+      <w:r>
+        <w:t xml:space="preserve"> Tato značka je kontrolována neviditelným válcem na silnici. Tento válec zaznamená kolizi s autem hráče a nastaví mu maximální povolenou rychlost. Jestliže je jeho současná rychlost vyšší než maximální nastavená, hráč selže a musí celou úroveň znovu opakovat.</w:t>
+      </w:r>
+    </w:p>
+    <w:p>
+      <w:r>
+        <w:drawing>
+          <wp:inline distT="0" distB="0" distL="0" distR="0" wp14:anchorId="103E08E1" wp14:editId="41E78A5B">
+            <wp:extent cx="4009524" cy="2714286"/>
+            <wp:effectExtent l="0" t="0" r="0" b="0"/>
+            <wp:docPr id="250833693" name="Obrázek 1" descr="Obsah obrázku snímek obrazovky, řada/pruh&#10;&#10;Obsah generovaný pomocí AI může být nesprávný."/>
+            <wp:cNvGraphicFramePr>
+              <a:graphicFrameLocks xmlns:a="http://schemas.openxmlformats.org/drawingml/2006/main" noChangeAspect="1"/>
+            </wp:cNvGraphicFramePr>
+            <a:graphic xmlns:a="http://schemas.openxmlformats.org/drawingml/2006/main">
+              <a:graphicData uri="http://schemas.openxmlformats.org/drawingml/2006/picture">
+                <pic:pic xmlns:pic="http://schemas.openxmlformats.org/drawingml/2006/picture">
+                  <pic:nvPicPr>
+                    <pic:cNvPr id="250833693" name="Obrázek 1" descr="Obsah obrázku snímek obrazovky, řada/pruh&#10;&#10;Obsah generovaný pomocí AI může být nesprávný."/>
+                    <pic:cNvPicPr/>
+                  </pic:nvPicPr>
+                  <pic:blipFill>
+                    <a:blip r:embed="rId14"/>
+                    <a:stretch>
+                      <a:fillRect/>
+                    </a:stretch>
+                  </pic:blipFill>
+                  <pic:spPr>
+                    <a:xfrm>
+                      <a:off x="0" y="0"/>
+                      <a:ext cx="4009524" cy="2714286"/>
+                    </a:xfrm>
+                    <a:prstGeom prst="rect">
+                      <a:avLst/>
+                    </a:prstGeom>
+                  </pic:spPr>
+                </pic:pic>
+              </a:graphicData>
+            </a:graphic>
+          </wp:inline>
+        </w:drawing>
+      </w:r>
+    </w:p>
+    <w:p>
+      <w:pPr>
+        <w:pStyle w:val="Titulek"/>
+      </w:pPr>
+      <w:r>
+        <w:t xml:space="preserve">Neviditelný </w:t>
+      </w:r>
+      <w:r>
+        <w:t xml:space="preserve">kontrolní </w:t>
+      </w:r>
+      <w:r>
+        <w:t>válec s lampou a zákazovou značkou</w:t>
+      </w:r>
+    </w:p>
+    <w:p>
+      <w:pPr>
+        <w:pStyle w:val="Titulek"/>
+        <w:numPr>
+          <w:ilvl w:val="0"/>
+          <w:numId w:val="0"/>
+        </w:numPr>
+      </w:pPr>
+    </w:p>
+    <w:p>
+      <w:pPr>
+        <w:pStyle w:val="Nadpis3"/>
+        <w:rPr>
+          <w:lang w:val="cs-CZ"/>
+        </w:rPr>
+      </w:pPr>
+      <w:r>
+        <w:rPr>
+          <w:lang w:val="cs-CZ"/>
+        </w:rPr>
+        <w:t>Příkazové dopravní značky</w:t>
+      </w:r>
+    </w:p>
+    <w:p>
       <w:r>
         <w:t xml:space="preserve">Příkazové dopravní značky jsou méně používané, zato stejně důležité, jako výše uvedené zákazové. </w:t>
       </w:r>
@@ -4357,67 +4718,375 @@
       <w:r>
         <w:t xml:space="preserve"> [3]</w:t>
       </w:r>
-    </w:p>
-    <w:p/>
+      <w:r>
+        <w:t xml:space="preserve"> Kontrolu provádíme na základě kódu</w:t>
+      </w:r>
+      <w:r>
+        <w:t>. S</w:t>
+      </w:r>
+      <w:r>
+        <w:t>oustředíme</w:t>
+      </w:r>
+      <w:r>
+        <w:t xml:space="preserve"> se, zda hráč přejel kontrolní neviditelný válec a jestliže ano</w:t>
+      </w:r>
+      <w:r>
+        <w:t>, je-li hráč na určeném bloku silnice a jeho rotace j</w:t>
+      </w:r>
+      <w:r>
+        <w:t xml:space="preserve">e </w:t>
+      </w:r>
+      <w:r>
+        <w:lastRenderedPageBreak/>
+        <w:t xml:space="preserve">v souladu se směrem příkazové značky. Jestliže jel hráč jiným </w:t>
+      </w:r>
+      <w:proofErr w:type="gramStart"/>
+      <w:r>
+        <w:t>směrem</w:t>
+      </w:r>
+      <w:proofErr w:type="gramEnd"/>
+      <w:r>
+        <w:t xml:space="preserve"> než mu příkazová značka přikázala, hráč úroveň nedokončil a musí začít úroveň znovu. (Zatím není implementováno ve hře)</w:t>
+      </w:r>
+    </w:p>
+    <w:p>
+      <w:r>
+        <w:drawing>
+          <wp:inline distT="0" distB="0" distL="0" distR="0" wp14:anchorId="755BEEDF" wp14:editId="38F82424">
+            <wp:extent cx="1246173" cy="1246173"/>
+            <wp:effectExtent l="0" t="0" r="0" b="0"/>
+            <wp:docPr id="1670262107" name="Obrázek 2" descr="Obsah obrázku symbol, kruh, logo, Grafika&#10;&#10;Obsah generovaný pomocí AI může být nesprávný."/>
+            <wp:cNvGraphicFramePr>
+              <a:graphicFrameLocks xmlns:a="http://schemas.openxmlformats.org/drawingml/2006/main" noChangeAspect="1"/>
+            </wp:cNvGraphicFramePr>
+            <a:graphic xmlns:a="http://schemas.openxmlformats.org/drawingml/2006/main">
+              <a:graphicData uri="http://schemas.openxmlformats.org/drawingml/2006/picture">
+                <pic:pic xmlns:pic="http://schemas.openxmlformats.org/drawingml/2006/picture">
+                  <pic:nvPicPr>
+                    <pic:cNvPr id="2032669946" name="Obrázek 2" descr="Obsah obrázku symbol, kruh, logo, Grafika&#10;&#10;Obsah generovaný pomocí AI může být nesprávný."/>
+                    <pic:cNvPicPr/>
+                  </pic:nvPicPr>
+                  <pic:blipFill>
+                    <a:blip r:embed="rId15" cstate="print">
+                      <a:extLst>
+                        <a:ext uri="{28A0092B-C50C-407E-A947-70E740481C1C}">
+                          <a14:useLocalDpi xmlns:a14="http://schemas.microsoft.com/office/drawing/2010/main" val="0"/>
+                        </a:ext>
+                      </a:extLst>
+                    </a:blip>
+                    <a:stretch>
+                      <a:fillRect/>
+                    </a:stretch>
+                  </pic:blipFill>
+                  <pic:spPr>
+                    <a:xfrm>
+                      <a:off x="0" y="0"/>
+                      <a:ext cx="1251894" cy="1251894"/>
+                    </a:xfrm>
+                    <a:prstGeom prst="rect">
+                      <a:avLst/>
+                    </a:prstGeom>
+                  </pic:spPr>
+                </pic:pic>
+              </a:graphicData>
+            </a:graphic>
+          </wp:inline>
+        </w:drawing>
+      </w:r>
+    </w:p>
     <w:p>
       <w:pPr>
         <w:pStyle w:val="Titulek"/>
-      </w:pPr>
+        <w:rPr>
+          <w:b/>
+          <w:bCs/>
+        </w:rPr>
+      </w:pPr>
+      <w:r>
+        <w:t xml:space="preserve">Dopravní značka </w:t>
+      </w:r>
       <w:r>
         <w:t>Přikázaný směr jízdy vlevo zde</w:t>
       </w:r>
     </w:p>
     <w:p>
       <w:pPr>
+        <w:pStyle w:val="Nadpis3"/>
+        <w:rPr>
+          <w:lang w:val="cs-CZ"/>
+        </w:rPr>
+      </w:pPr>
+      <w:r>
+        <w:rPr>
+          <w:lang w:val="cs-CZ"/>
+        </w:rPr>
+        <w:t>Informativní dopravní značky</w:t>
+      </w:r>
+    </w:p>
+    <w:p>
+      <w:r>
+        <w:t>Informativní dopravní značky informují o dopravní situaci následující za touto značkou</w:t>
+      </w:r>
+      <w:r>
+        <w:t xml:space="preserve">, v některých případech značky mění nejvyšší dovolenou rychlost, kterou je třeba znát a dodržovat. Do této kategorie patří například značka obytné zóny stanovující nejvyšší dovolenou rychlost 20km/h pro případ nečekaného vchodu chodce na vozovku a zajištění dostatek času pro reakci řidiče. </w:t>
+      </w:r>
+      <w:r>
+        <w:t>Tato značka kontroluje rychlost od doby dotknutí hráče neviditelného válce, tím změní jeho maximální povolenou rychlost (speed limit) na 20 kilometrů v hodině kterou musí po celou dobu dodržovat až po přejetí konrolního válce připojeného na značku ukončující platnost této značky. (Zatím není implementováno ve hře)</w:t>
+      </w:r>
+    </w:p>
+    <w:p>
+      <w:r>
+        <w:drawing>
+          <wp:inline distT="0" distB="0" distL="0" distR="0" wp14:anchorId="1C3A2753" wp14:editId="5F2564F4">
+            <wp:extent cx="1270450" cy="1282111"/>
+            <wp:effectExtent l="0" t="0" r="6350" b="0"/>
+            <wp:docPr id="1475167936" name="Obrázek 3" descr="Obsah obrázku symbol, číslo, Písmo, snímek obrazovky&#10;&#10;Obsah generovaný pomocí AI může být nesprávný."/>
+            <wp:cNvGraphicFramePr>
+              <a:graphicFrameLocks xmlns:a="http://schemas.openxmlformats.org/drawingml/2006/main" noChangeAspect="1"/>
+            </wp:cNvGraphicFramePr>
+            <a:graphic xmlns:a="http://schemas.openxmlformats.org/drawingml/2006/main">
+              <a:graphicData uri="http://schemas.openxmlformats.org/drawingml/2006/picture">
+                <pic:pic xmlns:pic="http://schemas.openxmlformats.org/drawingml/2006/picture">
+                  <pic:nvPicPr>
+                    <pic:cNvPr id="1475167936" name="Obrázek 3" descr="Obsah obrázku symbol, číslo, Písmo, snímek obrazovky&#10;&#10;Obsah generovaný pomocí AI může být nesprávný."/>
+                    <pic:cNvPicPr/>
+                  </pic:nvPicPr>
+                  <pic:blipFill rotWithShape="1">
+                    <a:blip r:embed="rId16" cstate="print">
+                      <a:extLst>
+                        <a:ext uri="{28A0092B-C50C-407E-A947-70E740481C1C}">
+                          <a14:useLocalDpi xmlns:a14="http://schemas.microsoft.com/office/drawing/2010/main" val="0"/>
+                        </a:ext>
+                      </a:extLst>
+                    </a:blip>
+                    <a:srcRect l="2201" t="2144" r="3133" b="4809"/>
+                    <a:stretch>
+                      <a:fillRect/>
+                    </a:stretch>
+                  </pic:blipFill>
+                  <pic:spPr bwMode="auto">
+                    <a:xfrm>
+                      <a:off x="0" y="0"/>
+                      <a:ext cx="1283863" cy="1295647"/>
+                    </a:xfrm>
+                    <a:prstGeom prst="rect">
+                      <a:avLst/>
+                    </a:prstGeom>
+                    <a:ln>
+                      <a:noFill/>
+                    </a:ln>
+                    <a:extLst>
+                      <a:ext uri="{53640926-AAD7-44D8-BBD7-CCE9431645EC}">
+                        <a14:shadowObscured xmlns:a14="http://schemas.microsoft.com/office/drawing/2010/main"/>
+                      </a:ext>
+                    </a:extLst>
+                  </pic:spPr>
+                </pic:pic>
+              </a:graphicData>
+            </a:graphic>
+          </wp:inline>
+        </w:drawing>
+      </w:r>
+    </w:p>
+    <w:p>
+      <w:pPr>
         <w:pStyle w:val="Titulek"/>
       </w:pPr>
       <w:r>
         <w:t>Nejnižší dovolená rychlost 20km/h</w:t>
       </w:r>
-      <w:r>
-        <w:t xml:space="preserve"> (chtěl bych dát pod </w:t>
+    </w:p>
+    <w:p>
+      <w:pPr>
+        <w:pStyle w:val="Nadpis2"/>
+        <w:rPr>
+          <w:lang w:val="cs-CZ"/>
+        </w:rPr>
+      </w:pPr>
+      <w:bookmarkStart w:id="17" w:name="_Toc216029521"/>
+      <w:r>
+        <w:rPr>
+          <w:lang w:val="cs-CZ"/>
+        </w:rPr>
+        <w:t>Rychlostní limit</w:t>
+      </w:r>
+      <w:bookmarkEnd w:id="17"/>
+    </w:p>
+    <w:p>
+      <w:r>
+        <w:t>Kontrolu rychlosti stanovuje</w:t>
+      </w:r>
+      <w:r>
+        <w:t xml:space="preserve"> neviditelný</w:t>
+      </w:r>
+      <w:r>
+        <w:t xml:space="preserve"> objekt, který</w:t>
+      </w:r>
+      <w:r>
+        <w:t xml:space="preserve"> po přejezdu hráčem nastaví maximální povolenou rychlost na 50 km v hodině. Hlavní skript, který počítá rychlost hráče, </w:t>
+      </w:r>
+      <w:r>
+        <w:t>neustále kontroluje, zda rychlost hráče je vyšší, než je maximální povolená rychlost.</w:t>
+      </w:r>
+      <w:r>
+        <w:t xml:space="preserve"> </w:t>
+      </w:r>
+    </w:p>
+    <w:p>
+      <w:r>
+        <w:lastRenderedPageBreak/>
+        <w:drawing>
+          <wp:inline distT="0" distB="0" distL="0" distR="0" wp14:anchorId="6CC9EB13" wp14:editId="194C1E1B">
+            <wp:extent cx="4419600" cy="1444681"/>
+            <wp:effectExtent l="0" t="0" r="0" b="3175"/>
+            <wp:docPr id="516231327" name="Obrázek 1" descr="Obsah obrázku text, snímek obrazovky, Písmo, řada/pruh&#10;&#10;Obsah generovaný pomocí AI může být nesprávný."/>
+            <wp:cNvGraphicFramePr>
+              <a:graphicFrameLocks xmlns:a="http://schemas.openxmlformats.org/drawingml/2006/main" noChangeAspect="1"/>
+            </wp:cNvGraphicFramePr>
+            <a:graphic xmlns:a="http://schemas.openxmlformats.org/drawingml/2006/main">
+              <a:graphicData uri="http://schemas.openxmlformats.org/drawingml/2006/picture">
+                <pic:pic xmlns:pic="http://schemas.openxmlformats.org/drawingml/2006/picture">
+                  <pic:nvPicPr>
+                    <pic:cNvPr id="369330922" name="Obrázek 1" descr="Obsah obrázku text, snímek obrazovky, Písmo, řada/pruh&#10;&#10;Obsah generovaný pomocí AI může být nesprávný."/>
+                    <pic:cNvPicPr/>
+                  </pic:nvPicPr>
+                  <pic:blipFill rotWithShape="1">
+                    <a:blip r:embed="rId17"/>
+                    <a:srcRect t="22219"/>
+                    <a:stretch>
+                      <a:fillRect/>
+                    </a:stretch>
+                  </pic:blipFill>
+                  <pic:spPr bwMode="auto">
+                    <a:xfrm>
+                      <a:off x="0" y="0"/>
+                      <a:ext cx="4420217" cy="1444883"/>
+                    </a:xfrm>
+                    <a:prstGeom prst="rect">
+                      <a:avLst/>
+                    </a:prstGeom>
+                    <a:ln>
+                      <a:noFill/>
+                    </a:ln>
+                    <a:extLst>
+                      <a:ext uri="{53640926-AAD7-44D8-BBD7-CCE9431645EC}">
+                        <a14:shadowObscured xmlns:a14="http://schemas.microsoft.com/office/drawing/2010/main"/>
+                      </a:ext>
+                    </a:extLst>
+                  </pic:spPr>
+                </pic:pic>
+              </a:graphicData>
+            </a:graphic>
+          </wp:inline>
+        </w:drawing>
+      </w:r>
+    </w:p>
+    <w:p>
+      <w:pPr>
+        <w:pStyle w:val="Titulek"/>
+      </w:pPr>
+      <w:r>
+        <w:t>Kontrola dodržení nejvyšší dovolené rychlosti ve skriptu gameController</w:t>
+      </w:r>
+    </w:p>
+    <w:p>
+      <w:pPr>
+        <w:pStyle w:val="Nadpis2"/>
+        <w:rPr>
+          <w:lang w:val="cs-CZ"/>
+        </w:rPr>
+      </w:pPr>
+      <w:bookmarkStart w:id="18" w:name="_Toc216029522"/>
+      <w:r>
+        <w:rPr>
+          <w:lang w:val="cs-CZ"/>
+        </w:rPr>
+        <w:t>Kontrola přednosti</w:t>
+      </w:r>
+      <w:bookmarkEnd w:id="18"/>
+    </w:p>
+    <w:p>
+      <w:r>
+        <w:t xml:space="preserve">Hráč dojede ke kontrolnímu </w:t>
+      </w:r>
+      <w:r>
+        <w:t>válci čímž aktivuje „minihru“ kontroly přednosti na křižovatce. V závislosti na křižovatce a úrovni, v jaké se hráč nachází, se určuje počet aut i značek upravujících přednost v jízdě. Při nesprávném řešení minihry se hráči odečtou 2 hráčské body. Hráč musí minihru správně vyřešit pro pokračování v úrovni.</w:t>
+      </w:r>
+      <w:r>
+        <w:t xml:space="preserve"> (Zatím neiplementováno ve hře)</w:t>
+      </w:r>
+    </w:p>
+    <w:p>
+      <w:pPr>
+        <w:pStyle w:val="Nadpis2"/>
+        <w:rPr>
+          <w:lang w:val="cs-CZ"/>
+        </w:rPr>
+      </w:pPr>
+      <w:bookmarkStart w:id="19" w:name="_Toc216029523"/>
+      <w:r>
+        <w:rPr>
+          <w:lang w:val="cs-CZ"/>
+        </w:rPr>
+        <w:t>Funkcionalita semaforů</w:t>
+      </w:r>
+      <w:bookmarkEnd w:id="19"/>
+    </w:p>
+    <w:p>
+      <w:r>
+        <w:t xml:space="preserve">Semafor má nastavené </w:t>
+      </w:r>
+      <w:r>
+        <w:t xml:space="preserve">volání jednotlivých funkcí pro signály </w:t>
       </w:r>
       <w:proofErr w:type="gramStart"/>
       <w:r>
-        <w:t>značku</w:t>
+        <w:t>Stůj!,</w:t>
       </w:r>
       <w:proofErr w:type="gramEnd"/>
       <w:r>
-        <w:t xml:space="preserve"> ale bohužel nevím jak)</w:t>
-      </w:r>
-    </w:p>
-    <w:p>
-      <w:pPr>
-        <w:pStyle w:val="Nadpis3"/>
+        <w:t xml:space="preserve"> Připrav se! a </w:t>
+      </w:r>
+      <w:proofErr w:type="gramStart"/>
+      <w:r>
+        <w:t>Jeď!.</w:t>
+      </w:r>
+      <w:proofErr w:type="gramEnd"/>
+      <w:r>
+        <w:t xml:space="preserve"> Jednotlivé funkce mají na starosti své přidružené </w:t>
+      </w:r>
+      <w:proofErr w:type="gramStart"/>
+      <w:r>
+        <w:t>světlo</w:t>
+      </w:r>
+      <w:proofErr w:type="gramEnd"/>
+      <w:r>
+        <w:t xml:space="preserve"> které zhasínají nebo rozsvěcují. Taktéž mění tag kontrolního </w:t>
+      </w:r>
+      <w:proofErr w:type="gramStart"/>
+      <w:r>
+        <w:t>válce</w:t>
+      </w:r>
+      <w:proofErr w:type="gramEnd"/>
+      <w:r>
+        <w:t xml:space="preserve"> který dá následně signál pro hráče i AI auta, jaký mají tag. AI auta mají zaimplementováno, jak se mají zachovat při změně tagu válce.</w:t>
+      </w:r>
+    </w:p>
+    <w:p>
+      <w:pPr>
+        <w:pStyle w:val="Nadpis1"/>
         <w:rPr>
           <w:lang w:val="cs-CZ"/>
         </w:rPr>
       </w:pPr>
+      <w:bookmarkStart w:id="20" w:name="_Toc216029524"/>
       <w:r>
         <w:rPr>
           <w:lang w:val="cs-CZ"/>
         </w:rPr>
-        <w:t>Informativní dopravní značky</w:t>
-      </w:r>
-    </w:p>
-    <w:p>
-      <w:pPr>
-        <w:rPr>
-          <w:noProof/>
-        </w:rPr>
-      </w:pPr>
-      <w:r>
-        <w:rPr>
-          <w:noProof/>
-        </w:rPr>
-        <w:t>Informativní dopravní značky informují o dopravní situaci následující za touto značkou</w:t>
-      </w:r>
-      <w:r>
-        <w:rPr>
-          <w:noProof/>
-        </w:rPr>
-        <w:t xml:space="preserve">, v některých případech značky mění nejvyšší dovolenou rychlost, kterou je třeba znát a dodržovat. Do této kategorie patří například značka obytné zóny stanovující nejvyšší dovolenou rychlost 20km/h pro případ nečekaného vchodu chodce na vozovku a zajisštění dostatek času pro reakci řidiče. </w:t>
-      </w:r>
+        <w:t>Grafická stránka hry</w:t>
+      </w:r>
+      <w:bookmarkEnd w:id="20"/>
     </w:p>
     <w:p>
       <w:pPr>
@@ -4426,155 +5095,53 @@
           <w:lang w:val="cs-CZ"/>
         </w:rPr>
       </w:pPr>
-      <w:bookmarkStart w:id="18" w:name="_Toc216029521"/>
+      <w:bookmarkStart w:id="21" w:name="_Toc216029525"/>
       <w:r>
         <w:rPr>
           <w:lang w:val="cs-CZ"/>
         </w:rPr>
+        <w:t xml:space="preserve">Šipky určující </w:t>
+      </w:r>
+      <w:bookmarkEnd w:id="21"/>
+      <w:r>
+        <w:rPr>
+          <w:lang w:val="cs-CZ"/>
+        </w:rPr>
+        <w:t>trasu</w:t>
+      </w:r>
+    </w:p>
+    <w:p>
+      <w:r>
+        <w:t>Tři</w:t>
+      </w:r>
+      <w:r>
+        <w:t xml:space="preserve"> typy šipek určujících trasu jsou vymodelované ve webové aplikaci Tinker</w:t>
+      </w:r>
+      <w:r>
+        <w:t>c</w:t>
+      </w:r>
+      <w:r>
+        <w:t>ad</w:t>
+      </w:r>
+      <w:r>
+        <w:t xml:space="preserve">. Každá z šipek je složená z trojúhelníku, alespoň jednoho </w:t>
+      </w:r>
+      <w:r>
+        <w:t>obdélníku</w:t>
+      </w:r>
+      <w:r>
+        <w:t xml:space="preserve"> a dvou kruhů. Určují</w:t>
+      </w:r>
+      <w:r>
+        <w:t xml:space="preserve">, kdy má hráč zatočit, kdy jet rovně nebo otočit. </w:t>
+      </w:r>
+      <w:r>
+        <w:t>Změna barvy byla učiněna importováním modelů do aplikace Blender, následné vytvoření materiálu, který jsem změnil na růžovou barvu. Modely jsou výsledkem vlastní práce.</w:t>
+      </w:r>
+    </w:p>
+    <w:p>
+      <w:r>
         <w:lastRenderedPageBreak/>
-        <w:t>Rychlostní limit</w:t>
-      </w:r>
-      <w:bookmarkEnd w:id="18"/>
-    </w:p>
-    <w:p>
-      <w:r>
-        <w:t>Kontrolu rychlosti stanovuje</w:t>
-      </w:r>
-      <w:r>
-        <w:t xml:space="preserve"> neviditelný</w:t>
-      </w:r>
-      <w:r>
-        <w:t xml:space="preserve"> objekt, který</w:t>
-      </w:r>
-      <w:r>
-        <w:t xml:space="preserve"> po přejezdu hráčem nastaví maximální povolenou rychlost na 50 km v hodině. Hlavní skript, který počítá rychlost hráče, </w:t>
-      </w:r>
-      <w:r>
-        <w:t>neustále kontroluje, zda rychlost hráče je vyšší, než je maximální povolená rychlost.</w:t>
-      </w:r>
-    </w:p>
-    <w:p>
-      <w:pPr>
-        <w:pStyle w:val="Nadpis2"/>
-        <w:rPr>
-          <w:lang w:val="cs-CZ"/>
-        </w:rPr>
-      </w:pPr>
-      <w:r>
-        <w:rPr>
-          <w:lang w:val="cs-CZ"/>
-        </w:rPr>
-        <w:t xml:space="preserve"> </w:t>
-      </w:r>
-      <w:bookmarkStart w:id="19" w:name="_Toc216029522"/>
-      <w:r>
-        <w:rPr>
-          <w:lang w:val="cs-CZ"/>
-        </w:rPr>
-        <w:t>Kontrola přednosti</w:t>
-      </w:r>
-      <w:bookmarkEnd w:id="19"/>
-    </w:p>
-    <w:p/>
-    <w:p>
-      <w:pPr>
-        <w:pStyle w:val="Nadpis2"/>
-        <w:rPr>
-          <w:lang w:val="cs-CZ"/>
-        </w:rPr>
-      </w:pPr>
-      <w:r>
-        <w:rPr>
-          <w:lang w:val="cs-CZ"/>
-        </w:rPr>
-        <w:t xml:space="preserve"> </w:t>
-      </w:r>
-      <w:bookmarkStart w:id="20" w:name="_Toc216029523"/>
-      <w:r>
-        <w:rPr>
-          <w:lang w:val="cs-CZ"/>
-        </w:rPr>
-        <w:t>Funkcionalita semaforů</w:t>
-      </w:r>
-      <w:bookmarkEnd w:id="20"/>
-    </w:p>
-    <w:p/>
-    <w:p>
-      <w:pPr>
-        <w:pStyle w:val="Nadpis1"/>
-        <w:rPr>
-          <w:lang w:val="cs-CZ"/>
-        </w:rPr>
-      </w:pPr>
-      <w:bookmarkStart w:id="21" w:name="_Toc216029524"/>
-      <w:r>
-        <w:rPr>
-          <w:lang w:val="cs-CZ"/>
-        </w:rPr>
-        <w:t>Grafická stránka hry</w:t>
-      </w:r>
-      <w:bookmarkEnd w:id="21"/>
-    </w:p>
-    <w:p/>
-    <w:p>
-      <w:pPr>
-        <w:pStyle w:val="Nadpis2"/>
-        <w:rPr>
-          <w:lang w:val="cs-CZ"/>
-        </w:rPr>
-      </w:pPr>
-      <w:r>
-        <w:rPr>
-          <w:lang w:val="cs-CZ"/>
-        </w:rPr>
-        <w:t xml:space="preserve"> </w:t>
-      </w:r>
-      <w:bookmarkStart w:id="22" w:name="_Toc216029525"/>
-      <w:r>
-        <w:rPr>
-          <w:lang w:val="cs-CZ"/>
-        </w:rPr>
-        <w:t xml:space="preserve">Šipky určující </w:t>
-      </w:r>
-      <w:bookmarkEnd w:id="22"/>
-      <w:r>
-        <w:rPr>
-          <w:lang w:val="cs-CZ"/>
-        </w:rPr>
-        <w:t>trasu</w:t>
-      </w:r>
-    </w:p>
-    <w:p>
-      <w:r>
-        <w:t>Tři</w:t>
-      </w:r>
-      <w:r>
-        <w:t xml:space="preserve"> typy šipek určujících trasu jsou vymodelované ve webové aplikaci Tinker</w:t>
-      </w:r>
-      <w:r>
-        <w:t>c</w:t>
-      </w:r>
-      <w:r>
-        <w:t>ad</w:t>
-      </w:r>
-      <w:r>
-        <w:t xml:space="preserve">. Každá z šipek je složená z trojúhelníku, alespoň jednoho </w:t>
-      </w:r>
-      <w:r>
-        <w:t>obdélníku</w:t>
-      </w:r>
-      <w:r>
-        <w:t xml:space="preserve"> a dvou kruhů. Určují</w:t>
-      </w:r>
-      <w:r>
-        <w:t xml:space="preserve">, kdy má hráč zatočit, kdy jet rovně nebo otočit. </w:t>
-      </w:r>
-      <w:r>
-        <w:t>Změna barvy byla učiněna importováním modelů do aplikace Blender, následné vytvoření materiálu, který jsem změnil na růžovou barvu. Modely jsou výsledkem vlastní práce.</w:t>
-      </w:r>
-    </w:p>
-    <w:p>
-      <w:r>
         <w:drawing>
           <wp:inline distT="0" distB="0" distL="0" distR="0" wp14:anchorId="58D63B95" wp14:editId="17C068C0">
             <wp:extent cx="5612130" cy="1282700"/>
@@ -4591,7 +5158,7 @@
                     <pic:cNvPicPr/>
                   </pic:nvPicPr>
                   <pic:blipFill>
-                    <a:blip r:embed="rId13"/>
+                    <a:blip r:embed="rId18"/>
                     <a:stretch>
                       <a:fillRect/>
                     </a:stretch>
@@ -4642,26 +5209,20 @@
           <w:lang w:val="cs-CZ"/>
         </w:rPr>
       </w:pPr>
+      <w:bookmarkStart w:id="22" w:name="_Toc216029526"/>
       <w:r>
         <w:rPr>
           <w:lang w:val="cs-CZ"/>
         </w:rPr>
-        <w:t xml:space="preserve"> </w:t>
-      </w:r>
-      <w:bookmarkStart w:id="23" w:name="_Toc216029526"/>
-      <w:r>
-        <w:rPr>
-          <w:lang w:val="cs-CZ"/>
-        </w:rPr>
         <w:t>Dopravní značky</w:t>
       </w:r>
-      <w:bookmarkEnd w:id="23"/>
+      <w:bookmarkEnd w:id="22"/>
     </w:p>
     <w:p>
       <w:r>
         <w:t xml:space="preserve">Většina dopravních značek je stažena z webové stránky </w:t>
       </w:r>
-      <w:hyperlink r:id="rId14" w:history="1">
+      <w:hyperlink r:id="rId19" w:history="1">
         <w:r>
           <w:rPr>
             <w:rStyle w:val="Hypertextovodkaz"/>
@@ -4673,11 +5234,21 @@
         <w:t xml:space="preserve"> u kterých je uvedena licence s možností uvedení obrázku (značky) s nekomerčním účelem. Některé značky jsou </w:t>
       </w:r>
       <w:r>
-        <w:t xml:space="preserve">výsledkem vlastní práce. Takové značky jsou vytvořeny a zpracovány </w:t>
-      </w:r>
-      <w:r>
-        <w:lastRenderedPageBreak/>
-        <w:t>v programu Malování nebo Affinity a exportovány ve formátů png pro následné odstranění pozadí které je zachováno v alfa kanálu.</w:t>
+        <w:t>výsledkem vlastní práce. Takové značky jsou vytvořeny a zpracovány v programu Malování nebo Affinity a exportovány ve formátů png pro následné odstranění pozadí které je zachováno v alfa kanálu.</w:t>
+      </w:r>
+      <w:r>
+        <w:t xml:space="preserve"> Odstranění pozadí se provádělo přes stránku </w:t>
+      </w:r>
+      <w:hyperlink r:id="rId20" w:history="1">
+        <w:r>
+          <w:rPr>
+            <w:rStyle w:val="Hypertextovodkaz"/>
+          </w:rPr>
+          <w:t>www.remove.bg/cs</w:t>
+        </w:r>
+      </w:hyperlink>
+      <w:r>
+        <w:t xml:space="preserve"> [7]</w:t>
       </w:r>
     </w:p>
     <w:p>
@@ -4687,110 +5258,26 @@
           <w:lang w:val="cs-CZ"/>
         </w:rPr>
       </w:pPr>
+      <w:bookmarkStart w:id="23" w:name="_Toc216029527"/>
       <w:r>
         <w:rPr>
           <w:lang w:val="cs-CZ"/>
         </w:rPr>
-        <w:t xml:space="preserve"> </w:t>
-      </w:r>
-      <w:bookmarkStart w:id="24" w:name="_Toc216029527"/>
-      <w:r>
-        <w:rPr>
-          <w:lang w:val="cs-CZ"/>
-        </w:rPr>
         <w:t>Souhrn nesplněných dopravních předpisů</w:t>
       </w:r>
-      <w:bookmarkEnd w:id="24"/>
-    </w:p>
-    <w:p/>
-    <w:p>
-      <w:pPr>
-        <w:pStyle w:val="Nadpis2"/>
-        <w:rPr>
-          <w:lang w:val="cs-CZ"/>
-        </w:rPr>
-      </w:pPr>
-      <w:r>
-        <w:rPr>
-          <w:lang w:val="cs-CZ"/>
-        </w:rPr>
-        <w:t xml:space="preserve"> </w:t>
-      </w:r>
-      <w:bookmarkStart w:id="25" w:name="_Toc216029528"/>
-      <w:r>
-        <w:rPr>
-          <w:lang w:val="cs-CZ"/>
-        </w:rPr>
-        <w:t>Materiály</w:t>
-      </w:r>
-      <w:bookmarkEnd w:id="25"/>
-    </w:p>
-    <w:p/>
-    <w:p>
-      <w:pPr>
-        <w:keepNext/>
-      </w:pPr>
-      <w:r>
-        <w:drawing>
-          <wp:inline distT="0" distB="0" distL="0" distR="0" wp14:anchorId="73571150" wp14:editId="0B5544D6">
-            <wp:extent cx="3783942" cy="5637475"/>
-            <wp:effectExtent l="0" t="0" r="7620" b="1905"/>
-            <wp:docPr id="1503129016" name="Obrázek 1"/>
-            <wp:cNvGraphicFramePr>
-              <a:graphicFrameLocks xmlns:a="http://schemas.openxmlformats.org/drawingml/2006/main" noChangeAspect="1"/>
-            </wp:cNvGraphicFramePr>
-            <a:graphic xmlns:a="http://schemas.openxmlformats.org/drawingml/2006/main">
-              <a:graphicData uri="http://schemas.openxmlformats.org/drawingml/2006/picture">
-                <pic:pic xmlns:pic="http://schemas.openxmlformats.org/drawingml/2006/picture">
-                  <pic:nvPicPr>
-                    <pic:cNvPr id="1503129016" name="Obrázek 1"/>
-                    <pic:cNvPicPr/>
-                  </pic:nvPicPr>
-                  <pic:blipFill>
-                    <a:blip r:embed="rId15">
-                      <a:extLst>
-                        <a:ext uri="{28A0092B-C50C-407E-A947-70E740481C1C}">
-                          <a14:useLocalDpi xmlns:a14="http://schemas.microsoft.com/office/drawing/2010/main" val="0"/>
-                        </a:ext>
-                      </a:extLst>
-                    </a:blip>
-                    <a:stretch>
-                      <a:fillRect/>
-                    </a:stretch>
-                  </pic:blipFill>
-                  <pic:spPr>
-                    <a:xfrm>
-                      <a:off x="0" y="0"/>
-                      <a:ext cx="3789829" cy="5646246"/>
-                    </a:xfrm>
-                    <a:prstGeom prst="rect">
-                      <a:avLst/>
-                    </a:prstGeom>
-                  </pic:spPr>
-                </pic:pic>
-              </a:graphicData>
-            </a:graphic>
-          </wp:inline>
-        </w:drawing>
-      </w:r>
-    </w:p>
-    <w:p>
-      <w:pPr>
-        <w:pStyle w:val="Titulek"/>
-      </w:pPr>
-      <w:bookmarkStart w:id="26" w:name="_Toc215762693"/>
-      <w:r>
-        <w:t>Nastavení průhledného materiálu</w:t>
-      </w:r>
-      <w:bookmarkEnd w:id="26"/>
+      <w:bookmarkEnd w:id="23"/>
+    </w:p>
+    <w:p>
+      <w:r>
+        <w:t xml:space="preserve">Nesplněné doprvní předpisy udávají, jak správně hráč splnil úroveň. Některé drobné přestupky jsou ve hře podmíněny pouze ztrátou herních bodů, většina chyb hráče hru ukončí a hráč musí absolvovat celou úroveň znovu. </w:t>
+      </w:r>
+      <w:r>
+        <w:br w:type="page"/>
+      </w:r>
     </w:p>
     <w:p>
       <w:pPr>
         <w:pStyle w:val="Nadpis1"/>
-        <w:numPr>
-          <w:ilvl w:val="0"/>
-          <w:numId w:val="0"/>
-        </w:numPr>
         <w:rPr>
           <w:lang w:val="cs-CZ"/>
         </w:rPr>
@@ -4815,10 +5302,6 @@
     <w:p>
       <w:pPr>
         <w:pStyle w:val="Nadpis1"/>
-        <w:numPr>
-          <w:ilvl w:val="0"/>
-          <w:numId w:val="0"/>
-        </w:numPr>
         <w:rPr>
           <w:lang w:val="cs-CZ"/>
         </w:rPr>
@@ -4846,7 +5329,7 @@
       <w:r>
         <w:t xml:space="preserve"> on Steam [online]. ©2024. Dostupné z: </w:t>
       </w:r>
-      <w:hyperlink r:id="rId16" w:tgtFrame="_new" w:history="1">
+      <w:hyperlink r:id="rId21" w:tgtFrame="_new" w:history="1">
         <w:r>
           <w:rPr>
             <w:rStyle w:val="Hypertextovodkaz"/>
@@ -4855,28 +5338,7 @@
         </w:r>
       </w:hyperlink>
       <w:r>
-        <w:t xml:space="preserve"> </w:t>
-      </w:r>
-      <w:r>
-        <w:t>[cit. 202</w:t>
-      </w:r>
-      <w:r>
-        <w:t>5</w:t>
-      </w:r>
-      <w:r>
-        <w:t>-</w:t>
-      </w:r>
-      <w:r>
-        <w:t>12</w:t>
-      </w:r>
-      <w:r>
-        <w:t>-</w:t>
-      </w:r>
-      <w:r>
-        <w:t>13</w:t>
-      </w:r>
-      <w:r>
-        <w:t>].</w:t>
+        <w:t xml:space="preserve"> [cit. 2025-12-13].</w:t>
       </w:r>
     </w:p>
     <w:p>
@@ -4894,7 +5356,7 @@
       <w:r>
         <w:t xml:space="preserve">. Virtual Driving School on Steam [online]. ©2023. Dostupné z: </w:t>
       </w:r>
-      <w:hyperlink r:id="rId17" w:tgtFrame="_new" w:history="1">
+      <w:hyperlink r:id="rId22" w:tgtFrame="_new" w:history="1">
         <w:r>
           <w:rPr>
             <w:rStyle w:val="Hypertextovodkaz"/>
@@ -4904,21 +5366,7 @@
       </w:hyperlink>
       <w:r>
         <w:br/>
-      </w:r>
-      <w:r>
-        <w:t>[cit. 202-</w:t>
-      </w:r>
-      <w:r>
-        <w:t>12</w:t>
-      </w:r>
-      <w:r>
-        <w:t>-</w:t>
-      </w:r>
-      <w:r>
-        <w:t>13</w:t>
-      </w:r>
-      <w:r>
-        <w:t>].</w:t>
+        <w:t>[cit. 202-12-13].</w:t>
       </w:r>
     </w:p>
     <w:p>
@@ -4933,9 +5381,15 @@
         <w:t>Seznam dopravních značek v Česku</w:t>
       </w:r>
       <w:r>
-        <w:t>. Online. In: Wikipedia: the free encyclopedia. San Francisco (CA): Wikimedia Foundation, 2001-2016. Dostupné z: </w:t>
-      </w:r>
-      <w:hyperlink r:id="rId18" w:anchor="P%C5%99%C3%ADkazov%C3%A9_dopravn%C3%AD_zna%C4%8Dky" w:history="1">
+        <w:t>. Online. In: Wikipedia: the free encyclopedia. San Francisco (CA): Wikimedia Foundation, 2001-201</w:t>
+      </w:r>
+      <w:r>
+        <w:t>7, 2026-01-26</w:t>
+      </w:r>
+      <w:r>
+        <w:t>. Dostupné z: </w:t>
+      </w:r>
+      <w:hyperlink r:id="rId23" w:anchor="P%C5%99%C3%ADkazov%C3%A9_dopravn%C3%AD_zna%C4%8Dky" w:history="1">
         <w:r>
           <w:rPr>
             <w:rStyle w:val="Hypertextovodkaz"/>
@@ -4944,49 +5398,280 @@
         </w:r>
       </w:hyperlink>
       <w:r>
-        <w:t>. [cit. 2026-01-30].</w:t>
+        <w:t>. [cit. 2026-01-30]</w:t>
+      </w:r>
+      <w:r>
+        <w:t>.</w:t>
+      </w:r>
+    </w:p>
+    <w:p>
+      <w:pPr>
+        <w:pStyle w:val="Odstavecseseznamem"/>
+        <w:ind w:left="357" w:hanging="357"/>
+      </w:pPr>
+      <w:r>
+        <w:rPr>
+          <w:i/>
+        </w:rPr>
+        <w:t>Unity NavMesh Agent Tutorial: Updated AI Navigation Setup from Scratch</w:t>
+      </w:r>
+      <w:r>
+        <w:t>. Online. 2025. Dostupné z: YouTube, </w:t>
+      </w:r>
+      <w:hyperlink r:id="rId24" w:history="1">
+        <w:r>
+          <w:rPr>
+            <w:rStyle w:val="Hypertextovodkaz"/>
+          </w:rPr>
+          <w:t>https://www.youtube.com/watch?v=Ffz42LimEVA</w:t>
+        </w:r>
+      </w:hyperlink>
+      <w:r>
+        <w:t xml:space="preserve">. </w:t>
+      </w:r>
+      <w:r>
+        <w:br/>
+        <w:t>[cit. 2026-02-09].</w:t>
+      </w:r>
+    </w:p>
+    <w:p>
+      <w:pPr>
+        <w:pStyle w:val="Odstavecseseznamem"/>
+        <w:ind w:left="357" w:hanging="357"/>
+      </w:pPr>
+      <w:r>
+        <w:rPr>
+          <w:i/>
+        </w:rPr>
+        <w:t>Světelné signalizační zařízení</w:t>
+      </w:r>
+      <w:r>
+        <w:t>. Online. In: Wikipedia: the free encyclopedia. San Francisco (CA): Wikimedia Foundation, 2009, 2025-11-23. Dostupné z: </w:t>
+      </w:r>
+      <w:hyperlink r:id="rId25" w:history="1">
+        <w:r>
+          <w:rPr>
+            <w:rStyle w:val="Hypertextovodkaz"/>
+          </w:rPr>
+          <w:t>https://cs.wikipedia.org/wiki/Sv%C4%9Bteln%C3%A9_signaliza%C4%8Dn%C3%AD_za%C5%99%C3%ADzen%C3%AD</w:t>
+        </w:r>
+      </w:hyperlink>
+      <w:r>
+        <w:t>. [cit. 2026-02-25].</w:t>
+      </w:r>
+    </w:p>
+    <w:p>
+      <w:pPr>
+        <w:pStyle w:val="Odstavecseseznamem"/>
+        <w:ind w:left="357" w:hanging="357"/>
+      </w:pPr>
+      <w:r>
+        <w:rPr>
+          <w:i/>
+        </w:rPr>
+        <w:t>Navigation window reference</w:t>
+      </w:r>
+      <w:r>
+        <w:t>. Online. In: Unity Manual. C2016. Dostupné z: </w:t>
+      </w:r>
+      <w:hyperlink r:id="rId26" w:history="1">
+        <w:r>
+          <w:rPr>
+            <w:rStyle w:val="Hypertextovodkaz"/>
+          </w:rPr>
+          <w:t>https://docs.unity3d.com/Packages/com.unity.ai.navigation@2.0/manual/NavigationWindow.html</w:t>
+        </w:r>
+      </w:hyperlink>
+      <w:r>
+        <w:t>. [cit. 2026-02-25].</w:t>
+      </w:r>
+    </w:p>
+    <w:p>
+      <w:pPr>
+        <w:pStyle w:val="Odstavecseseznamem"/>
+        <w:ind w:left="357" w:hanging="357"/>
+      </w:pPr>
+      <w:r>
+        <w:rPr>
+          <w:i/>
+        </w:rPr>
+        <w:t>Removebg</w:t>
+      </w:r>
+      <w:r>
+        <w:t>. Online. Removebg. [21. století]. Dostupné z: </w:t>
+      </w:r>
+      <w:hyperlink r:id="rId27" w:history="1">
+        <w:r>
+          <w:rPr>
+            <w:rStyle w:val="Hypertextovodkaz"/>
+          </w:rPr>
+          <w:t>https://www.remove.bg/cs</w:t>
+        </w:r>
+      </w:hyperlink>
+      <w:r>
+        <w:t>. [cit. 2026-02-27].</w:t>
+      </w:r>
+      <w:r>
+        <w:br w:type="page"/>
+      </w:r>
+    </w:p>
+    <w:p>
+      <w:pPr>
+        <w:pStyle w:val="Nadpis1"/>
+        <w:rPr>
+          <w:lang w:val="cs-CZ"/>
+        </w:rPr>
+      </w:pPr>
+      <w:r>
+        <w:rPr>
+          <w:lang w:val="cs-CZ"/>
+        </w:rPr>
+        <w:lastRenderedPageBreak/>
+        <w:t>Seznam příloh</w:t>
       </w:r>
     </w:p>
     <w:p>
       <w:pPr>
         <w:spacing w:after="160" w:line="278" w:lineRule="auto"/>
         <w:jc w:val="left"/>
-      </w:pPr>
-      <w:r>
-        <w:br w:type="page"/>
-      </w:r>
-    </w:p>
-    <w:p>
-      <w:pPr>
-        <w:pStyle w:val="Nadpis1"/>
-        <w:numPr>
-          <w:ilvl w:val="0"/>
-          <w:numId w:val="0"/>
-        </w:numPr>
-        <w:rPr>
-          <w:lang w:val="cs-CZ"/>
-        </w:rPr>
-      </w:pPr>
-      <w:r>
-        <w:rPr>
-          <w:lang w:val="cs-CZ"/>
-        </w:rPr>
-        <w:lastRenderedPageBreak/>
-        <w:t>Seznam příloh</w:t>
-      </w:r>
-    </w:p>
-    <w:p>
-      <w:pPr>
-        <w:ind w:firstLine="567"/>
         <w:rPr>
           <w:b/>
           <w:bCs/>
         </w:rPr>
       </w:pPr>
+      <w:r>
+        <w:rPr>
+          <w:b/>
+          <w:bCs/>
+        </w:rPr>
+        <w:br w:type="page"/>
+      </w:r>
+    </w:p>
+    <w:p>
+      <w:pPr>
+        <w:pStyle w:val="Nadpis1"/>
+        <w:rPr>
+          <w:lang w:val="cs-CZ"/>
+        </w:rPr>
+      </w:pPr>
+      <w:r>
+        <w:rPr>
+          <w:lang w:val="cs-CZ"/>
+        </w:rPr>
+        <w:lastRenderedPageBreak/>
+        <w:t>Zdroje obrázků</w:t>
+      </w:r>
+    </w:p>
+    <w:p>
+      <w:pPr>
+        <w:pStyle w:val="Odstavecseseznamem"/>
+      </w:pPr>
+      <w:r>
+        <w:t>Limit rychlosti 50km/h - https://www.pngegg.com/cs/png-ngstx</w:t>
+      </w:r>
+    </w:p>
+    <w:p>
+      <w:pPr>
+        <w:pStyle w:val="Odstavecseseznamem"/>
+      </w:pPr>
+      <w:r>
+        <w:t>Parkovistě - https://www.pngegg.com/cs/png-edyin</w:t>
+      </w:r>
+    </w:p>
+    <w:p>
+      <w:pPr>
+        <w:pStyle w:val="Odstavecseseznamem"/>
+      </w:pPr>
+      <w:r>
+        <w:t>Přikázán směr jízdy vpravo - https://www.pngegg.com/cs/png-zpjdt</w:t>
+      </w:r>
+    </w:p>
+    <w:p>
+      <w:pPr>
+        <w:pStyle w:val="Odstavecseseznamem"/>
+      </w:pPr>
+      <w:r>
+        <w:t>Muž při práci na vozovce - https://www.pngegg.com/cs/png-zqhdp</w:t>
+      </w:r>
+    </w:p>
+    <w:p>
+      <w:pPr>
+        <w:pStyle w:val="Odstavecseseznamem"/>
+      </w:pPr>
+      <w:r>
+        <w:t>Hlavní silnice - https://www.pngegg.com/cs/png-nrxqo</w:t>
+      </w:r>
+    </w:p>
+    <w:p>
+      <w:pPr>
+        <w:pStyle w:val="Odstavecseseznamem"/>
+      </w:pPr>
+      <w:r>
+        <w:t>Stop - https://www.pngegg.com/cs/png-nqgqc</w:t>
+      </w:r>
+    </w:p>
+    <w:p>
+      <w:pPr>
+        <w:pStyle w:val="Odstavecseseznamem"/>
+      </w:pPr>
+      <w:r>
+        <w:t>Jednosměrka - https://www.pngegg.com/cs/png-ztzuq</w:t>
+      </w:r>
+    </w:p>
+    <w:p>
+      <w:pPr>
+        <w:pStyle w:val="Odstavecseseznamem"/>
+      </w:pPr>
+      <w:r>
+        <w:t>Zákaz jízdy vlevo - https://www.pngegg.com/cs/png-zqlpz</w:t>
+      </w:r>
+    </w:p>
+    <w:p>
+      <w:pPr>
+        <w:pStyle w:val="Odstavecseseznamem"/>
+      </w:pPr>
+      <w:r>
+        <w:t>Zákaz jízdy vpravo - https://www.pngegg.com/cs/png-cqauf</w:t>
+      </w:r>
+    </w:p>
+    <w:p>
+      <w:pPr>
+        <w:pStyle w:val="Odstavecseseznamem"/>
+      </w:pPr>
+      <w:r>
+        <w:t>Zákaz zastavení - https://www.pngegg.com/cs/png-tmfwx</w:t>
+      </w:r>
+    </w:p>
+    <w:p>
+      <w:pPr>
+        <w:pStyle w:val="Odstavecseseznamem"/>
+      </w:pPr>
+      <w:r>
+        <w:t>Přechod pro chodce - https://www.pngegg.com/cs/png-nbpoi</w:t>
+      </w:r>
+    </w:p>
+    <w:p>
+      <w:pPr>
+        <w:pStyle w:val="Odstavecseseznamem"/>
+      </w:pPr>
+      <w:r>
+        <w:t>Dej přednost v jízdě - https://www.pngegg.com/cs/png-nucbq</w:t>
+      </w:r>
+    </w:p>
+    <w:p>
+      <w:pPr>
+        <w:pStyle w:val="Odstavecseseznamem"/>
+        <w:rPr>
+          <w:lang w:val="en-US"/>
+        </w:rPr>
+      </w:pPr>
+      <w:r>
+        <w:t>Autobusová zastávka - https://www.pngegg.com/cs/png-ycogg</w:t>
+      </w:r>
     </w:p>
     <w:sectPr>
-      <w:footerReference w:type="default" r:id="rId19"/>
-      <w:footerReference w:type="first" r:id="rId20"/>
+      <w:footerReference w:type="default" r:id="rId28"/>
+      <w:footerReference w:type="first" r:id="rId29"/>
       <w:footnotePr>
         <w:pos w:val="beneathText"/>
       </w:footnotePr>
@@ -5405,7 +6090,6 @@
     <w:lvl w:ilvl="0">
       <w:start w:val="1"/>
       <w:numFmt w:val="decimal"/>
-      <w:pStyle w:val="Nadpis1"/>
       <w:lvlText w:val="%1"/>
       <w:lvlJc w:val="left"/>
       <w:pPr>
@@ -5418,7 +6102,6 @@
     <w:lvl w:ilvl="1">
       <w:start w:val="1"/>
       <w:numFmt w:val="decimal"/>
-      <w:pStyle w:val="Nadpis2"/>
       <w:isLgl/>
       <w:lvlText w:val="%1.%2"/>
       <w:lvlJc w:val="left"/>
@@ -5432,7 +6115,6 @@
     <w:lvl w:ilvl="2">
       <w:start w:val="1"/>
       <w:numFmt w:val="decimal"/>
-      <w:pStyle w:val="Nadpis3"/>
       <w:isLgl/>
       <w:lvlText w:val="%1.%2.%3"/>
       <w:lvlJc w:val="left"/>
@@ -6858,7 +7540,7 @@
   <w:abstractNum w:abstractNumId="15" w15:restartNumberingAfterBreak="0">
     <w:nsid w:val="773D3258"/>
     <w:multiLevelType w:val="hybridMultilevel"/>
-    <w:tmpl w:val="BAC236AA"/>
+    <w:tmpl w:val="80769918"/>
     <w:lvl w:ilvl="0" w:tplc="0D90A89A">
       <w:start w:val="1"/>
       <w:numFmt w:val="bullet"/>
@@ -7529,7 +8211,7 @@
   <w:style w:type="paragraph" w:default="1" w:styleId="Normln">
     <w:name w:val="Normal"/>
     <w:qFormat/>
-    <w:rsid w:val="001C4373"/>
+    <w:rsid w:val="00C968A0"/>
     <w:pPr>
       <w:spacing w:after="240" w:line="288" w:lineRule="auto"/>
       <w:jc w:val="both"/>
@@ -7548,13 +8230,10 @@
     <w:autoRedefine/>
     <w:uiPriority w:val="9"/>
     <w:qFormat/>
-    <w:rsid w:val="004D147C"/>
+    <w:rsid w:val="0063661C"/>
     <w:pPr>
       <w:keepNext/>
       <w:keepLines/>
-      <w:numPr>
-        <w:numId w:val="3"/>
-      </w:numPr>
       <w:suppressLineNumbers/>
       <w:spacing w:before="360" w:after="360"/>
       <w:outlineLvl w:val="0"/>
@@ -7585,7 +8264,6 @@
         <w:ilvl w:val="1"/>
       </w:numPr>
       <w:spacing w:before="160" w:after="320"/>
-      <w:ind w:left="0" w:firstLine="0"/>
       <w:jc w:val="left"/>
       <w:outlineLvl w:val="1"/>
     </w:pPr>
@@ -7609,7 +8287,6 @@
         <w:ilvl w:val="2"/>
       </w:numPr>
       <w:spacing w:after="280"/>
-      <w:ind w:left="0" w:firstLine="0"/>
       <w:outlineLvl w:val="2"/>
     </w:pPr>
     <w:rPr>
@@ -7749,6 +8426,7 @@
   <w:style w:type="character" w:default="1" w:styleId="Standardnpsmoodstavce">
     <w:name w:val="Default Paragraph Font"/>
     <w:uiPriority w:val="1"/>
+    <w:semiHidden/>
     <w:unhideWhenUsed/>
   </w:style>
   <w:style w:type="table" w:default="1" w:styleId="Normlntabulka">
@@ -7778,7 +8456,7 @@
     <w:basedOn w:val="Standardnpsmoodstavce"/>
     <w:link w:val="Nadpis1"/>
     <w:uiPriority w:val="9"/>
-    <w:rsid w:val="004D147C"/>
+    <w:rsid w:val="0063661C"/>
     <w:rPr>
       <w:rFonts w:ascii="Times New Roman" w:eastAsiaTheme="majorEastAsia" w:hAnsi="Times New Roman" w:cstheme="majorBidi"/>
       <w:b/>
@@ -8428,6 +9106,55 @@
       <w:u w:val="single"/>
     </w:rPr>
   </w:style>
+  <w:style w:type="table" w:styleId="Prosttabulka4">
+    <w:name w:val="Plain Table 4"/>
+    <w:basedOn w:val="Normlntabulka"/>
+    <w:uiPriority w:val="44"/>
+    <w:rsid w:val="00A63A2F"/>
+    <w:pPr>
+      <w:spacing w:after="0" w:line="240" w:lineRule="auto"/>
+    </w:pPr>
+    <w:tblPr>
+      <w:tblStyleRowBandSize w:val="1"/>
+      <w:tblStyleColBandSize w:val="1"/>
+    </w:tblPr>
+    <w:tblStylePr w:type="firstRow">
+      <w:rPr>
+        <w:b/>
+        <w:bCs/>
+      </w:rPr>
+    </w:tblStylePr>
+    <w:tblStylePr w:type="lastRow">
+      <w:rPr>
+        <w:b/>
+        <w:bCs/>
+      </w:rPr>
+    </w:tblStylePr>
+    <w:tblStylePr w:type="firstCol">
+      <w:rPr>
+        <w:b/>
+        <w:bCs/>
+      </w:rPr>
+    </w:tblStylePr>
+    <w:tblStylePr w:type="lastCol">
+      <w:rPr>
+        <w:b/>
+        <w:bCs/>
+      </w:rPr>
+    </w:tblStylePr>
+    <w:tblStylePr w:type="band1Vert">
+      <w:tblPr/>
+      <w:tcPr>
+        <w:shd w:val="clear" w:color="auto" w:fill="F2F2F2" w:themeFill="background1" w:themeFillShade="F2"/>
+      </w:tcPr>
+    </w:tblStylePr>
+    <w:tblStylePr w:type="band1Horz">
+      <w:tblPr/>
+      <w:tcPr>
+        <w:shd w:val="clear" w:color="auto" w:fill="F2F2F2" w:themeFill="background1" w:themeFillShade="F2"/>
+      </w:tcPr>
+    </w:tblStylePr>
+  </w:style>
 </w:styles>
 </file>
 

</xml_diff>